<commit_message>
docs: update me.docx with Phase 2 content (v1.2.0)
</commit_message>
<xml_diff>
--- a/me.docx
+++ b/me.docx
@@ -15,7 +15,7 @@
           <w:color w:val="1F3564"/>
           <w:sz w:val="56"/>
         </w:rPr>
-        <w:t>Architecture Skill — Phase 1</w:t>
+        <w:t>Architecture Skill — Phase 1 &amp; 2</w:t>
       </w:r>
     </w:p>
     <w:p>
@@ -8425,6 +8425,3852 @@
       </w:tr>
     </w:tbl>
     <w:p/>
+    <w:p>
+      <w:r>
+        <w:br w:type="page"/>
+      </w:r>
+    </w:p>
+    <w:p>
+      <w:pPr>
+        <w:pStyle w:val="Heading1"/>
+        <w:spacing w:before="360" w:after="160"/>
+      </w:pPr>
+      <w:r>
+        <w:rPr>
+          <w:b/>
+          <w:color w:val="2763AB"/>
+          <w:sz w:val="36"/>
+        </w:rPr>
+        <w:t>Phase 2 — Source Indexing and Context Efficiency</w:t>
+      </w:r>
+    </w:p>
+    <w:p>
+      <w:pPr>
+        <w:spacing w:after="80" w:before="40"/>
+      </w:pPr>
+      <w:r>
+        <w:rPr>
+          <w:b w:val="0"/>
+          <w:i w:val="0"/>
+          <w:color w:val="000000"/>
+          <w:sz w:val="21"/>
+        </w:rPr>
+        <w:t>Phase 2 gives the skill the ability to read large PRDs reliably, prove which PRD version was used, and detect when a source has changed after architecture work began. Without Phase 2, the skill could silently process a stale or wrong PRD and produce an architecture that traces to the wrong source.</w:t>
+      </w:r>
+    </w:p>
+    <w:p/>
+    <w:p>
+      <w:pPr>
+        <w:spacing w:after="80" w:before="40"/>
+      </w:pPr>
+      <w:r>
+        <w:rPr>
+          <w:b/>
+          <w:i w:val="0"/>
+          <w:color w:val="000000"/>
+          <w:sz w:val="21"/>
+        </w:rPr>
+        <w:t>One sentence summary:</w:t>
+      </w:r>
+    </w:p>
+    <w:p>
+      <w:pPr>
+        <w:spacing w:after="80" w:before="40"/>
+      </w:pPr>
+      <w:r>
+        <w:rPr>
+          <w:b w:val="0"/>
+          <w:i/>
+          <w:color w:val="2763AB"/>
+          <w:sz w:val="24"/>
+        </w:rPr>
+        <w:t xml:space="preserve">  “Index the PRD before you design from it, and prove the hash matches every time.”</w:t>
+      </w:r>
+    </w:p>
+    <w:p/>
+    <w:p>
+      <w:pPr>
+        <w:pStyle w:val="Heading2"/>
+        <w:spacing w:before="360" w:after="160"/>
+      </w:pPr>
+      <w:r>
+        <w:rPr>
+          <w:b/>
+          <w:color w:val="1F3564"/>
+          <w:sz w:val="30"/>
+        </w:rPr>
+        <w:t>What Was Already in the Skill (Specified)</w:t>
+      </w:r>
+    </w:p>
+    <w:p>
+      <w:pPr>
+        <w:spacing w:after="80" w:before="40"/>
+      </w:pPr>
+      <w:r>
+        <w:rPr>
+          <w:b w:val="0"/>
+          <w:i w:val="0"/>
+          <w:color w:val="000000"/>
+          <w:sz w:val="21"/>
+        </w:rPr>
+        <w:t>These behaviours were written into SKILL.md before Phase 2 tooling existed. They were instructions the AI was expected to follow manually.</w:t>
+      </w:r>
+    </w:p>
+    <w:p/>
+    <w:tbl>
+      <w:tblPr>
+        <w:tblStyle w:val="TableGrid"/>
+        <w:tblW w:type="auto" w:w="0"/>
+        <w:jc w:val="left"/>
+        <w:tblLook w:firstColumn="1" w:firstRow="1" w:lastColumn="0" w:lastRow="0" w:noHBand="0" w:noVBand="1" w:val="04A0"/>
+      </w:tblPr>
+      <w:tblGrid>
+        <w:gridCol w:w="4703"/>
+        <w:gridCol w:w="4703"/>
+      </w:tblGrid>
+      <w:tr>
+        <w:tc>
+          <w:tcPr>
+            <w:tcW w:type="dxa" w:w="1701"/>
+            <w:shd w:val="clear" w:color="auto" w:fill="1F3564"/>
+          </w:tcPr>
+          <w:p>
+            <w:pPr>
+              <w:jc w:val="center"/>
+            </w:pPr>
+            <w:r>
+              <w:rPr>
+                <w:b/>
+                <w:color w:val="FFFFFF"/>
+                <w:sz w:val="19"/>
+              </w:rPr>
+              <w:t>Skill Section</w:t>
+            </w:r>
+          </w:p>
+        </w:tc>
+        <w:tc>
+          <w:tcPr>
+            <w:tcW w:type="dxa" w:w="8220"/>
+            <w:shd w:val="clear" w:color="auto" w:fill="1F3564"/>
+          </w:tcPr>
+          <w:p>
+            <w:pPr>
+              <w:jc w:val="center"/>
+            </w:pPr>
+            <w:r>
+              <w:rPr>
+                <w:b/>
+                <w:color w:val="FFFFFF"/>
+                <w:sz w:val="19"/>
+              </w:rPr>
+              <w:t>Behaviour Already Specified</w:t>
+            </w:r>
+          </w:p>
+        </w:tc>
+      </w:tr>
+      <w:tr>
+        <w:tc>
+          <w:tcPr>
+            <w:tcW w:type="dxa" w:w="1701"/>
+            <w:shd w:val="clear" w:color="auto" w:fill="F2F2F2"/>
+          </w:tcPr>
+          <w:p>
+            <w:r>
+              <w:rPr>
+                <w:sz w:val="19"/>
+              </w:rPr>
+              <w:t>§52 step 6</w:t>
+            </w:r>
+          </w:p>
+        </w:tc>
+        <w:tc>
+          <w:tcPr>
+            <w:tcW w:type="dxa" w:w="8220"/>
+            <w:shd w:val="clear" w:color="auto" w:fill="F2F2F2"/>
+          </w:tcPr>
+          <w:p>
+            <w:r>
+              <w:rPr>
+                <w:sz w:val="19"/>
+              </w:rPr>
+              <w:t>Read PRD in bounded sections, not one large pass. Extract requirement-by-requirement.</w:t>
+            </w:r>
+          </w:p>
+        </w:tc>
+      </w:tr>
+      <w:tr>
+        <w:tc>
+          <w:tcPr>
+            <w:tcW w:type="dxa" w:w="1701"/>
+            <w:shd w:val="clear" w:color="auto" w:fill="FFFFFF"/>
+          </w:tcPr>
+          <w:p>
+            <w:r>
+              <w:rPr>
+                <w:sz w:val="19"/>
+              </w:rPr>
+              <w:t>§52 step 36</w:t>
+            </w:r>
+          </w:p>
+        </w:tc>
+        <w:tc>
+          <w:tcPr>
+            <w:tcW w:type="dxa" w:w="8220"/>
+            <w:shd w:val="clear" w:color="auto" w:fill="FFFFFF"/>
+          </w:tcPr>
+          <w:p>
+            <w:r>
+              <w:rPr>
+                <w:sz w:val="19"/>
+              </w:rPr>
+              <w:t>Return to the literal PRD source text to verify every requirement citation before delivery.</w:t>
+            </w:r>
+          </w:p>
+        </w:tc>
+      </w:tr>
+      <w:tr>
+        <w:tc>
+          <w:tcPr>
+            <w:tcW w:type="dxa" w:w="1701"/>
+            <w:shd w:val="clear" w:color="auto" w:fill="F2F2F2"/>
+          </w:tcPr>
+          <w:p>
+            <w:r>
+              <w:rPr>
+                <w:sz w:val="19"/>
+              </w:rPr>
+              <w:t>§38</w:t>
+            </w:r>
+          </w:p>
+        </w:tc>
+        <w:tc>
+          <w:tcPr>
+            <w:tcW w:type="dxa" w:w="8220"/>
+            <w:shd w:val="clear" w:color="auto" w:fill="F2F2F2"/>
+          </w:tcPr>
+          <w:p>
+            <w:r>
+              <w:rPr>
+                <w:sz w:val="19"/>
+              </w:rPr>
+              <w:t>Calibrate output depth (Tier 1/2/3) based on PRD size and complexity.</w:t>
+            </w:r>
+          </w:p>
+        </w:tc>
+      </w:tr>
+      <w:tr>
+        <w:tc>
+          <w:tcPr>
+            <w:tcW w:type="dxa" w:w="1701"/>
+            <w:shd w:val="clear" w:color="auto" w:fill="FFFFFF"/>
+          </w:tcPr>
+          <w:p>
+            <w:r>
+              <w:rPr>
+                <w:sz w:val="19"/>
+              </w:rPr>
+              <w:t>§60</w:t>
+            </w:r>
+          </w:p>
+        </w:tc>
+        <w:tc>
+          <w:tcPr>
+            <w:tcW w:type="dxa" w:w="8220"/>
+            <w:shd w:val="clear" w:color="auto" w:fill="FFFFFF"/>
+          </w:tcPr>
+          <w:p>
+            <w:r>
+              <w:rPr>
+                <w:sz w:val="19"/>
+              </w:rPr>
+              <w:t>Use a source index for large PRDs. Persist the inventory before synthesis. Never substitute a stale source.</w:t>
+            </w:r>
+          </w:p>
+        </w:tc>
+      </w:tr>
+      <w:tr>
+        <w:tc>
+          <w:tcPr>
+            <w:tcW w:type="dxa" w:w="1701"/>
+            <w:shd w:val="clear" w:color="auto" w:fill="F2F2F2"/>
+          </w:tcPr>
+          <w:p>
+            <w:r>
+              <w:rPr>
+                <w:sz w:val="19"/>
+              </w:rPr>
+              <w:t>§58</w:t>
+            </w:r>
+          </w:p>
+        </w:tc>
+        <w:tc>
+          <w:tcPr>
+            <w:tcW w:type="dxa" w:w="8220"/>
+            <w:shd w:val="clear" w:color="auto" w:fill="F2F2F2"/>
+          </w:tcPr>
+          <w:p>
+            <w:r>
+              <w:rPr>
+                <w:sz w:val="19"/>
+              </w:rPr>
+              <w:t>Record source name, received time, and content hash. Preserve source as read-only evidence.</w:t>
+            </w:r>
+          </w:p>
+        </w:tc>
+      </w:tr>
+    </w:tbl>
+    <w:p/>
+    <w:p>
+      <w:pPr>
+        <w:pStyle w:val="Heading2"/>
+        <w:spacing w:before="360" w:after="160"/>
+      </w:pPr>
+      <w:r>
+        <w:rPr>
+          <w:b/>
+          <w:color w:val="1F3564"/>
+          <w:sz w:val="30"/>
+        </w:rPr>
+        <w:t>What Was Missing — The Phase 2 Gap</w:t>
+      </w:r>
+    </w:p>
+    <w:p>
+      <w:pPr>
+        <w:spacing w:after="80" w:before="40"/>
+      </w:pPr>
+      <w:r>
+        <w:rPr>
+          <w:b w:val="0"/>
+          <w:i w:val="0"/>
+          <w:color w:val="000000"/>
+          <w:sz w:val="21"/>
+        </w:rPr>
+        <w:t>The instructions existed but no tool enforced them. The AI had no way to automatically produce a structured inventory, record a hash, or detect a stale source. Every run was manual and unverifiable.</w:t>
+      </w:r>
+    </w:p>
+    <w:p/>
+    <w:tbl>
+      <w:tblPr>
+        <w:tblStyle w:val="TableGrid"/>
+        <w:tblW w:type="auto" w:w="0"/>
+        <w:jc w:val="left"/>
+        <w:tblLook w:firstColumn="1" w:firstRow="1" w:lastColumn="0" w:lastRow="0" w:noHBand="0" w:noVBand="1" w:val="04A0"/>
+      </w:tblPr>
+      <w:tblGrid>
+        <w:gridCol w:w="3135"/>
+        <w:gridCol w:w="3135"/>
+        <w:gridCol w:w="3135"/>
+      </w:tblGrid>
+      <w:tr>
+        <w:tc>
+          <w:tcPr>
+            <w:tcW w:type="dxa" w:w="1134"/>
+            <w:shd w:val="clear" w:color="auto" w:fill="1F3564"/>
+          </w:tcPr>
+          <w:p>
+            <w:pPr>
+              <w:jc w:val="center"/>
+            </w:pPr>
+            <w:r>
+              <w:rPr>
+                <w:b/>
+                <w:color w:val="FFFFFF"/>
+                <w:sz w:val="19"/>
+              </w:rPr>
+              <w:t>Gap ID</w:t>
+            </w:r>
+          </w:p>
+        </w:tc>
+        <w:tc>
+          <w:tcPr>
+            <w:tcW w:type="dxa" w:w="3118"/>
+            <w:shd w:val="clear" w:color="auto" w:fill="1F3564"/>
+          </w:tcPr>
+          <w:p>
+            <w:pPr>
+              <w:jc w:val="center"/>
+            </w:pPr>
+            <w:r>
+              <w:rPr>
+                <w:b/>
+                <w:color w:val="FFFFFF"/>
+                <w:sz w:val="19"/>
+              </w:rPr>
+              <w:t>Missing Capability</w:t>
+            </w:r>
+          </w:p>
+        </w:tc>
+        <w:tc>
+          <w:tcPr>
+            <w:tcW w:type="dxa" w:w="5669"/>
+            <w:shd w:val="clear" w:color="auto" w:fill="1F3564"/>
+          </w:tcPr>
+          <w:p>
+            <w:pPr>
+              <w:jc w:val="center"/>
+            </w:pPr>
+            <w:r>
+              <w:rPr>
+                <w:b/>
+                <w:color w:val="FFFFFF"/>
+                <w:sz w:val="19"/>
+              </w:rPr>
+              <w:t>Why It Matters</w:t>
+            </w:r>
+          </w:p>
+        </w:tc>
+      </w:tr>
+      <w:tr>
+        <w:tc>
+          <w:tcPr>
+            <w:tcW w:type="dxa" w:w="1134"/>
+            <w:shd w:val="clear" w:color="auto" w:fill="F2F2F2"/>
+          </w:tcPr>
+          <w:p>
+            <w:r>
+              <w:rPr>
+                <w:sz w:val="19"/>
+              </w:rPr>
+              <w:t>GAP-009</w:t>
+            </w:r>
+          </w:p>
+        </w:tc>
+        <w:tc>
+          <w:tcPr>
+            <w:tcW w:type="dxa" w:w="3118"/>
+            <w:shd w:val="clear" w:color="auto" w:fill="F2F2F2"/>
+          </w:tcPr>
+          <w:p>
+            <w:r>
+              <w:rPr>
+                <w:sz w:val="19"/>
+              </w:rPr>
+              <w:t>Source Index Contract (§60 under-specified)</w:t>
+            </w:r>
+          </w:p>
+        </w:tc>
+        <w:tc>
+          <w:tcPr>
+            <w:tcW w:type="dxa" w:w="5669"/>
+            <w:shd w:val="clear" w:color="auto" w:fill="F2F2F2"/>
+          </w:tcPr>
+          <w:p>
+            <w:r>
+              <w:rPr>
+                <w:sz w:val="19"/>
+              </w:rPr>
+              <w:t>No formal JSON schema existed. The AI could produce any format or skip the index entirely.</w:t>
+            </w:r>
+          </w:p>
+        </w:tc>
+      </w:tr>
+      <w:tr>
+        <w:tc>
+          <w:tcPr>
+            <w:tcW w:type="dxa" w:w="1134"/>
+            <w:shd w:val="clear" w:color="auto" w:fill="FFFFFF"/>
+          </w:tcPr>
+          <w:p>
+            <w:r>
+              <w:rPr>
+                <w:sz w:val="19"/>
+              </w:rPr>
+              <w:t>—</w:t>
+            </w:r>
+          </w:p>
+        </w:tc>
+        <w:tc>
+          <w:tcPr>
+            <w:tcW w:type="dxa" w:w="3118"/>
+            <w:shd w:val="clear" w:color="auto" w:fill="FFFFFF"/>
+          </w:tcPr>
+          <w:p>
+            <w:r>
+              <w:rPr>
+                <w:sz w:val="19"/>
+              </w:rPr>
+              <w:t>PRD indexer (index_prd.js)</w:t>
+            </w:r>
+          </w:p>
+        </w:tc>
+        <w:tc>
+          <w:tcPr>
+            <w:tcW w:type="dxa" w:w="5669"/>
+            <w:shd w:val="clear" w:color="auto" w:fill="FFFFFF"/>
+          </w:tcPr>
+          <w:p>
+            <w:r>
+              <w:rPr>
+                <w:sz w:val="19"/>
+              </w:rPr>
+              <w:t>No tool parsed the PRD into a structured, locator-stamped requirement inventory.</w:t>
+            </w:r>
+          </w:p>
+        </w:tc>
+      </w:tr>
+      <w:tr>
+        <w:tc>
+          <w:tcPr>
+            <w:tcW w:type="dxa" w:w="1134"/>
+            <w:shd w:val="clear" w:color="auto" w:fill="F2F2F2"/>
+          </w:tcPr>
+          <w:p>
+            <w:r>
+              <w:rPr>
+                <w:sz w:val="19"/>
+              </w:rPr>
+              <w:t>—</w:t>
+            </w:r>
+          </w:p>
+        </w:tc>
+        <w:tc>
+          <w:tcPr>
+            <w:tcW w:type="dxa" w:w="3118"/>
+            <w:shd w:val="clear" w:color="auto" w:fill="F2F2F2"/>
+          </w:tcPr>
+          <w:p>
+            <w:r>
+              <w:rPr>
+                <w:sz w:val="19"/>
+              </w:rPr>
+              <w:t>Source hash generator</w:t>
+            </w:r>
+          </w:p>
+        </w:tc>
+        <w:tc>
+          <w:tcPr>
+            <w:tcW w:type="dxa" w:w="5669"/>
+            <w:shd w:val="clear" w:color="auto" w:fill="F2F2F2"/>
+          </w:tcPr>
+          <w:p>
+            <w:r>
+              <w:rPr>
+                <w:sz w:val="19"/>
+              </w:rPr>
+              <w:t>No tool recorded the SHA-256 of the PRD at index time — impossible to detect tampering or drift.</w:t>
+            </w:r>
+          </w:p>
+        </w:tc>
+      </w:tr>
+      <w:tr>
+        <w:tc>
+          <w:tcPr>
+            <w:tcW w:type="dxa" w:w="1134"/>
+            <w:shd w:val="clear" w:color="auto" w:fill="FFFFFF"/>
+          </w:tcPr>
+          <w:p>
+            <w:r>
+              <w:rPr>
+                <w:sz w:val="19"/>
+              </w:rPr>
+              <w:t>—</w:t>
+            </w:r>
+          </w:p>
+        </w:tc>
+        <w:tc>
+          <w:tcPr>
+            <w:tcW w:type="dxa" w:w="3118"/>
+            <w:shd w:val="clear" w:color="auto" w:fill="FFFFFF"/>
+          </w:tcPr>
+          <w:p>
+            <w:r>
+              <w:rPr>
+                <w:sz w:val="19"/>
+              </w:rPr>
+              <w:t>Stale-source detector</w:t>
+            </w:r>
+          </w:p>
+        </w:tc>
+        <w:tc>
+          <w:tcPr>
+            <w:tcW w:type="dxa" w:w="5669"/>
+            <w:shd w:val="clear" w:color="auto" w:fill="FFFFFF"/>
+          </w:tcPr>
+          <w:p>
+            <w:r>
+              <w:rPr>
+                <w:sz w:val="19"/>
+              </w:rPr>
+              <w:t>Nothing compared the stored hash against the current PRD before architecture synthesis began.</w:t>
+            </w:r>
+          </w:p>
+        </w:tc>
+      </w:tr>
+      <w:tr>
+        <w:tc>
+          <w:tcPr>
+            <w:tcW w:type="dxa" w:w="1134"/>
+            <w:shd w:val="clear" w:color="auto" w:fill="F2F2F2"/>
+          </w:tcPr>
+          <w:p>
+            <w:r>
+              <w:rPr>
+                <w:sz w:val="19"/>
+              </w:rPr>
+              <w:t>—</w:t>
+            </w:r>
+          </w:p>
+        </w:tc>
+        <w:tc>
+          <w:tcPr>
+            <w:tcW w:type="dxa" w:w="3118"/>
+            <w:shd w:val="clear" w:color="auto" w:fill="F2F2F2"/>
+          </w:tcPr>
+          <w:p>
+            <w:r>
+              <w:rPr>
+                <w:sz w:val="19"/>
+              </w:rPr>
+              <w:t>Attachment/stale-path checker</w:t>
+            </w:r>
+          </w:p>
+        </w:tc>
+        <w:tc>
+          <w:tcPr>
+            <w:tcW w:type="dxa" w:w="5669"/>
+            <w:shd w:val="clear" w:color="auto" w:fill="F2F2F2"/>
+          </w:tcPr>
+          <w:p>
+            <w:r>
+              <w:rPr>
+                <w:sz w:val="19"/>
+              </w:rPr>
+              <w:t>No check that referenced attachments in the PRD actually existed on disk.</w:t>
+            </w:r>
+          </w:p>
+        </w:tc>
+      </w:tr>
+    </w:tbl>
+    <w:p/>
+    <w:p>
+      <w:pPr>
+        <w:pStyle w:val="Heading2"/>
+        <w:spacing w:before="360" w:after="160"/>
+      </w:pPr>
+      <w:r>
+        <w:rPr>
+          <w:b/>
+          <w:color w:val="1F3564"/>
+          <w:sz w:val="30"/>
+        </w:rPr>
+        <w:t>What Was Built in Phase 2</w:t>
+      </w:r>
+    </w:p>
+    <w:p/>
+    <w:tbl>
+      <w:tblPr>
+        <w:tblStyle w:val="TableGrid"/>
+        <w:tblW w:type="auto" w:w="0"/>
+        <w:jc w:val="left"/>
+        <w:tblLook w:firstColumn="1" w:firstRow="1" w:lastColumn="0" w:lastRow="0" w:noHBand="0" w:noVBand="1" w:val="04A0"/>
+      </w:tblPr>
+      <w:tblGrid>
+        <w:gridCol w:w="2351"/>
+        <w:gridCol w:w="2351"/>
+        <w:gridCol w:w="2351"/>
+        <w:gridCol w:w="2351"/>
+      </w:tblGrid>
+      <w:tr>
+        <w:tc>
+          <w:tcPr>
+            <w:tcW w:type="dxa" w:w="2835"/>
+            <w:shd w:val="clear" w:color="auto" w:fill="1F3564"/>
+          </w:tcPr>
+          <w:p>
+            <w:pPr>
+              <w:jc w:val="center"/>
+            </w:pPr>
+            <w:r>
+              <w:rPr>
+                <w:b/>
+                <w:color w:val="FFFFFF"/>
+                <w:sz w:val="19"/>
+              </w:rPr>
+              <w:t>File / Deliverable</w:t>
+            </w:r>
+          </w:p>
+        </w:tc>
+        <w:tc>
+          <w:tcPr>
+            <w:tcW w:type="dxa" w:w="1417"/>
+            <w:shd w:val="clear" w:color="auto" w:fill="1F3564"/>
+          </w:tcPr>
+          <w:p>
+            <w:pPr>
+              <w:jc w:val="center"/>
+            </w:pPr>
+            <w:r>
+              <w:rPr>
+                <w:b/>
+                <w:color w:val="FFFFFF"/>
+                <w:sz w:val="19"/>
+              </w:rPr>
+              <w:t>Type</w:t>
+            </w:r>
+          </w:p>
+        </w:tc>
+        <w:tc>
+          <w:tcPr>
+            <w:tcW w:type="dxa" w:w="1417"/>
+            <w:shd w:val="clear" w:color="auto" w:fill="1F3564"/>
+          </w:tcPr>
+          <w:p>
+            <w:pPr>
+              <w:jc w:val="center"/>
+            </w:pPr>
+            <w:r>
+              <w:rPr>
+                <w:b/>
+                <w:color w:val="FFFFFF"/>
+                <w:sz w:val="19"/>
+              </w:rPr>
+              <w:t>Linked To</w:t>
+            </w:r>
+          </w:p>
+        </w:tc>
+        <w:tc>
+          <w:tcPr>
+            <w:tcW w:type="dxa" w:w="4252"/>
+            <w:shd w:val="clear" w:color="auto" w:fill="1F3564"/>
+          </w:tcPr>
+          <w:p>
+            <w:pPr>
+              <w:jc w:val="center"/>
+            </w:pPr>
+            <w:r>
+              <w:rPr>
+                <w:b/>
+                <w:color w:val="FFFFFF"/>
+                <w:sz w:val="19"/>
+              </w:rPr>
+              <w:t>What It Does</w:t>
+            </w:r>
+          </w:p>
+        </w:tc>
+      </w:tr>
+      <w:tr>
+        <w:tc>
+          <w:tcPr>
+            <w:tcW w:type="dxa" w:w="2835"/>
+            <w:shd w:val="clear" w:color="auto" w:fill="F2F2F2"/>
+          </w:tcPr>
+          <w:p>
+            <w:r>
+              <w:rPr>
+                <w:sz w:val="19"/>
+              </w:rPr>
+              <w:t>SKILL.md §60 — Source Index Contract</w:t>
+            </w:r>
+          </w:p>
+        </w:tc>
+        <w:tc>
+          <w:tcPr>
+            <w:tcW w:type="dxa" w:w="1417"/>
+            <w:shd w:val="clear" w:color="auto" w:fill="F2F2F2"/>
+          </w:tcPr>
+          <w:p>
+            <w:r>
+              <w:rPr>
+                <w:sz w:val="19"/>
+              </w:rPr>
+              <w:t>Spec / SKILL.md</w:t>
+            </w:r>
+          </w:p>
+        </w:tc>
+        <w:tc>
+          <w:tcPr>
+            <w:tcW w:type="dxa" w:w="1417"/>
+            <w:shd w:val="clear" w:color="auto" w:fill="F2F2F2"/>
+          </w:tcPr>
+          <w:p>
+            <w:r>
+              <w:rPr>
+                <w:sz w:val="19"/>
+              </w:rPr>
+              <w:t>Closes GAP-009</w:t>
+            </w:r>
+          </w:p>
+        </w:tc>
+        <w:tc>
+          <w:tcPr>
+            <w:tcW w:type="dxa" w:w="4252"/>
+            <w:shd w:val="clear" w:color="auto" w:fill="F2F2F2"/>
+          </w:tcPr>
+          <w:p>
+            <w:r>
+              <w:rPr>
+                <w:sz w:val="19"/>
+              </w:rPr>
+              <w:t>Formal JSON schemas for requirement inventory record and source hash record. Source Index Integrity Rules. Tooling reference. Now a machine-enforceable contract, not a suggestion.</w:t>
+            </w:r>
+          </w:p>
+        </w:tc>
+      </w:tr>
+      <w:tr>
+        <w:tc>
+          <w:tcPr>
+            <w:tcW w:type="dxa" w:w="2835"/>
+            <w:shd w:val="clear" w:color="auto" w:fill="FFFFFF"/>
+          </w:tcPr>
+          <w:p>
+            <w:r>
+              <w:rPr>
+                <w:sz w:val="19"/>
+              </w:rPr>
+              <w:t>phase2/index_prd.js</w:t>
+            </w:r>
+          </w:p>
+        </w:tc>
+        <w:tc>
+          <w:tcPr>
+            <w:tcW w:type="dxa" w:w="1417"/>
+            <w:shd w:val="clear" w:color="auto" w:fill="FFFFFF"/>
+          </w:tcPr>
+          <w:p>
+            <w:r>
+              <w:rPr>
+                <w:sz w:val="19"/>
+              </w:rPr>
+              <w:t>Node.js tool</w:t>
+            </w:r>
+          </w:p>
+        </w:tc>
+        <w:tc>
+          <w:tcPr>
+            <w:tcW w:type="dxa" w:w="1417"/>
+            <w:shd w:val="clear" w:color="auto" w:fill="FFFFFF"/>
+          </w:tcPr>
+          <w:p>
+            <w:r>
+              <w:rPr>
+                <w:sz w:val="19"/>
+              </w:rPr>
+              <w:t>Phase 2 / GAP-009</w:t>
+            </w:r>
+          </w:p>
+        </w:tc>
+        <w:tc>
+          <w:tcPr>
+            <w:tcW w:type="dxa" w:w="4252"/>
+            <w:shd w:val="clear" w:color="auto" w:fill="FFFFFF"/>
+          </w:tcPr>
+          <w:p>
+            <w:r>
+              <w:rPr>
+                <w:sz w:val="19"/>
+              </w:rPr>
+              <w:t>PRD indexer + source hash generator. Parses any Markdown PRD section-by-section. Handles plain IDs (FR-001), escaped IDs (FR\-001 from Word extraction), and table-cell IDs. Produces structured requirement inventory JSON + source hash record JSON.</w:t>
+            </w:r>
+          </w:p>
+        </w:tc>
+      </w:tr>
+      <w:tr>
+        <w:tc>
+          <w:tcPr>
+            <w:tcW w:type="dxa" w:w="2835"/>
+            <w:shd w:val="clear" w:color="auto" w:fill="F2F2F2"/>
+          </w:tcPr>
+          <w:p>
+            <w:r>
+              <w:rPr>
+                <w:sz w:val="19"/>
+              </w:rPr>
+              <w:t>phase2/stale-source-detect.js</w:t>
+            </w:r>
+          </w:p>
+        </w:tc>
+        <w:tc>
+          <w:tcPr>
+            <w:tcW w:type="dxa" w:w="1417"/>
+            <w:shd w:val="clear" w:color="auto" w:fill="F2F2F2"/>
+          </w:tcPr>
+          <w:p>
+            <w:r>
+              <w:rPr>
+                <w:sz w:val="19"/>
+              </w:rPr>
+              <w:t>Node.js tool</w:t>
+            </w:r>
+          </w:p>
+        </w:tc>
+        <w:tc>
+          <w:tcPr>
+            <w:tcW w:type="dxa" w:w="1417"/>
+            <w:shd w:val="clear" w:color="auto" w:fill="F2F2F2"/>
+          </w:tcPr>
+          <w:p>
+            <w:r>
+              <w:rPr>
+                <w:sz w:val="19"/>
+              </w:rPr>
+              <w:t>Phase 2</w:t>
+            </w:r>
+          </w:p>
+        </w:tc>
+        <w:tc>
+          <w:tcPr>
+            <w:tcW w:type="dxa" w:w="4252"/>
+            <w:shd w:val="clear" w:color="auto" w:fill="F2F2F2"/>
+          </w:tcPr>
+          <w:p>
+            <w:r>
+              <w:rPr>
+                <w:sz w:val="19"/>
+              </w:rPr>
+              <w:t>Stale source detector. Compares current PRD SHA-256 against the hash stored in a prd-index or architecture artifact. Hard-stops with a clear error if hashes differ.</w:t>
+            </w:r>
+          </w:p>
+        </w:tc>
+      </w:tr>
+      <w:tr>
+        <w:tc>
+          <w:tcPr>
+            <w:tcW w:type="dxa" w:w="2835"/>
+            <w:shd w:val="clear" w:color="auto" w:fill="FFFFFF"/>
+          </w:tcPr>
+          <w:p>
+            <w:r>
+              <w:rPr>
+                <w:sz w:val="19"/>
+              </w:rPr>
+              <w:t>phase2/extract_prd.py</w:t>
+            </w:r>
+          </w:p>
+        </w:tc>
+        <w:tc>
+          <w:tcPr>
+            <w:tcW w:type="dxa" w:w="1417"/>
+            <w:shd w:val="clear" w:color="auto" w:fill="FFFFFF"/>
+          </w:tcPr>
+          <w:p>
+            <w:r>
+              <w:rPr>
+                <w:sz w:val="19"/>
+              </w:rPr>
+              <w:t>Python helper</w:t>
+            </w:r>
+          </w:p>
+        </w:tc>
+        <w:tc>
+          <w:tcPr>
+            <w:tcW w:type="dxa" w:w="1417"/>
+            <w:shd w:val="clear" w:color="auto" w:fill="FFFFFF"/>
+          </w:tcPr>
+          <w:p>
+            <w:r>
+              <w:rPr>
+                <w:sz w:val="19"/>
+              </w:rPr>
+              <w:t>Phase 2</w:t>
+            </w:r>
+          </w:p>
+        </w:tc>
+        <w:tc>
+          <w:tcPr>
+            <w:tcW w:type="dxa" w:w="4252"/>
+            <w:shd w:val="clear" w:color="auto" w:fill="FFFFFF"/>
+          </w:tcPr>
+          <w:p>
+            <w:r>
+              <w:rPr>
+                <w:sz w:val="19"/>
+              </w:rPr>
+              <w:t>Converts PRD .docx files to Markdown using mammoth so index_prd.js can parse them. Required because the Service Desk PRD is a Word document.</w:t>
+            </w:r>
+          </w:p>
+        </w:tc>
+      </w:tr>
+      <w:tr>
+        <w:tc>
+          <w:tcPr>
+            <w:tcW w:type="dxa" w:w="2835"/>
+            <w:shd w:val="clear" w:color="auto" w:fill="F2F2F2"/>
+          </w:tcPr>
+          <w:p>
+            <w:r>
+              <w:rPr>
+                <w:sz w:val="19"/>
+              </w:rPr>
+              <w:t>phase2/PRD-service-desk-v1.md</w:t>
+            </w:r>
+          </w:p>
+        </w:tc>
+        <w:tc>
+          <w:tcPr>
+            <w:tcW w:type="dxa" w:w="1417"/>
+            <w:shd w:val="clear" w:color="auto" w:fill="F2F2F2"/>
+          </w:tcPr>
+          <w:p>
+            <w:r>
+              <w:rPr>
+                <w:sz w:val="19"/>
+              </w:rPr>
+              <w:t>Extracted PRD</w:t>
+            </w:r>
+          </w:p>
+        </w:tc>
+        <w:tc>
+          <w:tcPr>
+            <w:tcW w:type="dxa" w:w="1417"/>
+            <w:shd w:val="clear" w:color="auto" w:fill="F2F2F2"/>
+          </w:tcPr>
+          <w:p>
+            <w:r>
+              <w:rPr>
+                <w:sz w:val="19"/>
+              </w:rPr>
+              <w:t>Phase 2 / T-001</w:t>
+            </w:r>
+          </w:p>
+        </w:tc>
+        <w:tc>
+          <w:tcPr>
+            <w:tcW w:type="dxa" w:w="4252"/>
+            <w:shd w:val="clear" w:color="auto" w:fill="F2F2F2"/>
+          </w:tcPr>
+          <w:p>
+            <w:r>
+              <w:rPr>
+                <w:sz w:val="19"/>
+              </w:rPr>
+              <w:t>Markdown extraction of the Internal Service Desk PRD v1. Used as the first real PRD input for the indexer. Becomes the basis for T-001 test fixture in Phase 4.</w:t>
+            </w:r>
+          </w:p>
+        </w:tc>
+      </w:tr>
+      <w:tr>
+        <w:tc>
+          <w:tcPr>
+            <w:tcW w:type="dxa" w:w="2835"/>
+            <w:shd w:val="clear" w:color="auto" w:fill="FFFFFF"/>
+          </w:tcPr>
+          <w:p>
+            <w:r>
+              <w:rPr>
+                <w:sz w:val="19"/>
+              </w:rPr>
+              <w:t>phase2/indexes/prd-index-2026-09-02.json</w:t>
+            </w:r>
+          </w:p>
+        </w:tc>
+        <w:tc>
+          <w:tcPr>
+            <w:tcW w:type="dxa" w:w="1417"/>
+            <w:shd w:val="clear" w:color="auto" w:fill="FFFFFF"/>
+          </w:tcPr>
+          <w:p>
+            <w:r>
+              <w:rPr>
+                <w:sz w:val="19"/>
+              </w:rPr>
+              <w:t>Live index output</w:t>
+            </w:r>
+          </w:p>
+        </w:tc>
+        <w:tc>
+          <w:tcPr>
+            <w:tcW w:type="dxa" w:w="1417"/>
+            <w:shd w:val="clear" w:color="auto" w:fill="FFFFFF"/>
+          </w:tcPr>
+          <w:p>
+            <w:r>
+              <w:rPr>
+                <w:sz w:val="19"/>
+              </w:rPr>
+              <w:t>Phase 2</w:t>
+            </w:r>
+          </w:p>
+        </w:tc>
+        <w:tc>
+          <w:tcPr>
+            <w:tcW w:type="dxa" w:w="4252"/>
+            <w:shd w:val="clear" w:color="auto" w:fill="FFFFFF"/>
+          </w:tcPr>
+          <w:p>
+            <w:r>
+              <w:rPr>
+                <w:sz w:val="19"/>
+              </w:rPr>
+              <w:t>First real index run output. 601 requirements extracted, 597 with explicit IDs (FR-xxx, NFR-xxx, BR-xxx, OQ-xxx). 372 sections parsed. ~51,791 estimated tokens.</w:t>
+            </w:r>
+          </w:p>
+        </w:tc>
+      </w:tr>
+      <w:tr>
+        <w:tc>
+          <w:tcPr>
+            <w:tcW w:type="dxa" w:w="2835"/>
+            <w:shd w:val="clear" w:color="auto" w:fill="F2F2F2"/>
+          </w:tcPr>
+          <w:p>
+            <w:r>
+              <w:rPr>
+                <w:sz w:val="19"/>
+              </w:rPr>
+              <w:t>phase2/indexes/prd-source-hash-2026-09-02.json</w:t>
+            </w:r>
+          </w:p>
+        </w:tc>
+        <w:tc>
+          <w:tcPr>
+            <w:tcW w:type="dxa" w:w="1417"/>
+            <w:shd w:val="clear" w:color="auto" w:fill="F2F2F2"/>
+          </w:tcPr>
+          <w:p>
+            <w:r>
+              <w:rPr>
+                <w:sz w:val="19"/>
+              </w:rPr>
+              <w:t>Source hash record</w:t>
+            </w:r>
+          </w:p>
+        </w:tc>
+        <w:tc>
+          <w:tcPr>
+            <w:tcW w:type="dxa" w:w="1417"/>
+            <w:shd w:val="clear" w:color="auto" w:fill="F2F2F2"/>
+          </w:tcPr>
+          <w:p>
+            <w:r>
+              <w:rPr>
+                <w:sz w:val="19"/>
+              </w:rPr>
+              <w:t>Phase 2</w:t>
+            </w:r>
+          </w:p>
+        </w:tc>
+        <w:tc>
+          <w:tcPr>
+            <w:tcW w:type="dxa" w:w="4252"/>
+            <w:shd w:val="clear" w:color="auto" w:fill="F2F2F2"/>
+          </w:tcPr>
+          <w:p>
+            <w:r>
+              <w:rPr>
+                <w:sz w:val="19"/>
+              </w:rPr>
+              <w:t>SHA-256 baseline for the Service Desk PRD. Used by stale-source-detect.js to confirm the PRD has not changed since indexing.</w:t>
+            </w:r>
+          </w:p>
+        </w:tc>
+      </w:tr>
+    </w:tbl>
+    <w:p/>
+    <w:p>
+      <w:r>
+        <w:br w:type="page"/>
+      </w:r>
+    </w:p>
+    <w:p>
+      <w:pPr>
+        <w:pStyle w:val="Heading2"/>
+        <w:spacing w:before="360" w:after="160"/>
+      </w:pPr>
+      <w:r>
+        <w:rPr>
+          <w:b/>
+          <w:color w:val="1F3564"/>
+          <w:sz w:val="30"/>
+        </w:rPr>
+        <w:t>Phase 2 Workflow — How It Works End to End</w:t>
+      </w:r>
+    </w:p>
+    <w:p>
+      <w:pPr>
+        <w:spacing w:before="160"/>
+      </w:pPr>
+      <w:r>
+        <w:rPr>
+          <w:b/>
+          <w:color w:val="2763AB"/>
+          <w:sz w:val="21"/>
+        </w:rPr>
+        <w:t xml:space="preserve">  Phase 2 Execution Flow</w:t>
+      </w:r>
+    </w:p>
+    <w:tbl>
+      <w:tblPr>
+        <w:tblStyle w:val="TableGrid"/>
+        <w:tblW w:type="auto" w:w="0"/>
+        <w:jc w:val="center"/>
+        <w:tblLook w:firstColumn="1" w:firstRow="1" w:lastColumn="0" w:lastRow="0" w:noHBand="0" w:noVBand="1" w:val="04A0"/>
+      </w:tblPr>
+      <w:tblGrid>
+        <w:gridCol w:w="9406"/>
+      </w:tblGrid>
+      <w:tr>
+        <w:tc>
+          <w:tcPr>
+            <w:tcW w:type="dxa" w:w="7370"/>
+            <w:shd w:val="clear" w:color="auto" w:fill="2E86C1"/>
+          </w:tcPr>
+          <w:p>
+            <w:pPr>
+              <w:jc w:val="center"/>
+            </w:pPr>
+            <w:r>
+              <w:rPr>
+                <w:b/>
+                <w:color w:val="FFFFFF"/>
+                <w:sz w:val="20"/>
+              </w:rPr>
+              <w:t>Input: PRD file (.docx or .md)</w:t>
+            </w:r>
+            <w:r>
+              <w:br/>
+            </w:r>
+            <w:r>
+              <w:rPr>
+                <w:color w:val="D6EAFF"/>
+                <w:sz w:val="18"/>
+              </w:rPr>
+              <w:t>The approved, current Product Requirements Document</w:t>
+            </w:r>
+          </w:p>
+        </w:tc>
+      </w:tr>
+    </w:tbl>
+    <w:p>
+      <w:pPr>
+        <w:spacing w:before="0" w:after="0"/>
+        <w:jc w:val="center"/>
+      </w:pPr>
+      <w:r>
+        <w:rPr>
+          <w:color w:val="2E86C1"/>
+          <w:sz w:val="26"/>
+        </w:rPr>
+        <w:t xml:space="preserve">        ↓</w:t>
+      </w:r>
+    </w:p>
+    <w:tbl>
+      <w:tblPr>
+        <w:tblStyle w:val="TableGrid"/>
+        <w:tblW w:type="auto" w:w="0"/>
+        <w:jc w:val="center"/>
+        <w:tblLook w:firstColumn="1" w:firstRow="1" w:lastColumn="0" w:lastRow="0" w:noHBand="0" w:noVBand="1" w:val="04A0"/>
+      </w:tblPr>
+      <w:tblGrid>
+        <w:gridCol w:w="9406"/>
+      </w:tblGrid>
+      <w:tr>
+        <w:tc>
+          <w:tcPr>
+            <w:tcW w:type="dxa" w:w="7370"/>
+            <w:shd w:val="clear" w:color="auto" w:fill="2E86C1"/>
+          </w:tcPr>
+          <w:p>
+            <w:pPr>
+              <w:jc w:val="center"/>
+            </w:pPr>
+            <w:r>
+              <w:rPr>
+                <w:b/>
+                <w:color w:val="FFFFFF"/>
+                <w:sz w:val="20"/>
+              </w:rPr>
+              <w:t>Step 1: Extract to Markdown (if .docx)</w:t>
+            </w:r>
+            <w:r>
+              <w:br/>
+            </w:r>
+            <w:r>
+              <w:rPr>
+                <w:color w:val="D6EAFF"/>
+                <w:sz w:val="18"/>
+              </w:rPr>
+              <w:t>python phase2/extract_prd.py  →  phase2/PRD-&lt;name&gt;.md</w:t>
+            </w:r>
+          </w:p>
+        </w:tc>
+      </w:tr>
+    </w:tbl>
+    <w:p>
+      <w:pPr>
+        <w:spacing w:before="0" w:after="0"/>
+        <w:jc w:val="center"/>
+      </w:pPr>
+      <w:r>
+        <w:rPr>
+          <w:color w:val="2E86C1"/>
+          <w:sz w:val="26"/>
+        </w:rPr>
+        <w:t xml:space="preserve">        ↓</w:t>
+      </w:r>
+    </w:p>
+    <w:tbl>
+      <w:tblPr>
+        <w:tblStyle w:val="TableGrid"/>
+        <w:tblW w:type="auto" w:w="0"/>
+        <w:jc w:val="center"/>
+        <w:tblLook w:firstColumn="1" w:firstRow="1" w:lastColumn="0" w:lastRow="0" w:noHBand="0" w:noVBand="1" w:val="04A0"/>
+      </w:tblPr>
+      <w:tblGrid>
+        <w:gridCol w:w="9406"/>
+      </w:tblGrid>
+      <w:tr>
+        <w:tc>
+          <w:tcPr>
+            <w:tcW w:type="dxa" w:w="7370"/>
+            <w:shd w:val="clear" w:color="auto" w:fill="2E86C1"/>
+          </w:tcPr>
+          <w:p>
+            <w:pPr>
+              <w:jc w:val="center"/>
+            </w:pPr>
+            <w:r>
+              <w:rPr>
+                <w:b/>
+                <w:color w:val="FFFFFF"/>
+                <w:sz w:val="20"/>
+              </w:rPr>
+              <w:t>Step 2: Run PRD Indexer</w:t>
+            </w:r>
+            <w:r>
+              <w:br/>
+            </w:r>
+            <w:r>
+              <w:rPr>
+                <w:color w:val="D6EAFF"/>
+                <w:sz w:val="18"/>
+              </w:rPr>
+              <w:t>node phase2/index_prd.js --prd &lt;prd.md&gt; --out phase2/indexes</w:t>
+            </w:r>
+          </w:p>
+        </w:tc>
+      </w:tr>
+    </w:tbl>
+    <w:p>
+      <w:pPr>
+        <w:spacing w:before="0" w:after="0"/>
+        <w:jc w:val="center"/>
+      </w:pPr>
+      <w:r>
+        <w:rPr>
+          <w:color w:val="2E86C1"/>
+          <w:sz w:val="26"/>
+        </w:rPr>
+        <w:t xml:space="preserve">        ↓</w:t>
+      </w:r>
+    </w:p>
+    <w:tbl>
+      <w:tblPr>
+        <w:tblStyle w:val="TableGrid"/>
+        <w:tblW w:type="auto" w:w="0"/>
+        <w:jc w:val="center"/>
+        <w:tblLook w:firstColumn="1" w:firstRow="1" w:lastColumn="0" w:lastRow="0" w:noHBand="0" w:noVBand="1" w:val="04A0"/>
+      </w:tblPr>
+      <w:tblGrid>
+        <w:gridCol w:w="9406"/>
+      </w:tblGrid>
+      <w:tr>
+        <w:tc>
+          <w:tcPr>
+            <w:tcW w:type="dxa" w:w="7370"/>
+            <w:shd w:val="clear" w:color="auto" w:fill="2E86C1"/>
+          </w:tcPr>
+          <w:p>
+            <w:pPr>
+              <w:jc w:val="center"/>
+            </w:pPr>
+            <w:r>
+              <w:rPr>
+                <w:b/>
+                <w:color w:val="FFFFFF"/>
+                <w:sz w:val="20"/>
+              </w:rPr>
+              <w:t>Step 3: Indexer parses sections</w:t>
+            </w:r>
+            <w:r>
+              <w:br/>
+            </w:r>
+            <w:r>
+              <w:rPr>
+                <w:color w:val="D6EAFF"/>
+                <w:sz w:val="18"/>
+              </w:rPr>
+              <w:t>372 sections parsed. Bounded, section-by-section — §52 step 6 compliant</w:t>
+            </w:r>
+          </w:p>
+        </w:tc>
+      </w:tr>
+    </w:tbl>
+    <w:p>
+      <w:pPr>
+        <w:spacing w:before="0" w:after="0"/>
+        <w:jc w:val="center"/>
+      </w:pPr>
+      <w:r>
+        <w:rPr>
+          <w:color w:val="2E86C1"/>
+          <w:sz w:val="26"/>
+        </w:rPr>
+        <w:t xml:space="preserve">        ↓</w:t>
+      </w:r>
+    </w:p>
+    <w:tbl>
+      <w:tblPr>
+        <w:tblStyle w:val="TableGrid"/>
+        <w:tblW w:type="auto" w:w="0"/>
+        <w:jc w:val="center"/>
+        <w:tblLook w:firstColumn="1" w:firstRow="1" w:lastColumn="0" w:lastRow="0" w:noHBand="0" w:noVBand="1" w:val="04A0"/>
+      </w:tblPr>
+      <w:tblGrid>
+        <w:gridCol w:w="9406"/>
+      </w:tblGrid>
+      <w:tr>
+        <w:tc>
+          <w:tcPr>
+            <w:tcW w:type="dxa" w:w="7370"/>
+            <w:shd w:val="clear" w:color="auto" w:fill="2E86C1"/>
+          </w:tcPr>
+          <w:p>
+            <w:pPr>
+              <w:jc w:val="center"/>
+            </w:pPr>
+            <w:r>
+              <w:rPr>
+                <w:b/>
+                <w:color w:val="FFFFFF"/>
+                <w:sz w:val="20"/>
+              </w:rPr>
+              <w:t>Step 4: Indexer extracts requirements</w:t>
+            </w:r>
+            <w:r>
+              <w:br/>
+            </w:r>
+            <w:r>
+              <w:rPr>
+                <w:color w:val="D6EAFF"/>
+                <w:sz w:val="18"/>
+              </w:rPr>
+              <w:t>601 requirements with source_locator (section:Lnnn), type, status, module</w:t>
+            </w:r>
+          </w:p>
+        </w:tc>
+      </w:tr>
+    </w:tbl>
+    <w:p>
+      <w:pPr>
+        <w:spacing w:before="0" w:after="0"/>
+        <w:jc w:val="center"/>
+      </w:pPr>
+      <w:r>
+        <w:rPr>
+          <w:color w:val="2E86C1"/>
+          <w:sz w:val="26"/>
+        </w:rPr>
+        <w:t xml:space="preserve">        ↓</w:t>
+      </w:r>
+    </w:p>
+    <w:tbl>
+      <w:tblPr>
+        <w:tblStyle w:val="TableGrid"/>
+        <w:tblW w:type="auto" w:w="0"/>
+        <w:jc w:val="center"/>
+        <w:tblLook w:firstColumn="1" w:firstRow="1" w:lastColumn="0" w:lastRow="0" w:noHBand="0" w:noVBand="1" w:val="04A0"/>
+      </w:tblPr>
+      <w:tblGrid>
+        <w:gridCol w:w="9406"/>
+      </w:tblGrid>
+      <w:tr>
+        <w:tc>
+          <w:tcPr>
+            <w:tcW w:type="dxa" w:w="7370"/>
+            <w:shd w:val="clear" w:color="auto" w:fill="2E86C1"/>
+          </w:tcPr>
+          <w:p>
+            <w:pPr>
+              <w:jc w:val="center"/>
+            </w:pPr>
+            <w:r>
+              <w:rPr>
+                <w:b/>
+                <w:color w:val="FFFFFF"/>
+                <w:sz w:val="20"/>
+              </w:rPr>
+              <w:t>Step 5: Indexer records SHA-256 hash</w:t>
+            </w:r>
+            <w:r>
+              <w:br/>
+            </w:r>
+            <w:r>
+              <w:rPr>
+                <w:color w:val="D6EAFF"/>
+                <w:sz w:val="18"/>
+              </w:rPr>
+              <w:t>prd-source-hash-&lt;date&gt;.json — proof of exactly which PRD version was used</w:t>
+            </w:r>
+          </w:p>
+        </w:tc>
+      </w:tr>
+    </w:tbl>
+    <w:p>
+      <w:pPr>
+        <w:spacing w:before="0" w:after="0"/>
+        <w:jc w:val="center"/>
+      </w:pPr>
+      <w:r>
+        <w:rPr>
+          <w:color w:val="2E86C1"/>
+          <w:sz w:val="26"/>
+        </w:rPr>
+        <w:t xml:space="preserve">        ↓</w:t>
+      </w:r>
+    </w:p>
+    <w:tbl>
+      <w:tblPr>
+        <w:tblStyle w:val="TableGrid"/>
+        <w:tblW w:type="auto" w:w="0"/>
+        <w:jc w:val="center"/>
+        <w:tblLook w:firstColumn="1" w:firstRow="1" w:lastColumn="0" w:lastRow="0" w:noHBand="0" w:noVBand="1" w:val="04A0"/>
+      </w:tblPr>
+      <w:tblGrid>
+        <w:gridCol w:w="9406"/>
+      </w:tblGrid>
+      <w:tr>
+        <w:tc>
+          <w:tcPr>
+            <w:tcW w:type="dxa" w:w="7370"/>
+            <w:shd w:val="clear" w:color="auto" w:fill="2E86C1"/>
+          </w:tcPr>
+          <w:p>
+            <w:pPr>
+              <w:jc w:val="center"/>
+            </w:pPr>
+            <w:r>
+              <w:rPr>
+                <w:b/>
+                <w:color w:val="FFFFFF"/>
+                <w:sz w:val="20"/>
+              </w:rPr>
+              <w:t>Step 6: Run Stale Source Detector (before any architecture run)</w:t>
+            </w:r>
+            <w:r>
+              <w:br/>
+            </w:r>
+            <w:r>
+              <w:rPr>
+                <w:color w:val="D6EAFF"/>
+                <w:sz w:val="18"/>
+              </w:rPr>
+              <w:t>node phase2/stale-source-detect.js --prd &lt;prd.md&gt; --index &lt;prd-index.json&gt;</w:t>
+            </w:r>
+          </w:p>
+        </w:tc>
+      </w:tr>
+    </w:tbl>
+    <w:p>
+      <w:pPr>
+        <w:spacing w:before="0" w:after="0"/>
+        <w:jc w:val="center"/>
+      </w:pPr>
+      <w:r>
+        <w:rPr>
+          <w:color w:val="2E86C1"/>
+          <w:sz w:val="26"/>
+        </w:rPr>
+        <w:t xml:space="preserve">        ↓</w:t>
+      </w:r>
+    </w:p>
+    <w:tbl>
+      <w:tblPr>
+        <w:tblStyle w:val="TableGrid"/>
+        <w:tblW w:type="auto" w:w="0"/>
+        <w:jc w:val="center"/>
+        <w:tblLook w:firstColumn="1" w:firstRow="1" w:lastColumn="0" w:lastRow="0" w:noHBand="0" w:noVBand="1" w:val="04A0"/>
+      </w:tblPr>
+      <w:tblGrid>
+        <w:gridCol w:w="9406"/>
+      </w:tblGrid>
+      <w:tr>
+        <w:tc>
+          <w:tcPr>
+            <w:tcW w:type="dxa" w:w="7370"/>
+            <w:shd w:val="clear" w:color="auto" w:fill="2E86C1"/>
+          </w:tcPr>
+          <w:p>
+            <w:pPr>
+              <w:jc w:val="center"/>
+            </w:pPr>
+            <w:r>
+              <w:rPr>
+                <w:b/>
+                <w:color w:val="FFFFFF"/>
+                <w:sz w:val="20"/>
+              </w:rPr>
+              <w:t>Step 7: Hash check result</w:t>
+            </w:r>
+            <w:r>
+              <w:br/>
+            </w:r>
+            <w:r>
+              <w:rPr>
+                <w:color w:val="D6EAFF"/>
+                <w:sz w:val="18"/>
+              </w:rPr>
+              <w:t>✅ SOURCE CURRENT → proceed  |  ❌ STALE SOURCE → stop, locate correct PRD</w:t>
+            </w:r>
+          </w:p>
+        </w:tc>
+      </w:tr>
+    </w:tbl>
+    <w:p>
+      <w:pPr>
+        <w:spacing w:before="0" w:after="0"/>
+        <w:jc w:val="center"/>
+      </w:pPr>
+      <w:r>
+        <w:rPr>
+          <w:color w:val="2E86C1"/>
+          <w:sz w:val="26"/>
+        </w:rPr>
+        <w:t xml:space="preserve">        ↓</w:t>
+      </w:r>
+    </w:p>
+    <w:tbl>
+      <w:tblPr>
+        <w:tblStyle w:val="TableGrid"/>
+        <w:tblW w:type="auto" w:w="0"/>
+        <w:jc w:val="center"/>
+        <w:tblLook w:firstColumn="1" w:firstRow="1" w:lastColumn="0" w:lastRow="0" w:noHBand="0" w:noVBand="1" w:val="04A0"/>
+      </w:tblPr>
+      <w:tblGrid>
+        <w:gridCol w:w="9406"/>
+      </w:tblGrid>
+      <w:tr>
+        <w:tc>
+          <w:tcPr>
+            <w:tcW w:type="dxa" w:w="7370"/>
+            <w:shd w:val="clear" w:color="auto" w:fill="2E86C1"/>
+          </w:tcPr>
+          <w:p>
+            <w:pPr>
+              <w:jc w:val="center"/>
+            </w:pPr>
+            <w:r>
+              <w:rPr>
+                <w:b/>
+                <w:color w:val="FFFFFF"/>
+                <w:sz w:val="20"/>
+              </w:rPr>
+              <w:t>Step 8: Architecture synthesis uses the inventory</w:t>
+            </w:r>
+            <w:r>
+              <w:br/>
+            </w:r>
+            <w:r>
+              <w:rPr>
+                <w:color w:val="D6EAFF"/>
+                <w:sz w:val="18"/>
+              </w:rPr>
+              <w:t>Requirement inventory fed into §52 execution workflow. Citations verified via locators (step 36).</w:t>
+            </w:r>
+          </w:p>
+        </w:tc>
+      </w:tr>
+    </w:tbl>
+    <w:p/>
+    <w:p>
+      <w:pPr>
+        <w:pStyle w:val="Heading2"/>
+        <w:spacing w:before="360" w:after="160"/>
+      </w:pPr>
+      <w:r>
+        <w:rPr>
+          <w:b/>
+          <w:color w:val="1F3564"/>
+          <w:sz w:val="30"/>
+        </w:rPr>
+        <w:t>The Source Index Contract (§60) — Key Concepts</w:t>
+      </w:r>
+    </w:p>
+    <w:p>
+      <w:pPr>
+        <w:spacing w:after="80" w:before="40"/>
+      </w:pPr>
+      <w:r>
+        <w:rPr>
+          <w:b w:val="0"/>
+          <w:i w:val="0"/>
+          <w:color w:val="000000"/>
+          <w:sz w:val="21"/>
+        </w:rPr>
+        <w:t>Every enterprise run against a PRD with more than 10 requirements MUST produce two JSON outputs before architecture synthesis begins.</w:t>
+      </w:r>
+    </w:p>
+    <w:p/>
+    <w:tbl>
+      <w:tblPr>
+        <w:tblStyle w:val="TableGrid"/>
+        <w:tblW w:type="auto" w:w="0"/>
+        <w:jc w:val="left"/>
+        <w:tblLook w:firstColumn="1" w:firstRow="1" w:lastColumn="0" w:lastRow="0" w:noHBand="0" w:noVBand="1" w:val="04A0"/>
+      </w:tblPr>
+      <w:tblGrid>
+        <w:gridCol w:w="4703"/>
+        <w:gridCol w:w="4703"/>
+      </w:tblGrid>
+      <w:tr>
+        <w:tc>
+          <w:tcPr>
+            <w:tcW w:type="dxa" w:w="4703"/>
+            <w:shd w:val="clear" w:color="auto" w:fill="1A5E8A"/>
+          </w:tcPr>
+          <w:p>
+            <w:r>
+              <w:rPr>
+                <w:b/>
+                <w:color w:val="FFFFFF"/>
+                <w:sz w:val="20"/>
+              </w:rPr>
+              <w:t>Requirement Inventory Record (per requirement)</w:t>
+              <w:br/>
+            </w:r>
+            <w:r>
+              <w:rPr>
+                <w:color w:val="FFFFFF"/>
+                <w:sz w:val="18"/>
+              </w:rPr>
+              <w:t xml:space="preserve">  • source_locator: section:Lnnn</w:t>
+              <w:br/>
+            </w:r>
+            <w:r>
+              <w:rPr>
+                <w:color w:val="FFFFFF"/>
+                <w:sz w:val="18"/>
+              </w:rPr>
+              <w:t xml:space="preserve">  • requirement_id: FR-001 or AUTO-xx-xxx</w:t>
+              <w:br/>
+            </w:r>
+            <w:r>
+              <w:rPr>
+                <w:color w:val="FFFFFF"/>
+                <w:sz w:val="18"/>
+              </w:rPr>
+              <w:t xml:space="preserve">  • title: text (max 120 chars)</w:t>
+              <w:br/>
+            </w:r>
+            <w:r>
+              <w:rPr>
+                <w:color w:val="FFFFFF"/>
+                <w:sz w:val="18"/>
+              </w:rPr>
+              <w:t xml:space="preserve">  • type: functional | non_functional | security…</w:t>
+              <w:br/>
+            </w:r>
+            <w:r>
+              <w:rPr>
+                <w:color w:val="FFFFFF"/>
+                <w:sz w:val="18"/>
+              </w:rPr>
+              <w:t xml:space="preserve">  • source_status: prd_stated | proposed | blocked…</w:t>
+              <w:br/>
+            </w:r>
+            <w:r>
+              <w:rPr>
+                <w:color w:val="FFFFFF"/>
+                <w:sz w:val="18"/>
+              </w:rPr>
+              <w:t xml:space="preserve">  • module: section / capability group</w:t>
+              <w:br/>
+            </w:r>
+            <w:r>
+              <w:rPr>
+                <w:color w:val="FFFFFF"/>
+                <w:sz w:val="18"/>
+              </w:rPr>
+              <w:t xml:space="preserve">  • current_or_target: current_state | target_state</w:t>
+              <w:br/>
+            </w:r>
+            <w:r>
+              <w:rPr>
+                <w:color w:val="FFFFFF"/>
+                <w:sz w:val="18"/>
+              </w:rPr>
+              <w:t xml:space="preserve">  • open_question_ids: [Q-xxx, B-xxx]</w:t>
+              <w:br/>
+            </w:r>
+          </w:p>
+        </w:tc>
+        <w:tc>
+          <w:tcPr>
+            <w:tcW w:type="dxa" w:w="4703"/>
+            <w:shd w:val="clear" w:color="auto" w:fill="2E7D32"/>
+          </w:tcPr>
+          <w:p>
+            <w:r>
+              <w:rPr>
+                <w:b/>
+                <w:color w:val="FFFFFF"/>
+                <w:sz w:val="20"/>
+              </w:rPr>
+              <w:t>Source Hash Record (per PRD file)</w:t>
+              <w:br/>
+            </w:r>
+            <w:r>
+              <w:rPr>
+                <w:color w:val="FFFFFF"/>
+                <w:sz w:val="18"/>
+              </w:rPr>
+              <w:t xml:space="preserve">  • record_type: source_hash</w:t>
+              <w:br/>
+            </w:r>
+            <w:r>
+              <w:rPr>
+                <w:color w:val="FFFFFF"/>
+                <w:sz w:val="18"/>
+              </w:rPr>
+              <w:t xml:space="preserve">  • skill_version: 1.2.0</w:t>
+              <w:br/>
+            </w:r>
+            <w:r>
+              <w:rPr>
+                <w:color w:val="FFFFFF"/>
+                <w:sz w:val="18"/>
+              </w:rPr>
+              <w:t xml:space="preserve">  • prd_path: absolute or relative path</w:t>
+              <w:br/>
+            </w:r>
+            <w:r>
+              <w:rPr>
+                <w:color w:val="FFFFFF"/>
+                <w:sz w:val="18"/>
+              </w:rPr>
+              <w:t xml:space="preserve">  • prd_sha256: SHA-256 hash of the file</w:t>
+              <w:br/>
+            </w:r>
+            <w:r>
+              <w:rPr>
+                <w:color w:val="FFFFFF"/>
+                <w:sz w:val="18"/>
+              </w:rPr>
+              <w:t xml:space="preserve">  • indexed_at: ISO-8601 timestamp</w:t>
+              <w:br/>
+            </w:r>
+            <w:r>
+              <w:rPr>
+                <w:color w:val="FFFFFF"/>
+                <w:sz w:val="18"/>
+              </w:rPr>
+              <w:t xml:space="preserve">  • requirement_count: 601</w:t>
+              <w:br/>
+            </w:r>
+            <w:r>
+              <w:rPr>
+                <w:color w:val="FFFFFF"/>
+                <w:sz w:val="18"/>
+              </w:rPr>
+              <w:t xml:space="preserve">  • integrity_status: clean | warnings</w:t>
+              <w:br/>
+            </w:r>
+          </w:p>
+        </w:tc>
+      </w:tr>
+    </w:tbl>
+    <w:p/>
+    <w:p>
+      <w:pPr>
+        <w:pStyle w:val="Heading2"/>
+        <w:spacing w:before="360" w:after="160"/>
+      </w:pPr>
+      <w:r>
+        <w:rPr>
+          <w:b/>
+          <w:color w:val="1F3564"/>
+          <w:sz w:val="30"/>
+        </w:rPr>
+        <w:t>Source Index Integrity Rules</w:t>
+      </w:r>
+    </w:p>
+    <w:tbl>
+      <w:tblPr>
+        <w:tblStyle w:val="TableGrid"/>
+        <w:tblW w:type="auto" w:w="0"/>
+        <w:jc w:val="left"/>
+        <w:tblLook w:firstColumn="1" w:firstRow="1" w:lastColumn="0" w:lastRow="0" w:noHBand="0" w:noVBand="1" w:val="04A0"/>
+      </w:tblPr>
+      <w:tblGrid>
+        <w:gridCol w:w="4703"/>
+        <w:gridCol w:w="4703"/>
+      </w:tblGrid>
+      <w:tr>
+        <w:tc>
+          <w:tcPr>
+            <w:tcW w:type="dxa" w:w="4252"/>
+            <w:shd w:val="clear" w:color="auto" w:fill="1F3564"/>
+          </w:tcPr>
+          <w:p>
+            <w:pPr>
+              <w:jc w:val="center"/>
+            </w:pPr>
+            <w:r>
+              <w:rPr>
+                <w:b/>
+                <w:color w:val="FFFFFF"/>
+                <w:sz w:val="19"/>
+              </w:rPr>
+              <w:t>Rule</w:t>
+            </w:r>
+          </w:p>
+        </w:tc>
+        <w:tc>
+          <w:tcPr>
+            <w:tcW w:type="dxa" w:w="5669"/>
+            <w:shd w:val="clear" w:color="auto" w:fill="1F3564"/>
+          </w:tcPr>
+          <w:p>
+            <w:pPr>
+              <w:jc w:val="center"/>
+            </w:pPr>
+            <w:r>
+              <w:rPr>
+                <w:b/>
+                <w:color w:val="FFFFFF"/>
+                <w:sz w:val="19"/>
+              </w:rPr>
+              <w:t>What It Prevents</w:t>
+            </w:r>
+          </w:p>
+        </w:tc>
+      </w:tr>
+      <w:tr>
+        <w:tc>
+          <w:tcPr>
+            <w:tcW w:type="dxa" w:w="4252"/>
+            <w:shd w:val="clear" w:color="auto" w:fill="F2F2F2"/>
+          </w:tcPr>
+          <w:p>
+            <w:r>
+              <w:rPr>
+                <w:sz w:val="19"/>
+              </w:rPr>
+              <w:t>prd_sha256 MUST be checked before synthesis begins</w:t>
+            </w:r>
+          </w:p>
+        </w:tc>
+        <w:tc>
+          <w:tcPr>
+            <w:tcW w:type="dxa" w:w="5669"/>
+            <w:shd w:val="clear" w:color="auto" w:fill="F2F2F2"/>
+          </w:tcPr>
+          <w:p>
+            <w:r>
+              <w:rPr>
+                <w:sz w:val="19"/>
+              </w:rPr>
+              <w:t>Stops architecture being generated from a PRD that changed after indexing.</w:t>
+            </w:r>
+          </w:p>
+        </w:tc>
+      </w:tr>
+      <w:tr>
+        <w:tc>
+          <w:tcPr>
+            <w:tcW w:type="dxa" w:w="4252"/>
+            <w:shd w:val="clear" w:color="auto" w:fill="FFFFFF"/>
+          </w:tcPr>
+          <w:p>
+            <w:r>
+              <w:rPr>
+                <w:sz w:val="19"/>
+              </w:rPr>
+              <w:t>Missing / moved source path = input-integrity failure</w:t>
+            </w:r>
+          </w:p>
+        </w:tc>
+        <w:tc>
+          <w:tcPr>
+            <w:tcW w:type="dxa" w:w="5669"/>
+            <w:shd w:val="clear" w:color="auto" w:fill="FFFFFF"/>
+          </w:tcPr>
+          <w:p>
+            <w:r>
+              <w:rPr>
+                <w:sz w:val="19"/>
+              </w:rPr>
+              <w:t>Prevents silent substitution of a similarly-named but wrong document.</w:t>
+            </w:r>
+          </w:p>
+        </w:tc>
+      </w:tr>
+      <w:tr>
+        <w:tc>
+          <w:tcPr>
+            <w:tcW w:type="dxa" w:w="4252"/>
+            <w:shd w:val="clear" w:color="auto" w:fill="F2F2F2"/>
+          </w:tcPr>
+          <w:p>
+            <w:r>
+              <w:rPr>
+                <w:sz w:val="19"/>
+              </w:rPr>
+              <w:t>Every requirement MUST have a source_locator</w:t>
+            </w:r>
+          </w:p>
+        </w:tc>
+        <w:tc>
+          <w:tcPr>
+            <w:tcW w:type="dxa" w:w="5669"/>
+            <w:shd w:val="clear" w:color="auto" w:fill="F2F2F2"/>
+          </w:tcPr>
+          <w:p>
+            <w:r>
+              <w:rPr>
+                <w:sz w:val="19"/>
+              </w:rPr>
+              <w:t>Makes §52 step 36 citation verification mechanically possible.</w:t>
+            </w:r>
+          </w:p>
+        </w:tc>
+      </w:tr>
+      <w:tr>
+        <w:tc>
+          <w:tcPr>
+            <w:tcW w:type="dxa" w:w="4252"/>
+            <w:shd w:val="clear" w:color="auto" w:fill="FFFFFF"/>
+          </w:tcPr>
+          <w:p>
+            <w:r>
+              <w:rPr>
+                <w:sz w:val="19"/>
+              </w:rPr>
+              <w:t>Inventory is read-only after creation</w:t>
+            </w:r>
+          </w:p>
+        </w:tc>
+        <w:tc>
+          <w:tcPr>
+            <w:tcW w:type="dxa" w:w="5669"/>
+            <w:shd w:val="clear" w:color="auto" w:fill="FFFFFF"/>
+          </w:tcPr>
+          <w:p>
+            <w:r>
+              <w:rPr>
+                <w:sz w:val="19"/>
+              </w:rPr>
+              <w:t>Prevents synthesis from silently modifying the extracted requirements.</w:t>
+            </w:r>
+          </w:p>
+        </w:tc>
+      </w:tr>
+      <w:tr>
+        <w:tc>
+          <w:tcPr>
+            <w:tcW w:type="dxa" w:w="4252"/>
+            <w:shd w:val="clear" w:color="auto" w:fill="F2F2F2"/>
+          </w:tcPr>
+          <w:p>
+            <w:r>
+              <w:rPr>
+                <w:sz w:val="19"/>
+              </w:rPr>
+              <w:t>Stale attachment = warning in report + stop if critical</w:t>
+            </w:r>
+          </w:p>
+        </w:tc>
+        <w:tc>
+          <w:tcPr>
+            <w:tcW w:type="dxa" w:w="5669"/>
+            <w:shd w:val="clear" w:color="auto" w:fill="F2F2F2"/>
+          </w:tcPr>
+          <w:p>
+            <w:r>
+              <w:rPr>
+                <w:sz w:val="19"/>
+              </w:rPr>
+              <w:t>Detects broken links to referenced files inside the PRD.</w:t>
+            </w:r>
+          </w:p>
+        </w:tc>
+      </w:tr>
+    </w:tbl>
+    <w:p/>
+    <w:p>
+      <w:pPr>
+        <w:pStyle w:val="Heading2"/>
+        <w:spacing w:before="360" w:after="160"/>
+      </w:pPr>
+      <w:r>
+        <w:rPr>
+          <w:b/>
+          <w:color w:val="1F3564"/>
+          <w:sz w:val="30"/>
+        </w:rPr>
+        <w:t>Live Results — Service Desk PRD Index Run</w:t>
+      </w:r>
+    </w:p>
+    <w:tbl>
+      <w:tblPr>
+        <w:tblStyle w:val="TableGrid"/>
+        <w:tblW w:type="auto" w:w="0"/>
+        <w:jc w:val="left"/>
+        <w:tblLook w:firstColumn="1" w:firstRow="1" w:lastColumn="0" w:lastRow="0" w:noHBand="0" w:noVBand="1" w:val="04A0"/>
+      </w:tblPr>
+      <w:tblGrid>
+        <w:gridCol w:w="4703"/>
+        <w:gridCol w:w="4703"/>
+      </w:tblGrid>
+      <w:tr>
+        <w:tc>
+          <w:tcPr>
+            <w:tcW w:type="dxa" w:w="3969"/>
+            <w:shd w:val="clear" w:color="auto" w:fill="1F3564"/>
+          </w:tcPr>
+          <w:p>
+            <w:pPr>
+              <w:jc w:val="center"/>
+            </w:pPr>
+            <w:r>
+              <w:rPr>
+                <w:b/>
+                <w:color w:val="FFFFFF"/>
+                <w:sz w:val="19"/>
+              </w:rPr>
+              <w:t>Metric</w:t>
+            </w:r>
+          </w:p>
+        </w:tc>
+        <w:tc>
+          <w:tcPr>
+            <w:tcW w:type="dxa" w:w="5953"/>
+            <w:shd w:val="clear" w:color="auto" w:fill="1F3564"/>
+          </w:tcPr>
+          <w:p>
+            <w:pPr>
+              <w:jc w:val="center"/>
+            </w:pPr>
+            <w:r>
+              <w:rPr>
+                <w:b/>
+                <w:color w:val="FFFFFF"/>
+                <w:sz w:val="19"/>
+              </w:rPr>
+              <w:t>Value</w:t>
+            </w:r>
+          </w:p>
+        </w:tc>
+      </w:tr>
+      <w:tr>
+        <w:tc>
+          <w:tcPr>
+            <w:tcW w:type="dxa" w:w="3969"/>
+            <w:shd w:val="clear" w:color="auto" w:fill="F2F2F2"/>
+          </w:tcPr>
+          <w:p>
+            <w:r>
+              <w:rPr>
+                <w:sz w:val="19"/>
+              </w:rPr>
+              <w:t>PRD source file</w:t>
+            </w:r>
+          </w:p>
+        </w:tc>
+        <w:tc>
+          <w:tcPr>
+            <w:tcW w:type="dxa" w:w="5953"/>
+            <w:shd w:val="clear" w:color="auto" w:fill="F2F2F2"/>
+          </w:tcPr>
+          <w:p>
+            <w:r>
+              <w:rPr>
+                <w:sz w:val="19"/>
+              </w:rPr>
+              <w:t>PRD Internal Service Desk Tool_V1.docx</w:t>
+            </w:r>
+          </w:p>
+        </w:tc>
+      </w:tr>
+      <w:tr>
+        <w:tc>
+          <w:tcPr>
+            <w:tcW w:type="dxa" w:w="3969"/>
+            <w:shd w:val="clear" w:color="auto" w:fill="FFFFFF"/>
+          </w:tcPr>
+          <w:p>
+            <w:r>
+              <w:rPr>
+                <w:sz w:val="19"/>
+              </w:rPr>
+              <w:t>SHA-256 (PRD)</w:t>
+            </w:r>
+          </w:p>
+        </w:tc>
+        <w:tc>
+          <w:tcPr>
+            <w:tcW w:type="dxa" w:w="5953"/>
+            <w:shd w:val="clear" w:color="auto" w:fill="FFFFFF"/>
+          </w:tcPr>
+          <w:p>
+            <w:r>
+              <w:rPr>
+                <w:sz w:val="19"/>
+              </w:rPr>
+              <w:t>8d28cdea942ebaf9655fc33f598f78e0b9c44b39b706a42e0ae4460fb477d67e</w:t>
+            </w:r>
+          </w:p>
+        </w:tc>
+      </w:tr>
+      <w:tr>
+        <w:tc>
+          <w:tcPr>
+            <w:tcW w:type="dxa" w:w="3969"/>
+            <w:shd w:val="clear" w:color="auto" w:fill="F2F2F2"/>
+          </w:tcPr>
+          <w:p>
+            <w:r>
+              <w:rPr>
+                <w:sz w:val="19"/>
+              </w:rPr>
+              <w:t>Sections parsed</w:t>
+            </w:r>
+          </w:p>
+        </w:tc>
+        <w:tc>
+          <w:tcPr>
+            <w:tcW w:type="dxa" w:w="5953"/>
+            <w:shd w:val="clear" w:color="auto" w:fill="F2F2F2"/>
+          </w:tcPr>
+          <w:p>
+            <w:r>
+              <w:rPr>
+                <w:sz w:val="19"/>
+              </w:rPr>
+              <w:t>372</w:t>
+            </w:r>
+          </w:p>
+        </w:tc>
+      </w:tr>
+      <w:tr>
+        <w:tc>
+          <w:tcPr>
+            <w:tcW w:type="dxa" w:w="3969"/>
+            <w:shd w:val="clear" w:color="auto" w:fill="FFFFFF"/>
+          </w:tcPr>
+          <w:p>
+            <w:r>
+              <w:rPr>
+                <w:sz w:val="19"/>
+              </w:rPr>
+              <w:t>Requirements extracted</w:t>
+            </w:r>
+          </w:p>
+        </w:tc>
+        <w:tc>
+          <w:tcPr>
+            <w:tcW w:type="dxa" w:w="5953"/>
+            <w:shd w:val="clear" w:color="auto" w:fill="FFFFFF"/>
+          </w:tcPr>
+          <w:p>
+            <w:r>
+              <w:rPr>
+                <w:sz w:val="19"/>
+              </w:rPr>
+              <w:t>601</w:t>
+            </w:r>
+          </w:p>
+        </w:tc>
+      </w:tr>
+      <w:tr>
+        <w:tc>
+          <w:tcPr>
+            <w:tcW w:type="dxa" w:w="3969"/>
+            <w:shd w:val="clear" w:color="auto" w:fill="F2F2F2"/>
+          </w:tcPr>
+          <w:p>
+            <w:r>
+              <w:rPr>
+                <w:sz w:val="19"/>
+              </w:rPr>
+              <w:t xml:space="preserve">  — Explicit IDs (FR/NFR/BR)</w:t>
+            </w:r>
+          </w:p>
+        </w:tc>
+        <w:tc>
+          <w:tcPr>
+            <w:tcW w:type="dxa" w:w="5953"/>
+            <w:shd w:val="clear" w:color="auto" w:fill="F2F2F2"/>
+          </w:tcPr>
+          <w:p>
+            <w:r>
+              <w:rPr>
+                <w:sz w:val="19"/>
+              </w:rPr>
+              <w:t>597</w:t>
+            </w:r>
+          </w:p>
+        </w:tc>
+      </w:tr>
+      <w:tr>
+        <w:tc>
+          <w:tcPr>
+            <w:tcW w:type="dxa" w:w="3969"/>
+            <w:shd w:val="clear" w:color="auto" w:fill="FFFFFF"/>
+          </w:tcPr>
+          <w:p>
+            <w:r>
+              <w:rPr>
+                <w:sz w:val="19"/>
+              </w:rPr>
+              <w:t xml:space="preserve">  — Auto-assigned IDs</w:t>
+            </w:r>
+          </w:p>
+        </w:tc>
+        <w:tc>
+          <w:tcPr>
+            <w:tcW w:type="dxa" w:w="5953"/>
+            <w:shd w:val="clear" w:color="auto" w:fill="FFFFFF"/>
+          </w:tcPr>
+          <w:p>
+            <w:r>
+              <w:rPr>
+                <w:sz w:val="19"/>
+              </w:rPr>
+              <w:t>4</w:t>
+            </w:r>
+          </w:p>
+        </w:tc>
+      </w:tr>
+      <w:tr>
+        <w:tc>
+          <w:tcPr>
+            <w:tcW w:type="dxa" w:w="3969"/>
+            <w:shd w:val="clear" w:color="auto" w:fill="F2F2F2"/>
+          </w:tcPr>
+          <w:p>
+            <w:r>
+              <w:rPr>
+                <w:sz w:val="19"/>
+              </w:rPr>
+              <w:t>Stale attachments</w:t>
+            </w:r>
+          </w:p>
+        </w:tc>
+        <w:tc>
+          <w:tcPr>
+            <w:tcW w:type="dxa" w:w="5953"/>
+            <w:shd w:val="clear" w:color="auto" w:fill="F2F2F2"/>
+          </w:tcPr>
+          <w:p>
+            <w:r>
+              <w:rPr>
+                <w:sz w:val="19"/>
+              </w:rPr>
+              <w:t>0</w:t>
+            </w:r>
+          </w:p>
+        </w:tc>
+      </w:tr>
+      <w:tr>
+        <w:tc>
+          <w:tcPr>
+            <w:tcW w:type="dxa" w:w="3969"/>
+            <w:shd w:val="clear" w:color="auto" w:fill="FFFFFF"/>
+          </w:tcPr>
+          <w:p>
+            <w:r>
+              <w:rPr>
+                <w:sz w:val="19"/>
+              </w:rPr>
+              <w:t>Estimated tokens</w:t>
+            </w:r>
+          </w:p>
+        </w:tc>
+        <w:tc>
+          <w:tcPr>
+            <w:tcW w:type="dxa" w:w="5953"/>
+            <w:shd w:val="clear" w:color="auto" w:fill="FFFFFF"/>
+          </w:tcPr>
+          <w:p>
+            <w:r>
+              <w:rPr>
+                <w:sz w:val="19"/>
+              </w:rPr>
+              <w:t>~51,791</w:t>
+            </w:r>
+          </w:p>
+        </w:tc>
+      </w:tr>
+      <w:tr>
+        <w:tc>
+          <w:tcPr>
+            <w:tcW w:type="dxa" w:w="3969"/>
+            <w:shd w:val="clear" w:color="auto" w:fill="F2F2F2"/>
+          </w:tcPr>
+          <w:p>
+            <w:r>
+              <w:rPr>
+                <w:sz w:val="19"/>
+              </w:rPr>
+              <w:t>Integrity status</w:t>
+            </w:r>
+          </w:p>
+        </w:tc>
+        <w:tc>
+          <w:tcPr>
+            <w:tcW w:type="dxa" w:w="5953"/>
+            <w:shd w:val="clear" w:color="auto" w:fill="F2F2F2"/>
+          </w:tcPr>
+          <w:p>
+            <w:r>
+              <w:rPr>
+                <w:sz w:val="19"/>
+              </w:rPr>
+              <w:t>CLEAN ✅</w:t>
+            </w:r>
+          </w:p>
+        </w:tc>
+      </w:tr>
+      <w:tr>
+        <w:tc>
+          <w:tcPr>
+            <w:tcW w:type="dxa" w:w="3969"/>
+            <w:shd w:val="clear" w:color="auto" w:fill="FFFFFF"/>
+          </w:tcPr>
+          <w:p>
+            <w:r>
+              <w:rPr>
+                <w:sz w:val="19"/>
+              </w:rPr>
+              <w:t>Stale-source detector result</w:t>
+            </w:r>
+          </w:p>
+        </w:tc>
+        <w:tc>
+          <w:tcPr>
+            <w:tcW w:type="dxa" w:w="5953"/>
+            <w:shd w:val="clear" w:color="auto" w:fill="FFFFFF"/>
+          </w:tcPr>
+          <w:p>
+            <w:r>
+              <w:rPr>
+                <w:sz w:val="19"/>
+              </w:rPr>
+              <w:t>✅ SOURCE CURRENT — Hashes match</w:t>
+            </w:r>
+          </w:p>
+        </w:tc>
+      </w:tr>
+    </w:tbl>
+    <w:p/>
+    <w:p>
+      <w:pPr>
+        <w:pStyle w:val="Heading2"/>
+        <w:spacing w:before="360" w:after="160"/>
+      </w:pPr>
+      <w:r>
+        <w:rPr>
+          <w:b/>
+          <w:color w:val="1F3564"/>
+          <w:sz w:val="30"/>
+        </w:rPr>
+        <w:t>What Phase 2 Did NOT Do (Deliberately)</w:t>
+      </w:r>
+    </w:p>
+    <w:tbl>
+      <w:tblPr>
+        <w:tblStyle w:val="TableGrid"/>
+        <w:tblW w:type="auto" w:w="0"/>
+        <w:jc w:val="left"/>
+        <w:tblLook w:firstColumn="1" w:firstRow="1" w:lastColumn="0" w:lastRow="0" w:noHBand="0" w:noVBand="1" w:val="04A0"/>
+      </w:tblPr>
+      <w:tblGrid>
+        <w:gridCol w:w="3135"/>
+        <w:gridCol w:w="3135"/>
+        <w:gridCol w:w="3135"/>
+      </w:tblGrid>
+      <w:tr>
+        <w:tc>
+          <w:tcPr>
+            <w:tcW w:type="dxa" w:w="3402"/>
+            <w:shd w:val="clear" w:color="auto" w:fill="1F3564"/>
+          </w:tcPr>
+          <w:p>
+            <w:pPr>
+              <w:jc w:val="center"/>
+            </w:pPr>
+            <w:r>
+              <w:rPr>
+                <w:b/>
+                <w:color w:val="FFFFFF"/>
+                <w:sz w:val="19"/>
+              </w:rPr>
+              <w:t>Out of Scope for Phase 2</w:t>
+            </w:r>
+          </w:p>
+        </w:tc>
+        <w:tc>
+          <w:tcPr>
+            <w:tcW w:type="dxa" w:w="1701"/>
+            <w:shd w:val="clear" w:color="auto" w:fill="1F3564"/>
+          </w:tcPr>
+          <w:p>
+            <w:pPr>
+              <w:jc w:val="center"/>
+            </w:pPr>
+            <w:r>
+              <w:rPr>
+                <w:b/>
+                <w:color w:val="FFFFFF"/>
+                <w:sz w:val="19"/>
+              </w:rPr>
+              <w:t>Belongs To</w:t>
+            </w:r>
+          </w:p>
+        </w:tc>
+        <w:tc>
+          <w:tcPr>
+            <w:tcW w:type="dxa" w:w="4819"/>
+            <w:shd w:val="clear" w:color="auto" w:fill="1F3564"/>
+          </w:tcPr>
+          <w:p>
+            <w:pPr>
+              <w:jc w:val="center"/>
+            </w:pPr>
+            <w:r>
+              <w:rPr>
+                <w:b/>
+                <w:color w:val="FFFFFF"/>
+                <w:sz w:val="19"/>
+              </w:rPr>
+              <w:t>Why</w:t>
+            </w:r>
+          </w:p>
+        </w:tc>
+      </w:tr>
+      <w:tr>
+        <w:tc>
+          <w:tcPr>
+            <w:tcW w:type="dxa" w:w="3402"/>
+            <w:shd w:val="clear" w:color="auto" w:fill="F2F2F2"/>
+          </w:tcPr>
+          <w:p>
+            <w:r>
+              <w:rPr>
+                <w:sz w:val="19"/>
+              </w:rPr>
+              <w:t>Token/context measurement collector</w:t>
+            </w:r>
+          </w:p>
+        </w:tc>
+        <w:tc>
+          <w:tcPr>
+            <w:tcW w:type="dxa" w:w="1701"/>
+            <w:shd w:val="clear" w:color="auto" w:fill="F2F2F2"/>
+          </w:tcPr>
+          <w:p>
+            <w:r>
+              <w:rPr>
+                <w:sz w:val="19"/>
+              </w:rPr>
+              <w:t>Phase 2 (future)</w:t>
+            </w:r>
+          </w:p>
+        </w:tc>
+        <w:tc>
+          <w:tcPr>
+            <w:tcW w:type="dxa" w:w="4819"/>
+            <w:shd w:val="clear" w:color="auto" w:fill="F2F2F2"/>
+          </w:tcPr>
+          <w:p>
+            <w:r>
+              <w:rPr>
+                <w:sz w:val="19"/>
+              </w:rPr>
+              <w:t>Runtime telemetry depends on the AI runtime — not available in static tools.</w:t>
+            </w:r>
+          </w:p>
+        </w:tc>
+      </w:tr>
+      <w:tr>
+        <w:tc>
+          <w:tcPr>
+            <w:tcW w:type="dxa" w:w="3402"/>
+            <w:shd w:val="clear" w:color="auto" w:fill="FFFFFF"/>
+          </w:tcPr>
+          <w:p>
+            <w:r>
+              <w:rPr>
+                <w:sz w:val="19"/>
+              </w:rPr>
+              <w:t>Automated requirement extraction validator</w:t>
+            </w:r>
+          </w:p>
+        </w:tc>
+        <w:tc>
+          <w:tcPr>
+            <w:tcW w:type="dxa" w:w="1701"/>
+            <w:shd w:val="clear" w:color="auto" w:fill="FFFFFF"/>
+          </w:tcPr>
+          <w:p>
+            <w:r>
+              <w:rPr>
+                <w:sz w:val="19"/>
+              </w:rPr>
+              <w:t>Phase 4</w:t>
+            </w:r>
+          </w:p>
+        </w:tc>
+        <w:tc>
+          <w:tcPr>
+            <w:tcW w:type="dxa" w:w="4819"/>
+            <w:shd w:val="clear" w:color="auto" w:fill="FFFFFF"/>
+          </w:tcPr>
+          <w:p>
+            <w:r>
+              <w:rPr>
+                <w:sz w:val="19"/>
+              </w:rPr>
+              <w:t>Full validation needs the test fixtures and verify.js from Phase 4.</w:t>
+            </w:r>
+          </w:p>
+        </w:tc>
+      </w:tr>
+      <w:tr>
+        <w:tc>
+          <w:tcPr>
+            <w:tcW w:type="dxa" w:w="3402"/>
+            <w:shd w:val="clear" w:color="auto" w:fill="F2F2F2"/>
+          </w:tcPr>
+          <w:p>
+            <w:r>
+              <w:rPr>
+                <w:sz w:val="19"/>
+              </w:rPr>
+              <w:t>Context budget enforcement</w:t>
+            </w:r>
+          </w:p>
+        </w:tc>
+        <w:tc>
+          <w:tcPr>
+            <w:tcW w:type="dxa" w:w="1701"/>
+            <w:shd w:val="clear" w:color="auto" w:fill="F2F2F2"/>
+          </w:tcPr>
+          <w:p>
+            <w:r>
+              <w:rPr>
+                <w:sz w:val="19"/>
+              </w:rPr>
+              <w:t>Phase 4</w:t>
+            </w:r>
+          </w:p>
+        </w:tc>
+        <w:tc>
+          <w:tcPr>
+            <w:tcW w:type="dxa" w:w="4819"/>
+            <w:shd w:val="clear" w:color="auto" w:fill="F2F2F2"/>
+          </w:tcPr>
+          <w:p>
+            <w:r>
+              <w:rPr>
+                <w:sz w:val="19"/>
+              </w:rPr>
+              <w:t>Enforcement requires knowing what the runtime can handle — Phase 4 concern.</w:t>
+            </w:r>
+          </w:p>
+        </w:tc>
+      </w:tr>
+    </w:tbl>
+    <w:p/>
+    <w:p>
+      <w:pPr>
+        <w:pStyle w:val="Heading2"/>
+        <w:spacing w:before="360" w:after="160"/>
+      </w:pPr>
+      <w:r>
+        <w:rPr>
+          <w:b/>
+          <w:color w:val="1F3564"/>
+          <w:sz w:val="30"/>
+        </w:rPr>
+        <w:t>Updated Gap Status After Phase 2</w:t>
+      </w:r>
+    </w:p>
+    <w:tbl>
+      <w:tblPr>
+        <w:tblStyle w:val="TableGrid"/>
+        <w:tblW w:type="auto" w:w="0"/>
+        <w:jc w:val="left"/>
+        <w:tblLook w:firstColumn="1" w:firstRow="1" w:lastColumn="0" w:lastRow="0" w:noHBand="0" w:noVBand="1" w:val="04A0"/>
+      </w:tblPr>
+      <w:tblGrid>
+        <w:gridCol w:w="3135"/>
+        <w:gridCol w:w="3135"/>
+        <w:gridCol w:w="3135"/>
+      </w:tblGrid>
+      <w:tr>
+        <w:tc>
+          <w:tcPr>
+            <w:tcW w:type="dxa" w:w="1134"/>
+            <w:shd w:val="clear" w:color="auto" w:fill="1F3564"/>
+          </w:tcPr>
+          <w:p>
+            <w:pPr>
+              <w:jc w:val="center"/>
+            </w:pPr>
+            <w:r>
+              <w:rPr>
+                <w:b/>
+                <w:color w:val="FFFFFF"/>
+                <w:sz w:val="19"/>
+              </w:rPr>
+              <w:t>Gap ID</w:t>
+            </w:r>
+          </w:p>
+        </w:tc>
+        <w:tc>
+          <w:tcPr>
+            <w:tcW w:type="dxa" w:w="4252"/>
+            <w:shd w:val="clear" w:color="auto" w:fill="1F3564"/>
+          </w:tcPr>
+          <w:p>
+            <w:pPr>
+              <w:jc w:val="center"/>
+            </w:pPr>
+            <w:r>
+              <w:rPr>
+                <w:b/>
+                <w:color w:val="FFFFFF"/>
+                <w:sz w:val="19"/>
+              </w:rPr>
+              <w:t>Description</w:t>
+            </w:r>
+          </w:p>
+        </w:tc>
+        <w:tc>
+          <w:tcPr>
+            <w:tcW w:type="dxa" w:w="4535"/>
+            <w:shd w:val="clear" w:color="auto" w:fill="1F3564"/>
+          </w:tcPr>
+          <w:p>
+            <w:pPr>
+              <w:jc w:val="center"/>
+            </w:pPr>
+            <w:r>
+              <w:rPr>
+                <w:b/>
+                <w:color w:val="FFFFFF"/>
+                <w:sz w:val="19"/>
+              </w:rPr>
+              <w:t>Status</w:t>
+            </w:r>
+          </w:p>
+        </w:tc>
+      </w:tr>
+      <w:tr>
+        <w:tc>
+          <w:tcPr>
+            <w:tcW w:type="dxa" w:w="1134"/>
+            <w:shd w:val="clear" w:color="auto" w:fill="F2F2F2"/>
+          </w:tcPr>
+          <w:p>
+            <w:r>
+              <w:rPr>
+                <w:sz w:val="19"/>
+              </w:rPr>
+              <w:t>GAP-009</w:t>
+            </w:r>
+          </w:p>
+        </w:tc>
+        <w:tc>
+          <w:tcPr>
+            <w:tcW w:type="dxa" w:w="4252"/>
+            <w:shd w:val="clear" w:color="auto" w:fill="F2F2F2"/>
+          </w:tcPr>
+          <w:p>
+            <w:r>
+              <w:rPr>
+                <w:sz w:val="19"/>
+              </w:rPr>
+              <w:t>Source Index Contract in §60</w:t>
+            </w:r>
+          </w:p>
+        </w:tc>
+        <w:tc>
+          <w:tcPr>
+            <w:tcW w:type="dxa" w:w="4535"/>
+            <w:shd w:val="clear" w:color="auto" w:fill="F2F2F2"/>
+          </w:tcPr>
+          <w:p>
+            <w:r>
+              <w:rPr>
+                <w:sz w:val="19"/>
+              </w:rPr>
+              <w:t>✅ Closed — §60 now has formal schema + integrity rules</w:t>
+            </w:r>
+          </w:p>
+        </w:tc>
+      </w:tr>
+      <w:tr>
+        <w:tc>
+          <w:tcPr>
+            <w:tcW w:type="dxa" w:w="1134"/>
+            <w:shd w:val="clear" w:color="auto" w:fill="FFFFFF"/>
+          </w:tcPr>
+          <w:p>
+            <w:r>
+              <w:rPr>
+                <w:sz w:val="19"/>
+              </w:rPr>
+              <w:t>GAP-001</w:t>
+            </w:r>
+          </w:p>
+        </w:tc>
+        <w:tc>
+          <w:tcPr>
+            <w:tcW w:type="dxa" w:w="4252"/>
+            <w:shd w:val="clear" w:color="auto" w:fill="FFFFFF"/>
+          </w:tcPr>
+          <w:p>
+            <w:r>
+              <w:rPr>
+                <w:sz w:val="19"/>
+              </w:rPr>
+              <w:t>Baseline-audit report</w:t>
+            </w:r>
+          </w:p>
+        </w:tc>
+        <w:tc>
+          <w:tcPr>
+            <w:tcW w:type="dxa" w:w="4535"/>
+            <w:shd w:val="clear" w:color="auto" w:fill="FFFFFF"/>
+          </w:tcPr>
+          <w:p>
+            <w:r>
+              <w:rPr>
+                <w:sz w:val="19"/>
+              </w:rPr>
+              <w:t>✅ Closed in Phase 1</w:t>
+            </w:r>
+          </w:p>
+        </w:tc>
+      </w:tr>
+      <w:tr>
+        <w:tc>
+          <w:tcPr>
+            <w:tcW w:type="dxa" w:w="1134"/>
+            <w:shd w:val="clear" w:color="auto" w:fill="F2F2F2"/>
+          </w:tcPr>
+          <w:p>
+            <w:r>
+              <w:rPr>
+                <w:sz w:val="19"/>
+              </w:rPr>
+              <w:t>GAP-002</w:t>
+            </w:r>
+          </w:p>
+        </w:tc>
+        <w:tc>
+          <w:tcPr>
+            <w:tcW w:type="dxa" w:w="4252"/>
+            <w:shd w:val="clear" w:color="auto" w:fill="F2F2F2"/>
+          </w:tcPr>
+          <w:p>
+            <w:r>
+              <w:rPr>
+                <w:sz w:val="19"/>
+              </w:rPr>
+              <w:t>Change-diff tool</w:t>
+            </w:r>
+          </w:p>
+        </w:tc>
+        <w:tc>
+          <w:tcPr>
+            <w:tcW w:type="dxa" w:w="4535"/>
+            <w:shd w:val="clear" w:color="auto" w:fill="F2F2F2"/>
+          </w:tcPr>
+          <w:p>
+            <w:r>
+              <w:rPr>
+                <w:sz w:val="19"/>
+              </w:rPr>
+              <w:t>✅ Closed in Phase 1</w:t>
+            </w:r>
+          </w:p>
+        </w:tc>
+      </w:tr>
+      <w:tr>
+        <w:tc>
+          <w:tcPr>
+            <w:tcW w:type="dxa" w:w="1134"/>
+            <w:shd w:val="clear" w:color="auto" w:fill="FFFFFF"/>
+          </w:tcPr>
+          <w:p>
+            <w:r>
+              <w:rPr>
+                <w:sz w:val="19"/>
+              </w:rPr>
+              <w:t>GAP-003</w:t>
+            </w:r>
+          </w:p>
+        </w:tc>
+        <w:tc>
+          <w:tcPr>
+            <w:tcW w:type="dxa" w:w="4252"/>
+            <w:shd w:val="clear" w:color="auto" w:fill="FFFFFF"/>
+          </w:tcPr>
+          <w:p>
+            <w:r>
+              <w:rPr>
+                <w:sz w:val="19"/>
+              </w:rPr>
+              <w:t>Repository health checker</w:t>
+            </w:r>
+          </w:p>
+        </w:tc>
+        <w:tc>
+          <w:tcPr>
+            <w:tcW w:type="dxa" w:w="4535"/>
+            <w:shd w:val="clear" w:color="auto" w:fill="FFFFFF"/>
+          </w:tcPr>
+          <w:p>
+            <w:r>
+              <w:rPr>
+                <w:sz w:val="19"/>
+              </w:rPr>
+              <w:t>✅ Closed in Phase 1</w:t>
+            </w:r>
+          </w:p>
+        </w:tc>
+      </w:tr>
+      <w:tr>
+        <w:tc>
+          <w:tcPr>
+            <w:tcW w:type="dxa" w:w="1134"/>
+            <w:shd w:val="clear" w:color="auto" w:fill="F2F2F2"/>
+          </w:tcPr>
+          <w:p>
+            <w:r>
+              <w:rPr>
+                <w:sz w:val="19"/>
+              </w:rPr>
+              <w:t>GAP-004</w:t>
+            </w:r>
+          </w:p>
+        </w:tc>
+        <w:tc>
+          <w:tcPr>
+            <w:tcW w:type="dxa" w:w="4252"/>
+            <w:shd w:val="clear" w:color="auto" w:fill="F2F2F2"/>
+          </w:tcPr>
+          <w:p>
+            <w:r>
+              <w:rPr>
+                <w:sz w:val="19"/>
+              </w:rPr>
+              <w:t>Release-changelog generator</w:t>
+            </w:r>
+          </w:p>
+        </w:tc>
+        <w:tc>
+          <w:tcPr>
+            <w:tcW w:type="dxa" w:w="4535"/>
+            <w:shd w:val="clear" w:color="auto" w:fill="F2F2F2"/>
+          </w:tcPr>
+          <w:p>
+            <w:r>
+              <w:rPr>
+                <w:sz w:val="19"/>
+              </w:rPr>
+              <w:t>✅ Closed in Phase 1</w:t>
+            </w:r>
+          </w:p>
+        </w:tc>
+      </w:tr>
+      <w:tr>
+        <w:tc>
+          <w:tcPr>
+            <w:tcW w:type="dxa" w:w="1134"/>
+            <w:shd w:val="clear" w:color="auto" w:fill="FFFFFF"/>
+          </w:tcPr>
+          <w:p>
+            <w:r>
+              <w:rPr>
+                <w:sz w:val="19"/>
+              </w:rPr>
+              <w:t>GAP-011</w:t>
+            </w:r>
+          </w:p>
+        </w:tc>
+        <w:tc>
+          <w:tcPr>
+            <w:tcW w:type="dxa" w:w="4252"/>
+            <w:shd w:val="clear" w:color="auto" w:fill="FFFFFF"/>
+          </w:tcPr>
+          <w:p>
+            <w:r>
+              <w:rPr>
+                <w:sz w:val="19"/>
+              </w:rPr>
+              <w:t>Git repository + release tag</w:t>
+            </w:r>
+          </w:p>
+        </w:tc>
+        <w:tc>
+          <w:tcPr>
+            <w:tcW w:type="dxa" w:w="4535"/>
+            <w:shd w:val="clear" w:color="auto" w:fill="FFFFFF"/>
+          </w:tcPr>
+          <w:p>
+            <w:r>
+              <w:rPr>
+                <w:sz w:val="19"/>
+              </w:rPr>
+              <w:t>✅ Closed in Phase 1</w:t>
+            </w:r>
+          </w:p>
+        </w:tc>
+      </w:tr>
+      <w:tr>
+        <w:tc>
+          <w:tcPr>
+            <w:tcW w:type="dxa" w:w="1134"/>
+            <w:shd w:val="clear" w:color="auto" w:fill="F2F2F2"/>
+          </w:tcPr>
+          <w:p>
+            <w:r>
+              <w:rPr>
+                <w:sz w:val="19"/>
+              </w:rPr>
+              <w:t>GAP-012</w:t>
+            </w:r>
+          </w:p>
+        </w:tc>
+        <w:tc>
+          <w:tcPr>
+            <w:tcW w:type="dxa" w:w="4252"/>
+            <w:shd w:val="clear" w:color="auto" w:fill="F2F2F2"/>
+          </w:tcPr>
+          <w:p>
+            <w:r>
+              <w:rPr>
+                <w:sz w:val="19"/>
+              </w:rPr>
+              <w:t>Named approver</w:t>
+            </w:r>
+          </w:p>
+        </w:tc>
+        <w:tc>
+          <w:tcPr>
+            <w:tcW w:type="dxa" w:w="4535"/>
+            <w:shd w:val="clear" w:color="auto" w:fill="F2F2F2"/>
+          </w:tcPr>
+          <w:p>
+            <w:r>
+              <w:rPr>
+                <w:sz w:val="19"/>
+              </w:rPr>
+              <w:t>✅ Closed in Phase 1</w:t>
+            </w:r>
+          </w:p>
+        </w:tc>
+      </w:tr>
+      <w:tr>
+        <w:tc>
+          <w:tcPr>
+            <w:tcW w:type="dxa" w:w="1134"/>
+            <w:shd w:val="clear" w:color="auto" w:fill="FFFFFF"/>
+          </w:tcPr>
+          <w:p>
+            <w:r>
+              <w:rPr>
+                <w:sz w:val="19"/>
+              </w:rPr>
+              <w:t>GAP-005</w:t>
+            </w:r>
+          </w:p>
+        </w:tc>
+        <w:tc>
+          <w:tcPr>
+            <w:tcW w:type="dxa" w:w="4252"/>
+            <w:shd w:val="clear" w:color="auto" w:fill="FFFFFF"/>
+          </w:tcPr>
+          <w:p>
+            <w:r>
+              <w:rPr>
+                <w:sz w:val="19"/>
+              </w:rPr>
+              <w:t>V-001–V-010 runnable checks</w:t>
+            </w:r>
+          </w:p>
+        </w:tc>
+        <w:tc>
+          <w:tcPr>
+            <w:tcW w:type="dxa" w:w="4535"/>
+            <w:shd w:val="clear" w:color="auto" w:fill="FFFFFF"/>
+          </w:tcPr>
+          <w:p>
+            <w:r>
+              <w:rPr>
+                <w:sz w:val="19"/>
+              </w:rPr>
+              <w:t>⏳ Phase 4</w:t>
+            </w:r>
+          </w:p>
+        </w:tc>
+      </w:tr>
+      <w:tr>
+        <w:tc>
+          <w:tcPr>
+            <w:tcW w:type="dxa" w:w="1134"/>
+            <w:shd w:val="clear" w:color="auto" w:fill="F2F2F2"/>
+          </w:tcPr>
+          <w:p>
+            <w:r>
+              <w:rPr>
+                <w:sz w:val="19"/>
+              </w:rPr>
+              <w:t>GAP-006</w:t>
+            </w:r>
+          </w:p>
+        </w:tc>
+        <w:tc>
+          <w:tcPr>
+            <w:tcW w:type="dxa" w:w="4252"/>
+            <w:shd w:val="clear" w:color="auto" w:fill="F2F2F2"/>
+          </w:tcPr>
+          <w:p>
+            <w:r>
+              <w:rPr>
+                <w:sz w:val="19"/>
+              </w:rPr>
+              <w:t>T-001–T-010 test fixture files</w:t>
+            </w:r>
+          </w:p>
+        </w:tc>
+        <w:tc>
+          <w:tcPr>
+            <w:tcW w:type="dxa" w:w="4535"/>
+            <w:shd w:val="clear" w:color="auto" w:fill="F2F2F2"/>
+          </w:tcPr>
+          <w:p>
+            <w:r>
+              <w:rPr>
+                <w:sz w:val="19"/>
+              </w:rPr>
+              <w:t>⏳ Phase 4</w:t>
+            </w:r>
+          </w:p>
+        </w:tc>
+      </w:tr>
+      <w:tr>
+        <w:tc>
+          <w:tcPr>
+            <w:tcW w:type="dxa" w:w="1134"/>
+            <w:shd w:val="clear" w:color="auto" w:fill="FFFFFF"/>
+          </w:tcPr>
+          <w:p>
+            <w:r>
+              <w:rPr>
+                <w:sz w:val="19"/>
+              </w:rPr>
+              <w:t>GAP-007</w:t>
+            </w:r>
+          </w:p>
+        </w:tc>
+        <w:tc>
+          <w:tcPr>
+            <w:tcW w:type="dxa" w:w="4252"/>
+            <w:shd w:val="clear" w:color="auto" w:fill="FFFFFF"/>
+          </w:tcPr>
+          <w:p>
+            <w:r>
+              <w:rPr>
+                <w:sz w:val="19"/>
+              </w:rPr>
+              <w:t>Test runner (verify.js)</w:t>
+            </w:r>
+          </w:p>
+        </w:tc>
+        <w:tc>
+          <w:tcPr>
+            <w:tcW w:type="dxa" w:w="4535"/>
+            <w:shd w:val="clear" w:color="auto" w:fill="FFFFFF"/>
+          </w:tcPr>
+          <w:p>
+            <w:r>
+              <w:rPr>
+                <w:sz w:val="19"/>
+              </w:rPr>
+              <w:t>⏳ Phase 4</w:t>
+            </w:r>
+          </w:p>
+        </w:tc>
+      </w:tr>
+      <w:tr>
+        <w:tc>
+          <w:tcPr>
+            <w:tcW w:type="dxa" w:w="1134"/>
+            <w:shd w:val="clear" w:color="auto" w:fill="F2F2F2"/>
+          </w:tcPr>
+          <w:p>
+            <w:r>
+              <w:rPr>
+                <w:sz w:val="19"/>
+              </w:rPr>
+              <w:t>GAP-008</w:t>
+            </w:r>
+          </w:p>
+        </w:tc>
+        <w:tc>
+          <w:tcPr>
+            <w:tcW w:type="dxa" w:w="4252"/>
+            <w:shd w:val="clear" w:color="auto" w:fill="F2F2F2"/>
+          </w:tcPr>
+          <w:p>
+            <w:r>
+              <w:rPr>
+                <w:sz w:val="19"/>
+              </w:rPr>
+              <w:t>JSON Schema for §46</w:t>
+            </w:r>
+          </w:p>
+        </w:tc>
+        <w:tc>
+          <w:tcPr>
+            <w:tcW w:type="dxa" w:w="4535"/>
+            <w:shd w:val="clear" w:color="auto" w:fill="F2F2F2"/>
+          </w:tcPr>
+          <w:p>
+            <w:r>
+              <w:rPr>
+                <w:sz w:val="19"/>
+              </w:rPr>
+              <w:t>⏳ Phase 4</w:t>
+            </w:r>
+          </w:p>
+        </w:tc>
+      </w:tr>
+      <w:tr>
+        <w:tc>
+          <w:tcPr>
+            <w:tcW w:type="dxa" w:w="1134"/>
+            <w:shd w:val="clear" w:color="auto" w:fill="FFFFFF"/>
+          </w:tcPr>
+          <w:p>
+            <w:r>
+              <w:rPr>
+                <w:sz w:val="19"/>
+              </w:rPr>
+              <w:t>GAP-010</w:t>
+            </w:r>
+          </w:p>
+        </w:tc>
+        <w:tc>
+          <w:tcPr>
+            <w:tcW w:type="dxa" w:w="4252"/>
+            <w:shd w:val="clear" w:color="auto" w:fill="FFFFFF"/>
+          </w:tcPr>
+          <w:p>
+            <w:r>
+              <w:rPr>
+                <w:sz w:val="19"/>
+              </w:rPr>
+              <w:t>tier_override field in §41/§61</w:t>
+            </w:r>
+          </w:p>
+        </w:tc>
+        <w:tc>
+          <w:tcPr>
+            <w:tcW w:type="dxa" w:w="4535"/>
+            <w:shd w:val="clear" w:color="auto" w:fill="FFFFFF"/>
+          </w:tcPr>
+          <w:p>
+            <w:r>
+              <w:rPr>
+                <w:sz w:val="19"/>
+              </w:rPr>
+              <w:t>⏳ Phase 3 — next</w:t>
+            </w:r>
+          </w:p>
+        </w:tc>
+      </w:tr>
+      <w:tr>
+        <w:tc>
+          <w:tcPr>
+            <w:tcW w:type="dxa" w:w="1134"/>
+            <w:shd w:val="clear" w:color="auto" w:fill="F2F2F2"/>
+          </w:tcPr>
+          <w:p>
+            <w:r>
+              <w:rPr>
+                <w:sz w:val="19"/>
+              </w:rPr>
+              <w:t>GAP-013</w:t>
+            </w:r>
+          </w:p>
+        </w:tc>
+        <w:tc>
+          <w:tcPr>
+            <w:tcW w:type="dxa" w:w="4252"/>
+            <w:shd w:val="clear" w:color="auto" w:fill="F2F2F2"/>
+          </w:tcPr>
+          <w:p>
+            <w:r>
+              <w:rPr>
+                <w:sz w:val="19"/>
+              </w:rPr>
+              <w:t>CI pipeline</w:t>
+            </w:r>
+          </w:p>
+        </w:tc>
+        <w:tc>
+          <w:tcPr>
+            <w:tcW w:type="dxa" w:w="4535"/>
+            <w:shd w:val="clear" w:color="auto" w:fill="F2F2F2"/>
+          </w:tcPr>
+          <w:p>
+            <w:r>
+              <w:rPr>
+                <w:sz w:val="19"/>
+              </w:rPr>
+              <w:t>⏳ Phase 5</w:t>
+            </w:r>
+          </w:p>
+        </w:tc>
+      </w:tr>
+      <w:tr>
+        <w:tc>
+          <w:tcPr>
+            <w:tcW w:type="dxa" w:w="1134"/>
+            <w:shd w:val="clear" w:color="auto" w:fill="FFFFFF"/>
+          </w:tcPr>
+          <w:p>
+            <w:r>
+              <w:rPr>
+                <w:sz w:val="19"/>
+              </w:rPr>
+              <w:t>GAP-014</w:t>
+            </w:r>
+          </w:p>
+        </w:tc>
+        <w:tc>
+          <w:tcPr>
+            <w:tcW w:type="dxa" w:w="4252"/>
+            <w:shd w:val="clear" w:color="auto" w:fill="FFFFFF"/>
+          </w:tcPr>
+          <w:p>
+            <w:r>
+              <w:rPr>
+                <w:sz w:val="19"/>
+              </w:rPr>
+              <w:t>Runtime monitoring/metrics</w:t>
+            </w:r>
+          </w:p>
+        </w:tc>
+        <w:tc>
+          <w:tcPr>
+            <w:tcW w:type="dxa" w:w="4535"/>
+            <w:shd w:val="clear" w:color="auto" w:fill="FFFFFF"/>
+          </w:tcPr>
+          <w:p>
+            <w:r>
+              <w:rPr>
+                <w:sz w:val="19"/>
+              </w:rPr>
+              <w:t>⏳ Phase 5</w:t>
+            </w:r>
+          </w:p>
+        </w:tc>
+      </w:tr>
+    </w:tbl>
+    <w:p/>
+    <w:p>
+      <w:r>
+        <w:br w:type="page"/>
+      </w:r>
+    </w:p>
+    <w:p>
+      <w:pPr>
+        <w:pStyle w:val="Heading2"/>
+        <w:spacing w:before="360" w:after="160"/>
+      </w:pPr>
+      <w:r>
+        <w:rPr>
+          <w:b/>
+          <w:color w:val="1F3564"/>
+          <w:sz w:val="30"/>
+        </w:rPr>
+        <w:t>Updated Maturity Scorecard After Phase 2</w:t>
+      </w:r>
+    </w:p>
+    <w:tbl>
+      <w:tblPr>
+        <w:tblStyle w:val="TableGrid"/>
+        <w:tblW w:type="auto" w:w="0"/>
+        <w:tblLook w:firstColumn="1" w:firstRow="1" w:lastColumn="0" w:lastRow="0" w:noHBand="0" w:noVBand="1" w:val="04A0"/>
+      </w:tblPr>
+      <w:tblGrid>
+        <w:gridCol w:w="3135"/>
+        <w:gridCol w:w="3135"/>
+        <w:gridCol w:w="3135"/>
+      </w:tblGrid>
+      <w:tr>
+        <w:tc>
+          <w:tcPr>
+            <w:tcW w:type="dxa" w:w="3969"/>
+            <w:shd w:val="clear" w:color="auto" w:fill="1F3564"/>
+          </w:tcPr>
+          <w:p>
+            <w:r>
+              <w:rPr>
+                <w:b/>
+                <w:color w:val="FFFFFF"/>
+                <w:sz w:val="19"/>
+              </w:rPr>
+              <w:t>Area</w:t>
+            </w:r>
+          </w:p>
+        </w:tc>
+        <w:tc>
+          <w:tcPr>
+            <w:tcW w:type="dxa" w:w="1701"/>
+            <w:shd w:val="clear" w:color="auto" w:fill="1F3564"/>
+          </w:tcPr>
+          <w:p>
+            <w:r>
+              <w:rPr>
+                <w:b/>
+                <w:color w:val="FFFFFF"/>
+                <w:sz w:val="19"/>
+              </w:rPr>
+              <w:t>Rating After Phase 2</w:t>
+            </w:r>
+          </w:p>
+        </w:tc>
+        <w:tc>
+          <w:tcPr>
+            <w:tcW w:type="dxa" w:w="4252"/>
+            <w:shd w:val="clear" w:color="auto" w:fill="1F3564"/>
+          </w:tcPr>
+          <w:p>
+            <w:r>
+              <w:rPr>
+                <w:b/>
+                <w:color w:val="FFFFFF"/>
+                <w:sz w:val="19"/>
+              </w:rPr>
+              <w:t>Change</w:t>
+            </w:r>
+          </w:p>
+        </w:tc>
+      </w:tr>
+      <w:tr>
+        <w:tc>
+          <w:tcPr>
+            <w:tcW w:type="dxa" w:w="3969"/>
+            <w:shd w:val="clear" w:color="auto" w:fill="F2F2F2"/>
+          </w:tcPr>
+          <w:p>
+            <w:r>
+              <w:rPr>
+                <w:sz w:val="19"/>
+              </w:rPr>
+              <w:t>Core PRD → Architecture design</w:t>
+            </w:r>
+          </w:p>
+        </w:tc>
+        <w:tc>
+          <w:tcPr>
+            <w:tcW w:type="dxa" w:w="1701"/>
+            <w:shd w:val="clear" w:color="auto" w:fill="FFFFFF"/>
+          </w:tcPr>
+          <w:p>
+            <w:pPr>
+              <w:jc w:val="center"/>
+            </w:pPr>
+            <w:r>
+              <w:rPr>
+                <w:b/>
+                <w:color w:val="1E8B4C"/>
+                <w:sz w:val="19"/>
+              </w:rPr>
+              <w:t>9.2 / 10</w:t>
+            </w:r>
+          </w:p>
+        </w:tc>
+        <w:tc>
+          <w:tcPr>
+            <w:tcW w:type="dxa" w:w="4252"/>
+            <w:shd w:val="clear" w:color="auto" w:fill="FFFFFF"/>
+          </w:tcPr>
+          <w:p>
+            <w:r>
+              <w:rPr>
+                <w:color w:val="555555"/>
+                <w:sz w:val="18"/>
+              </w:rPr>
+              <w:t>Unchanged — already strong</w:t>
+            </w:r>
+          </w:p>
+        </w:tc>
+      </w:tr>
+      <w:tr>
+        <w:tc>
+          <w:tcPr>
+            <w:tcW w:type="dxa" w:w="3969"/>
+            <w:shd w:val="clear" w:color="auto" w:fill="FFFFFF"/>
+          </w:tcPr>
+          <w:p>
+            <w:r>
+              <w:rPr>
+                <w:sz w:val="19"/>
+              </w:rPr>
+              <w:t>PRD traceability and blocker control</w:t>
+            </w:r>
+          </w:p>
+        </w:tc>
+        <w:tc>
+          <w:tcPr>
+            <w:tcW w:type="dxa" w:w="1701"/>
+            <w:shd w:val="clear" w:color="auto" w:fill="FFFFFF"/>
+          </w:tcPr>
+          <w:p>
+            <w:pPr>
+              <w:jc w:val="center"/>
+            </w:pPr>
+            <w:r>
+              <w:rPr>
+                <w:b/>
+                <w:color w:val="1E8B4C"/>
+                <w:sz w:val="19"/>
+              </w:rPr>
+              <w:t>9.5 / 10</w:t>
+            </w:r>
+          </w:p>
+        </w:tc>
+        <w:tc>
+          <w:tcPr>
+            <w:tcW w:type="dxa" w:w="4252"/>
+            <w:shd w:val="clear" w:color="auto" w:fill="FFFFFF"/>
+          </w:tcPr>
+          <w:p>
+            <w:r>
+              <w:rPr>
+                <w:color w:val="555555"/>
+                <w:sz w:val="18"/>
+              </w:rPr>
+              <w:t>Unchanged — already strong</w:t>
+            </w:r>
+          </w:p>
+        </w:tc>
+      </w:tr>
+      <w:tr>
+        <w:tc>
+          <w:tcPr>
+            <w:tcW w:type="dxa" w:w="3969"/>
+            <w:shd w:val="clear" w:color="auto" w:fill="F2F2F2"/>
+          </w:tcPr>
+          <w:p>
+            <w:r>
+              <w:rPr>
+                <w:sz w:val="19"/>
+              </w:rPr>
+              <w:t>Enterprise governance specification</w:t>
+            </w:r>
+          </w:p>
+        </w:tc>
+        <w:tc>
+          <w:tcPr>
+            <w:tcW w:type="dxa" w:w="1701"/>
+            <w:shd w:val="clear" w:color="auto" w:fill="FFFFFF"/>
+          </w:tcPr>
+          <w:p>
+            <w:pPr>
+              <w:jc w:val="center"/>
+            </w:pPr>
+            <w:r>
+              <w:rPr>
+                <w:b/>
+                <w:color w:val="1E8B4C"/>
+                <w:sz w:val="19"/>
+              </w:rPr>
+              <w:t>8.8 / 10</w:t>
+            </w:r>
+          </w:p>
+        </w:tc>
+        <w:tc>
+          <w:tcPr>
+            <w:tcW w:type="dxa" w:w="4252"/>
+            <w:shd w:val="clear" w:color="auto" w:fill="FFFFFF"/>
+          </w:tcPr>
+          <w:p>
+            <w:r>
+              <w:rPr>
+                <w:color w:val="555555"/>
+                <w:sz w:val="18"/>
+              </w:rPr>
+              <w:t>Unchanged</w:t>
+            </w:r>
+          </w:p>
+        </w:tc>
+      </w:tr>
+      <w:tr>
+        <w:tc>
+          <w:tcPr>
+            <w:tcW w:type="dxa" w:w="3969"/>
+            <w:shd w:val="clear" w:color="auto" w:fill="FFFFFF"/>
+          </w:tcPr>
+          <w:p>
+            <w:r>
+              <w:rPr>
+                <w:sz w:val="19"/>
+              </w:rPr>
+              <w:t>Context/token optimisation</w:t>
+            </w:r>
+          </w:p>
+        </w:tc>
+        <w:tc>
+          <w:tcPr>
+            <w:tcW w:type="dxa" w:w="1701"/>
+            <w:shd w:val="clear" w:color="auto" w:fill="FFFFFF"/>
+          </w:tcPr>
+          <w:p>
+            <w:pPr>
+              <w:jc w:val="center"/>
+            </w:pPr>
+            <w:r>
+              <w:rPr>
+                <w:b/>
+                <w:color w:val="1E8B4C"/>
+                <w:sz w:val="19"/>
+              </w:rPr>
+              <w:t>8.0 / 10</w:t>
+            </w:r>
+          </w:p>
+        </w:tc>
+        <w:tc>
+          <w:tcPr>
+            <w:tcW w:type="dxa" w:w="4252"/>
+            <w:shd w:val="clear" w:color="auto" w:fill="FFFFFF"/>
+          </w:tcPr>
+          <w:p>
+            <w:r>
+              <w:rPr>
+                <w:color w:val="1E8B4C"/>
+                <w:sz w:val="18"/>
+              </w:rPr>
+              <w:t>↑ from 7.0 — Source Index Contract + tooling implemented</w:t>
+            </w:r>
+          </w:p>
+        </w:tc>
+      </w:tr>
+      <w:tr>
+        <w:tc>
+          <w:tcPr>
+            <w:tcW w:type="dxa" w:w="3969"/>
+            <w:shd w:val="clear" w:color="auto" w:fill="F2F2F2"/>
+          </w:tcPr>
+          <w:p>
+            <w:r>
+              <w:rPr>
+                <w:sz w:val="19"/>
+              </w:rPr>
+              <w:t>Tier-routing approach</w:t>
+            </w:r>
+          </w:p>
+        </w:tc>
+        <w:tc>
+          <w:tcPr>
+            <w:tcW w:type="dxa" w:w="1701"/>
+            <w:shd w:val="clear" w:color="auto" w:fill="FFFFFF"/>
+          </w:tcPr>
+          <w:p>
+            <w:pPr>
+              <w:jc w:val="center"/>
+            </w:pPr>
+            <w:r>
+              <w:rPr>
+                <w:b/>
+                <w:color w:val="1E8B4C"/>
+                <w:sz w:val="19"/>
+              </w:rPr>
+              <w:t>8.0 / 10</w:t>
+            </w:r>
+          </w:p>
+        </w:tc>
+        <w:tc>
+          <w:tcPr>
+            <w:tcW w:type="dxa" w:w="4252"/>
+            <w:shd w:val="clear" w:color="auto" w:fill="FFFFFF"/>
+          </w:tcPr>
+          <w:p>
+            <w:r>
+              <w:rPr>
+                <w:color w:val="555555"/>
+                <w:sz w:val="18"/>
+              </w:rPr>
+              <w:t>Unchanged — Phase 3 will close remaining gap</w:t>
+            </w:r>
+          </w:p>
+        </w:tc>
+      </w:tr>
+      <w:tr>
+        <w:tc>
+          <w:tcPr>
+            <w:tcW w:type="dxa" w:w="3969"/>
+            <w:shd w:val="clear" w:color="auto" w:fill="FFFFFF"/>
+          </w:tcPr>
+          <w:p>
+            <w:r>
+              <w:rPr>
+                <w:sz w:val="19"/>
+              </w:rPr>
+              <w:t>Automated verification</w:t>
+            </w:r>
+          </w:p>
+        </w:tc>
+        <w:tc>
+          <w:tcPr>
+            <w:tcW w:type="dxa" w:w="1701"/>
+            <w:shd w:val="clear" w:color="auto" w:fill="FFFFFF"/>
+          </w:tcPr>
+          <w:p>
+            <w:pPr>
+              <w:jc w:val="center"/>
+            </w:pPr>
+            <w:r>
+              <w:rPr>
+                <w:b/>
+                <w:color w:val="C0392B"/>
+                <w:sz w:val="19"/>
+              </w:rPr>
+              <w:t>3.0 / 10</w:t>
+            </w:r>
+          </w:p>
+        </w:tc>
+        <w:tc>
+          <w:tcPr>
+            <w:tcW w:type="dxa" w:w="4252"/>
+            <w:shd w:val="clear" w:color="auto" w:fill="FFFFFF"/>
+          </w:tcPr>
+          <w:p>
+            <w:r>
+              <w:rPr>
+                <w:color w:val="555555"/>
+                <w:sz w:val="18"/>
+              </w:rPr>
+              <w:t>Unchanged — Phase 4 work</w:t>
+            </w:r>
+          </w:p>
+        </w:tc>
+      </w:tr>
+      <w:tr>
+        <w:tc>
+          <w:tcPr>
+            <w:tcW w:type="dxa" w:w="3969"/>
+            <w:shd w:val="clear" w:color="auto" w:fill="F2F2F2"/>
+          </w:tcPr>
+          <w:p>
+            <w:r>
+              <w:rPr>
+                <w:sz w:val="19"/>
+              </w:rPr>
+              <w:t>Test/regression automation</w:t>
+            </w:r>
+          </w:p>
+        </w:tc>
+        <w:tc>
+          <w:tcPr>
+            <w:tcW w:type="dxa" w:w="1701"/>
+            <w:shd w:val="clear" w:color="auto" w:fill="FFFFFF"/>
+          </w:tcPr>
+          <w:p>
+            <w:pPr>
+              <w:jc w:val="center"/>
+            </w:pPr>
+            <w:r>
+              <w:rPr>
+                <w:b/>
+                <w:color w:val="C0392B"/>
+                <w:sz w:val="19"/>
+              </w:rPr>
+              <w:t>2.5 / 10</w:t>
+            </w:r>
+          </w:p>
+        </w:tc>
+        <w:tc>
+          <w:tcPr>
+            <w:tcW w:type="dxa" w:w="4252"/>
+            <w:shd w:val="clear" w:color="auto" w:fill="FFFFFF"/>
+          </w:tcPr>
+          <w:p>
+            <w:r>
+              <w:rPr>
+                <w:color w:val="555555"/>
+                <w:sz w:val="18"/>
+              </w:rPr>
+              <w:t>Unchanged — Phase 4 work</w:t>
+            </w:r>
+          </w:p>
+        </w:tc>
+      </w:tr>
+      <w:tr>
+        <w:tc>
+          <w:tcPr>
+            <w:tcW w:type="dxa" w:w="3969"/>
+            <w:shd w:val="clear" w:color="auto" w:fill="FFFFFF"/>
+          </w:tcPr>
+          <w:p>
+            <w:r>
+              <w:rPr>
+                <w:sz w:val="19"/>
+              </w:rPr>
+              <w:t>Operational release readiness</w:t>
+            </w:r>
+          </w:p>
+        </w:tc>
+        <w:tc>
+          <w:tcPr>
+            <w:tcW w:type="dxa" w:w="1701"/>
+            <w:shd w:val="clear" w:color="auto" w:fill="FFFFFF"/>
+          </w:tcPr>
+          <w:p>
+            <w:pPr>
+              <w:jc w:val="center"/>
+            </w:pPr>
+            <w:r>
+              <w:rPr>
+                <w:b/>
+                <w:color w:val="C0392B"/>
+                <w:sz w:val="19"/>
+              </w:rPr>
+              <w:t>4.0 / 10</w:t>
+            </w:r>
+          </w:p>
+        </w:tc>
+        <w:tc>
+          <w:tcPr>
+            <w:tcW w:type="dxa" w:w="4252"/>
+            <w:shd w:val="clear" w:color="auto" w:fill="FFFFFF"/>
+          </w:tcPr>
+          <w:p>
+            <w:r>
+              <w:rPr>
+                <w:color w:val="555555"/>
+                <w:sz w:val="18"/>
+              </w:rPr>
+              <w:t>Unchanged — Phase 5 work</w:t>
+            </w:r>
+          </w:p>
+        </w:tc>
+      </w:tr>
+    </w:tbl>
+    <w:p/>
+    <w:p>
+      <w:pPr>
+        <w:spacing w:after="80" w:before="40"/>
+      </w:pPr>
+      <w:r>
+        <w:rPr>
+          <w:b w:val="0"/>
+          <w:i/>
+          <w:color w:val="2763AB"/>
+          <w:sz w:val="21"/>
+        </w:rPr>
+        <w:t>Phase 2 lifted context/token optimisation from 7.0 to 8.0 by implementing the Source Index Contract, PRD indexer, and stale-source detector. The next jump will come from Phase 4 (verify.js + test fixtures).</w:t>
+      </w:r>
+    </w:p>
     <w:p/>
     <w:p>
       <w:pPr>
@@ -8436,7 +12282,7 @@
           <w:color w:val="888888"/>
           <w:sz w:val="17"/>
         </w:rPr>
-        <w:t>Architecture Skill v1.1.0  |  Phase 1 Complete  |  Approved: Sushma S — 2026-09-02  |  github.com/Sushma-celestail/SKILL  tag: v1.1.0</w:t>
+        <w:t>Architecture Skill v1.2.0  |  Phase 1 &amp; 2 Complete  |  Approved: Sushma S — 2026-09-02  |  github.com/Sushma-celestail/SKILL  tag: v1.2.0</w:t>
       </w:r>
     </w:p>
     <w:sectPr>

</xml_diff>

<commit_message>
feat: Phase 3 - deterministic tier routing (v1.3.0)
- SKILL.md §§41,59,61: tier_override fields, routing evidence, override validation
- phase3/tier-routing.js: deterministic Tier 1/2/3 selector from PRD index
- phase3/run-tier-routing-tests.js: fixture runner with JSON + Markdown reports
- phase3/fixtures/: 7 routing fixtures (TR-001 to TR-007)
- phase3/reports/: tier-routing-test-report 7/7 PASS, service-desk Tier 3 live record
- governance/health-check.js: extended to 32 checks (adds Phase 3 section checks)
- references/enterprise-capability-roadmap.md: Phase 3 completed section added
- me.docx: Phase 3 section appended

Closes: GAP-010 (tier_override field)
</commit_message>
<xml_diff>
--- a/me.docx
+++ b/me.docx
@@ -12283,6 +12283,836 @@
           <w:sz w:val="17"/>
         </w:rPr>
         <w:t>Architecture Skill v1.2.0  |  Phase 1 &amp; 2 Complete  |  Approved: Sushma S — 2026-09-02  |  github.com/Sushma-celestail/SKILL  tag: v1.2.0</w:t>
+      </w:r>
+    </w:p>
+    <w:p>
+      <w:r>
+        <w:br w:type="page"/>
+      </w:r>
+    </w:p>
+    <w:p>
+      <w:pPr>
+        <w:pStyle w:val="Heading1"/>
+        <w:spacing w:before="280" w:after="120"/>
+      </w:pPr>
+      <w:r>
+        <w:rPr>
+          <w:b/>
+          <w:color w:val="1A5E8A"/>
+          <w:sz w:val="32"/>
+        </w:rPr>
+        <w:t>Phase 3 — Deterministic Tier Routing</w:t>
+      </w:r>
+    </w:p>
+    <w:p>
+      <w:pPr>
+        <w:spacing w:after="120"/>
+      </w:pPr>
+      <w:r>
+        <w:rPr>
+          <w:b/>
+        </w:rPr>
+        <w:t>Status:</w:t>
+      </w:r>
+      <w:r>
+        <w:t xml:space="preserve"> Implemented and verified in skill version v1.3.0.</w:t>
+      </w:r>
+    </w:p>
+    <w:p>
+      <w:pPr>
+        <w:spacing w:after="120"/>
+      </w:pPr>
+      <w:r>
+        <w:t>Phase 3 turns the existing Tier 1 / Tier 2 / Tier 3 guidance into a repeatable decision with recorded evidence. The routing tool selects an initial tier from the Phase 2 requirement index and PRD-grounded signals. A different final tier is permitted only through a validated, evidence-backed override.</w:t>
+      </w:r>
+    </w:p>
+    <w:p>
+      <w:pPr>
+        <w:pStyle w:val="Heading2"/>
+        <w:spacing w:before="180" w:after="120"/>
+      </w:pPr>
+      <w:r>
+        <w:rPr>
+          <w:b/>
+          <w:color w:val="0B2545"/>
+          <w:sz w:val="26"/>
+        </w:rPr>
+        <w:t>What Was Implemented</w:t>
+      </w:r>
+    </w:p>
+    <w:tbl>
+      <w:tblPr>
+        <w:tblStyle w:val="TableGrid"/>
+        <w:tblW w:type="auto" w:w="0"/>
+        <w:tblLayout w:type="fixed"/>
+        <w:tblLook w:firstColumn="1" w:firstRow="1" w:lastColumn="0" w:lastRow="0" w:noHBand="0" w:noVBand="1" w:val="04A0"/>
+      </w:tblPr>
+      <w:tblGrid>
+        <w:gridCol w:w="3135"/>
+        <w:gridCol w:w="3135"/>
+        <w:gridCol w:w="3135"/>
+      </w:tblGrid>
+      <w:tr>
+        <w:trPr>
+          <w:tblHeader w:val="true"/>
+        </w:trPr>
+        <w:tc>
+          <w:tcPr>
+            <w:tcW w:type="dxa" w:w="2381"/>
+            <w:vAlign w:val="center"/>
+            <w:shd w:fill="0B2545"/>
+          </w:tcPr>
+          <w:p>
+            <w:r>
+              <w:rPr>
+                <w:b/>
+                <w:color w:val="FFFFFF"/>
+                <w:sz w:val="18"/>
+              </w:rPr>
+              <w:t>Deliverable</w:t>
+            </w:r>
+          </w:p>
+        </w:tc>
+        <w:tc>
+          <w:tcPr>
+            <w:tcW w:type="dxa" w:w="4535"/>
+            <w:vAlign w:val="center"/>
+            <w:shd w:fill="0B2545"/>
+          </w:tcPr>
+          <w:p>
+            <w:r>
+              <w:rPr>
+                <w:b/>
+                <w:color w:val="FFFFFF"/>
+                <w:sz w:val="18"/>
+              </w:rPr>
+              <w:t>Purpose</w:t>
+            </w:r>
+          </w:p>
+        </w:tc>
+        <w:tc>
+          <w:tcPr>
+            <w:tcW w:type="dxa" w:w="3005"/>
+            <w:vAlign w:val="center"/>
+            <w:shd w:fill="0B2545"/>
+          </w:tcPr>
+          <w:p>
+            <w:r>
+              <w:rPr>
+                <w:b/>
+                <w:color w:val="FFFFFF"/>
+                <w:sz w:val="18"/>
+              </w:rPr>
+              <w:t>Evidence</w:t>
+            </w:r>
+          </w:p>
+        </w:tc>
+      </w:tr>
+      <w:tr>
+        <w:tc>
+          <w:tcPr>
+            <w:tcW w:type="dxa" w:w="2381"/>
+            <w:vAlign w:val="top"/>
+            <w:shd w:fill="F2F4F7"/>
+          </w:tcPr>
+          <w:p>
+            <w:r>
+              <w:rPr>
+                <w:sz w:val="18"/>
+              </w:rPr>
+              <w:t>phase3/tier-routing.js</w:t>
+            </w:r>
+          </w:p>
+        </w:tc>
+        <w:tc>
+          <w:tcPr>
+            <w:tcW w:type="dxa" w:w="4535"/>
+            <w:vAlign w:val="top"/>
+            <w:shd w:fill="F2F4F7"/>
+          </w:tcPr>
+          <w:p>
+            <w:r>
+              <w:rPr>
+                <w:sz w:val="18"/>
+              </w:rPr>
+              <w:t>Selects Tier 1, 2, or 3 from requirement volume, modules, migration, integrations, access, lifecycle, reporting, and deployment signals.</w:t>
+            </w:r>
+          </w:p>
+        </w:tc>
+        <w:tc>
+          <w:tcPr>
+            <w:tcW w:type="dxa" w:w="3005"/>
+            <w:vAlign w:val="top"/>
+            <w:shd w:fill="F2F4F7"/>
+          </w:tcPr>
+          <w:p>
+            <w:r>
+              <w:rPr>
+                <w:sz w:val="18"/>
+              </w:rPr>
+              <w:t>Creates a machine-readable tier-routing record.</w:t>
+            </w:r>
+          </w:p>
+        </w:tc>
+      </w:tr>
+      <w:tr>
+        <w:tc>
+          <w:tcPr>
+            <w:tcW w:type="dxa" w:w="2381"/>
+            <w:vAlign w:val="top"/>
+          </w:tcPr>
+          <w:p>
+            <w:r>
+              <w:rPr>
+                <w:sz w:val="18"/>
+              </w:rPr>
+              <w:t>Validated override record</w:t>
+            </w:r>
+          </w:p>
+        </w:tc>
+        <w:tc>
+          <w:tcPr>
+            <w:tcW w:type="dxa" w:w="4535"/>
+            <w:vAlign w:val="top"/>
+          </w:tcPr>
+          <w:p>
+            <w:r>
+              <w:rPr>
+                <w:sz w:val="18"/>
+              </w:rPr>
+              <w:t>Allows expert judgment only when the selected tier differs from the initial tier for a material architectural reason.</w:t>
+            </w:r>
+          </w:p>
+        </w:tc>
+        <w:tc>
+          <w:tcPr>
+            <w:tcW w:type="dxa" w:w="3005"/>
+            <w:vAlign w:val="top"/>
+          </w:tcPr>
+          <w:p>
+            <w:r>
+              <w:rPr>
+                <w:sz w:val="18"/>
+              </w:rPr>
+              <w:t>Requires reason, PRD evidence, and an approver where required.</w:t>
+            </w:r>
+          </w:p>
+        </w:tc>
+      </w:tr>
+      <w:tr>
+        <w:tc>
+          <w:tcPr>
+            <w:tcW w:type="dxa" w:w="2381"/>
+            <w:vAlign w:val="top"/>
+            <w:shd w:fill="F2F4F7"/>
+          </w:tcPr>
+          <w:p>
+            <w:r>
+              <w:rPr>
+                <w:sz w:val="18"/>
+              </w:rPr>
+              <w:t>7 routing fixtures</w:t>
+            </w:r>
+          </w:p>
+        </w:tc>
+        <w:tc>
+          <w:tcPr>
+            <w:tcW w:type="dxa" w:w="4535"/>
+            <w:vAlign w:val="top"/>
+            <w:shd w:fill="F2F4F7"/>
+          </w:tcPr>
+          <w:p>
+            <w:r>
+              <w:rPr>
+                <w:sz w:val="18"/>
+              </w:rPr>
+              <w:t>Covers small module, standard application, material-module boundary, requirement volume, migration/integrations, access/lifecycle, and override cases.</w:t>
+            </w:r>
+          </w:p>
+        </w:tc>
+        <w:tc>
+          <w:tcPr>
+            <w:tcW w:type="dxa" w:w="3005"/>
+            <w:vAlign w:val="top"/>
+            <w:shd w:fill="F2F4F7"/>
+          </w:tcPr>
+          <w:p>
+            <w:r>
+              <w:rPr>
+                <w:sz w:val="18"/>
+              </w:rPr>
+              <w:t>7 of 7 fixtures passed.</w:t>
+            </w:r>
+          </w:p>
+        </w:tc>
+      </w:tr>
+      <w:tr>
+        <w:tc>
+          <w:tcPr>
+            <w:tcW w:type="dxa" w:w="2381"/>
+            <w:vAlign w:val="top"/>
+          </w:tcPr>
+          <w:p>
+            <w:r>
+              <w:rPr>
+                <w:sz w:val="18"/>
+              </w:rPr>
+              <w:t>Routing test runner</w:t>
+            </w:r>
+          </w:p>
+        </w:tc>
+        <w:tc>
+          <w:tcPr>
+            <w:tcW w:type="dxa" w:w="4535"/>
+            <w:vAlign w:val="top"/>
+          </w:tcPr>
+          <w:p>
+            <w:r>
+              <w:rPr>
+                <w:sz w:val="18"/>
+              </w:rPr>
+              <w:t>Runs fixtures and writes Markdown/JSON evidence reports.</w:t>
+            </w:r>
+          </w:p>
+        </w:tc>
+        <w:tc>
+          <w:tcPr>
+            <w:tcW w:type="dxa" w:w="3005"/>
+            <w:vAlign w:val="top"/>
+          </w:tcPr>
+          <w:p>
+            <w:r>
+              <w:rPr>
+                <w:sz w:val="18"/>
+              </w:rPr>
+              <w:t>tier-routing-test-report-2026-09-02.md</w:t>
+            </w:r>
+          </w:p>
+        </w:tc>
+      </w:tr>
+      <w:tr>
+        <w:tc>
+          <w:tcPr>
+            <w:tcW w:type="dxa" w:w="2381"/>
+            <w:vAlign w:val="top"/>
+            <w:shd w:fill="F2F4F7"/>
+          </w:tcPr>
+          <w:p>
+            <w:r>
+              <w:rPr>
+                <w:sz w:val="18"/>
+              </w:rPr>
+              <w:t>Service Desk routing record</w:t>
+            </w:r>
+          </w:p>
+        </w:tc>
+        <w:tc>
+          <w:tcPr>
+            <w:tcW w:type="dxa" w:w="4535"/>
+            <w:vAlign w:val="top"/>
+            <w:shd w:fill="F2F4F7"/>
+          </w:tcPr>
+          <w:p>
+            <w:r>
+              <w:rPr>
+                <w:sz w:val="18"/>
+              </w:rPr>
+              <w:t>Runs the real Service Desk Phase 2 index through the routing rule.</w:t>
+            </w:r>
+          </w:p>
+        </w:tc>
+        <w:tc>
+          <w:tcPr>
+            <w:tcW w:type="dxa" w:w="3005"/>
+            <w:vAlign w:val="top"/>
+            <w:shd w:fill="F2F4F7"/>
+          </w:tcPr>
+          <w:p>
+            <w:r>
+              <w:rPr>
+                <w:sz w:val="18"/>
+              </w:rPr>
+              <w:t>Initial Tier 3; selected Tier 3; no override.</w:t>
+            </w:r>
+          </w:p>
+        </w:tc>
+      </w:tr>
+    </w:tbl>
+    <w:p/>
+    <w:p>
+      <w:pPr>
+        <w:pStyle w:val="Heading2"/>
+        <w:spacing w:before="180" w:after="120"/>
+      </w:pPr>
+      <w:r>
+        <w:rPr>
+          <w:b/>
+          <w:color w:val="0B2545"/>
+          <w:sz w:val="26"/>
+        </w:rPr>
+        <w:t>Routing Workflow</w:t>
+      </w:r>
+    </w:p>
+    <w:p>
+      <w:pPr>
+        <w:pStyle w:val="ListNumber"/>
+        <w:spacing w:after="60"/>
+      </w:pPr>
+      <w:r>
+        <w:t>Use the Phase 2 source index and confirm its source hash is current.</w:t>
+      </w:r>
+    </w:p>
+    <w:p>
+      <w:pPr>
+        <w:pStyle w:val="ListNumber"/>
+        <w:spacing w:after="60"/>
+      </w:pPr>
+      <w:r>
+        <w:t>Read measurable routing signals: significant requirements, modules, integrations, migration, access, lifecycle, reporting, and deployment constraints.</w:t>
+      </w:r>
+    </w:p>
+    <w:p>
+      <w:pPr>
+        <w:pStyle w:val="ListNumber"/>
+        <w:spacing w:after="60"/>
+      </w:pPr>
+      <w:r>
+        <w:t>Apply the deterministic Tier 1 / 2 / 3 rule and record the initial tier with its reasons.</w:t>
+      </w:r>
+    </w:p>
+    <w:p>
+      <w:pPr>
+        <w:pStyle w:val="ListNumber"/>
+        <w:spacing w:after="60"/>
+      </w:pPr>
+      <w:r>
+        <w:t>Accept the initial tier, or submit an override with PRD evidence and a material reason.</w:t>
+      </w:r>
+    </w:p>
+    <w:p>
+      <w:pPr>
+        <w:pStyle w:val="ListNumber"/>
+        <w:spacing w:after="60"/>
+      </w:pPr>
+      <w:r>
+        <w:t>Save the routing record with the architecture metadata and run the routing fixtures.</w:t>
+      </w:r>
+    </w:p>
+    <w:p>
+      <w:pPr>
+        <w:pStyle w:val="Heading2"/>
+        <w:spacing w:before="180" w:after="120"/>
+      </w:pPr>
+      <w:r>
+        <w:rPr>
+          <w:b/>
+          <w:color w:val="0B2545"/>
+          <w:sz w:val="26"/>
+        </w:rPr>
+        <w:t>Live Result — Internal Service Desk PRD</w:t>
+      </w:r>
+    </w:p>
+    <w:tbl>
+      <w:tblPr>
+        <w:tblStyle w:val="TableGrid"/>
+        <w:tblW w:type="auto" w:w="0"/>
+        <w:tblLayout w:type="fixed"/>
+        <w:tblLook w:firstColumn="1" w:firstRow="1" w:lastColumn="0" w:lastRow="0" w:noHBand="0" w:noVBand="1" w:val="04A0"/>
+      </w:tblPr>
+      <w:tblGrid>
+        <w:gridCol w:w="4703"/>
+        <w:gridCol w:w="4703"/>
+      </w:tblGrid>
+      <w:tr>
+        <w:trPr>
+          <w:tblHeader w:val="true"/>
+        </w:trPr>
+        <w:tc>
+          <w:tcPr>
+            <w:tcW w:type="dxa" w:w="2835"/>
+            <w:vAlign w:val="center"/>
+            <w:shd w:fill="0B2545"/>
+          </w:tcPr>
+          <w:p>
+            <w:r>
+              <w:rPr>
+                <w:b/>
+                <w:color w:val="FFFFFF"/>
+                <w:sz w:val="18"/>
+              </w:rPr>
+              <w:t>Measure</w:t>
+            </w:r>
+          </w:p>
+        </w:tc>
+        <w:tc>
+          <w:tcPr>
+            <w:tcW w:type="dxa" w:w="7087"/>
+            <w:vAlign w:val="center"/>
+            <w:shd w:fill="0B2545"/>
+          </w:tcPr>
+          <w:p>
+            <w:r>
+              <w:rPr>
+                <w:b/>
+                <w:color w:val="FFFFFF"/>
+                <w:sz w:val="18"/>
+              </w:rPr>
+              <w:t>Verified result</w:t>
+            </w:r>
+          </w:p>
+        </w:tc>
+      </w:tr>
+      <w:tr>
+        <w:tc>
+          <w:tcPr>
+            <w:tcW w:type="dxa" w:w="2835"/>
+            <w:vAlign w:val="top"/>
+            <w:shd w:fill="F2F4F7"/>
+          </w:tcPr>
+          <w:p>
+            <w:r>
+              <w:rPr>
+                <w:sz w:val="18"/>
+              </w:rPr>
+              <w:t>Phase 2 source index</w:t>
+            </w:r>
+          </w:p>
+        </w:tc>
+        <w:tc>
+          <w:tcPr>
+            <w:tcW w:type="dxa" w:w="7087"/>
+            <w:vAlign w:val="top"/>
+            <w:shd w:fill="F2F4F7"/>
+          </w:tcPr>
+          <w:p>
+            <w:r>
+              <w:rPr>
+                <w:sz w:val="18"/>
+              </w:rPr>
+              <w:t>601 extracted requirements; 597 explicit requirement IDs.</w:t>
+            </w:r>
+          </w:p>
+        </w:tc>
+      </w:tr>
+      <w:tr>
+        <w:tc>
+          <w:tcPr>
+            <w:tcW w:type="dxa" w:w="2835"/>
+            <w:vAlign w:val="top"/>
+          </w:tcPr>
+          <w:p>
+            <w:r>
+              <w:rPr>
+                <w:sz w:val="18"/>
+              </w:rPr>
+              <w:t>Initial tier</w:t>
+            </w:r>
+          </w:p>
+        </w:tc>
+        <w:tc>
+          <w:tcPr>
+            <w:tcW w:type="dxa" w:w="7087"/>
+            <w:vAlign w:val="top"/>
+          </w:tcPr>
+          <w:p>
+            <w:r>
+              <w:rPr>
+                <w:sz w:val="18"/>
+              </w:rPr>
+              <w:t>Tier 3 — requirement-volume threshold is met.</w:t>
+            </w:r>
+          </w:p>
+        </w:tc>
+      </w:tr>
+      <w:tr>
+        <w:tc>
+          <w:tcPr>
+            <w:tcW w:type="dxa" w:w="2835"/>
+            <w:vAlign w:val="top"/>
+            <w:shd w:fill="F2F4F7"/>
+          </w:tcPr>
+          <w:p>
+            <w:r>
+              <w:rPr>
+                <w:sz w:val="18"/>
+              </w:rPr>
+              <w:t>Selected tier</w:t>
+            </w:r>
+          </w:p>
+        </w:tc>
+        <w:tc>
+          <w:tcPr>
+            <w:tcW w:type="dxa" w:w="7087"/>
+            <w:vAlign w:val="top"/>
+            <w:shd w:fill="F2F4F7"/>
+          </w:tcPr>
+          <w:p>
+            <w:r>
+              <w:rPr>
+                <w:sz w:val="18"/>
+              </w:rPr>
+              <w:t>Tier 3 — no override was required.</w:t>
+            </w:r>
+          </w:p>
+        </w:tc>
+      </w:tr>
+      <w:tr>
+        <w:tc>
+          <w:tcPr>
+            <w:tcW w:type="dxa" w:w="2835"/>
+            <w:vAlign w:val="top"/>
+          </w:tcPr>
+          <w:p>
+            <w:r>
+              <w:rPr>
+                <w:sz w:val="18"/>
+              </w:rPr>
+              <w:t>Test evidence</w:t>
+            </w:r>
+          </w:p>
+        </w:tc>
+        <w:tc>
+          <w:tcPr>
+            <w:tcW w:type="dxa" w:w="7087"/>
+            <w:vAlign w:val="top"/>
+          </w:tcPr>
+          <w:p>
+            <w:r>
+              <w:rPr>
+                <w:sz w:val="18"/>
+              </w:rPr>
+              <w:t>7 / 7 tier-routing fixtures passed.</w:t>
+            </w:r>
+          </w:p>
+        </w:tc>
+      </w:tr>
+      <w:tr>
+        <w:tc>
+          <w:tcPr>
+            <w:tcW w:type="dxa" w:w="2835"/>
+            <w:vAlign w:val="top"/>
+            <w:shd w:fill="F2F4F7"/>
+          </w:tcPr>
+          <w:p>
+            <w:r>
+              <w:rPr>
+                <w:sz w:val="18"/>
+              </w:rPr>
+              <w:t>Routing record</w:t>
+            </w:r>
+          </w:p>
+        </w:tc>
+        <w:tc>
+          <w:tcPr>
+            <w:tcW w:type="dxa" w:w="7087"/>
+            <w:vAlign w:val="top"/>
+            <w:shd w:fill="F2F4F7"/>
+          </w:tcPr>
+          <w:p>
+            <w:r>
+              <w:rPr>
+                <w:sz w:val="18"/>
+              </w:rPr>
+              <w:t>phase3/reports/service-desk-tier-selection-2026-09-02.json</w:t>
+            </w:r>
+          </w:p>
+        </w:tc>
+      </w:tr>
+    </w:tbl>
+    <w:p/>
+    <w:p>
+      <w:pPr>
+        <w:pStyle w:val="Heading2"/>
+        <w:spacing w:before="180" w:after="120"/>
+      </w:pPr>
+      <w:r>
+        <w:rPr>
+          <w:b/>
+          <w:color w:val="0B2545"/>
+          <w:sz w:val="26"/>
+        </w:rPr>
+        <w:t>Override Guardrails</w:t>
+      </w:r>
+    </w:p>
+    <w:p>
+      <w:pPr>
+        <w:spacing w:after="120"/>
+      </w:pPr>
+      <w:r>
+        <w:t>An override must select a different tier, contain a material architectural reason, and cite one or more PRD evidence references. It cannot be used merely to make an architecture document longer or more detailed.</w:t>
+      </w:r>
+    </w:p>
+    <w:p>
+      <w:pPr>
+        <w:pStyle w:val="Heading2"/>
+        <w:spacing w:before="180" w:after="120"/>
+      </w:pPr>
+      <w:r>
+        <w:rPr>
+          <w:b/>
+          <w:color w:val="0B2545"/>
+          <w:sz w:val="26"/>
+        </w:rPr>
+        <w:t>What Phase 3 Does Not Yet Do</w:t>
+      </w:r>
+    </w:p>
+    <w:tbl>
+      <w:tblPr>
+        <w:tblStyle w:val="TableGrid"/>
+        <w:tblW w:type="auto" w:w="0"/>
+        <w:tblLayout w:type="fixed"/>
+        <w:tblLook w:firstColumn="1" w:firstRow="1" w:lastColumn="0" w:lastRow="0" w:noHBand="0" w:noVBand="1" w:val="04A0"/>
+      </w:tblPr>
+      <w:tblGrid>
+        <w:gridCol w:w="4703"/>
+        <w:gridCol w:w="4703"/>
+      </w:tblGrid>
+      <w:tr>
+        <w:trPr>
+          <w:tblHeader w:val="true"/>
+        </w:trPr>
+        <w:tc>
+          <w:tcPr>
+            <w:tcW w:type="dxa" w:w="5783"/>
+            <w:vAlign w:val="center"/>
+            <w:shd w:fill="0B2545"/>
+          </w:tcPr>
+          <w:p>
+            <w:r>
+              <w:rPr>
+                <w:b/>
+                <w:color w:val="FFFFFF"/>
+                <w:sz w:val="18"/>
+              </w:rPr>
+              <w:t>Not included</w:t>
+            </w:r>
+          </w:p>
+        </w:tc>
+        <w:tc>
+          <w:tcPr>
+            <w:tcW w:type="dxa" w:w="4139"/>
+            <w:vAlign w:val="center"/>
+            <w:shd w:fill="0B2545"/>
+          </w:tcPr>
+          <w:p>
+            <w:r>
+              <w:rPr>
+                <w:b/>
+                <w:color w:val="FFFFFF"/>
+                <w:sz w:val="18"/>
+              </w:rPr>
+              <w:t>Next phase</w:t>
+            </w:r>
+          </w:p>
+        </w:tc>
+      </w:tr>
+      <w:tr>
+        <w:tc>
+          <w:tcPr>
+            <w:tcW w:type="dxa" w:w="5783"/>
+            <w:vAlign w:val="top"/>
+            <w:shd w:fill="F2F4F7"/>
+          </w:tcPr>
+          <w:p>
+            <w:r>
+              <w:rPr>
+                <w:sz w:val="18"/>
+              </w:rPr>
+              <w:t>Architecture schema validation, cross-reference validation, and full V-001 to V-010 checks.</w:t>
+            </w:r>
+          </w:p>
+        </w:tc>
+        <w:tc>
+          <w:tcPr>
+            <w:tcW w:type="dxa" w:w="4139"/>
+            <w:vAlign w:val="top"/>
+            <w:shd w:fill="F2F4F7"/>
+          </w:tcPr>
+          <w:p>
+            <w:r>
+              <w:rPr>
+                <w:sz w:val="18"/>
+              </w:rPr>
+              <w:t>Phase 4 — Verification and Regression Testing</w:t>
+            </w:r>
+          </w:p>
+        </w:tc>
+      </w:tr>
+      <w:tr>
+        <w:tc>
+          <w:tcPr>
+            <w:tcW w:type="dxa" w:w="5783"/>
+            <w:vAlign w:val="top"/>
+          </w:tcPr>
+          <w:p>
+            <w:r>
+              <w:rPr>
+                <w:sz w:val="18"/>
+              </w:rPr>
+              <w:t>T-001 to T-010 full architecture-output fixtures and CI-based regression execution.</w:t>
+            </w:r>
+          </w:p>
+        </w:tc>
+        <w:tc>
+          <w:tcPr>
+            <w:tcW w:type="dxa" w:w="4139"/>
+            <w:vAlign w:val="top"/>
+          </w:tcPr>
+          <w:p>
+            <w:r>
+              <w:rPr>
+                <w:sz w:val="18"/>
+              </w:rPr>
+              <w:t>Phase 4 — Verification and Regression Testing</w:t>
+            </w:r>
+          </w:p>
+        </w:tc>
+      </w:tr>
+      <w:tr>
+        <w:tc>
+          <w:tcPr>
+            <w:tcW w:type="dxa" w:w="5783"/>
+            <w:vAlign w:val="top"/>
+            <w:shd w:fill="F2F4F7"/>
+          </w:tcPr>
+          <w:p>
+            <w:r>
+              <w:rPr>
+                <w:sz w:val="18"/>
+              </w:rPr>
+              <w:t>CI/CD release workflow, operational monitoring, and approval automation.</w:t>
+            </w:r>
+          </w:p>
+        </w:tc>
+        <w:tc>
+          <w:tcPr>
+            <w:tcW w:type="dxa" w:w="4139"/>
+            <w:vAlign w:val="top"/>
+            <w:shd w:fill="F2F4F7"/>
+          </w:tcPr>
+          <w:p>
+            <w:r>
+              <w:rPr>
+                <w:sz w:val="18"/>
+              </w:rPr>
+              <w:t>Phase 5 — Governance and Operations</w:t>
+            </w:r>
+          </w:p>
+        </w:tc>
+      </w:tr>
+    </w:tbl>
+    <w:p/>
+    <w:p>
+      <w:pPr>
+        <w:jc w:val="center"/>
+      </w:pPr>
+      <w:r>
+        <w:rPr>
+          <w:i/>
+          <w:color w:val="555555"/>
+          <w:sz w:val="17"/>
+        </w:rPr>
+        <w:t>Architecture Skill v1.3.0  |  Phase 1, 2 &amp; 3 complete  |  Approved: Sushma S — 2026-09-02</w:t>
       </w:r>
     </w:p>
     <w:sectPr>

</xml_diff>

<commit_message>
docs: update me.docx with Phase 3, 4, 5 content and final scorecard (v1.5.0)
</commit_message>
<xml_diff>
--- a/me.docx
+++ b/me.docx
@@ -15,7 +15,7 @@
           <w:color w:val="1F3564"/>
           <w:sz w:val="56"/>
         </w:rPr>
-        <w:t>Architecture Skill — Phase 1 &amp; 2</w:t>
+        <w:t>Architecture Skill — Phases 1 to 5</w:t>
       </w:r>
     </w:p>
     <w:p>
@@ -83,7 +83,7 @@
               <w:rPr>
                 <w:sz w:val="20"/>
               </w:rPr>
-              <w:t>1.1.0</w:t>
+              <w:t>1.5.0</w:t>
             </w:r>
           </w:p>
         </w:tc>
@@ -115,7 +115,7 @@
               <w:rPr>
                 <w:sz w:val="20"/>
               </w:rPr>
-              <w:t>2026-09-02</w:t>
+              <w:t>2026-09-03</w:t>
             </w:r>
           </w:p>
         </w:tc>
@@ -211,7 +211,7 @@
               <w:rPr>
                 <w:sz w:val="20"/>
               </w:rPr>
-              <w:t>https://github.com/Sushma-celestail/SKILL.git  |  Tag: v1.1.0</w:t>
+              <w:t>https://github.com/Sushma-celestail/SKILL.git  |  Tag: v1.5.0</w:t>
             </w:r>
           </w:p>
         </w:tc>
@@ -12271,6 +12271,2850 @@
         <w:t>Phase 2 lifted context/token optimisation from 7.0 to 8.0 by implementing the Source Index Contract, PRD indexer, and stale-source detector. The next jump will come from Phase 4 (verify.js + test fixtures).</w:t>
       </w:r>
     </w:p>
+    <w:p>
+      <w:r>
+        <w:br w:type="page"/>
+      </w:r>
+    </w:p>
+    <w:p>
+      <w:pPr>
+        <w:pStyle w:val="Heading1"/>
+        <w:spacing w:before="360" w:after="160"/>
+      </w:pPr>
+      <w:r>
+        <w:rPr>
+          <w:b/>
+          <w:color w:val="2763AB"/>
+          <w:sz w:val="36"/>
+        </w:rPr>
+        <w:t>Phase 3 — Deterministic Tier Routing</w:t>
+      </w:r>
+    </w:p>
+    <w:p>
+      <w:pPr>
+        <w:spacing w:after="80" w:before="40"/>
+      </w:pPr>
+      <w:r>
+        <w:rPr>
+          <w:b w:val="0"/>
+          <w:i w:val="0"/>
+          <w:color w:val="000000"/>
+          <w:sz w:val="21"/>
+        </w:rPr>
+        <w:t>Phase 3 makes tier selection repeatable and auditable. Before Phase 3, tier choice was a judgment call with no recorded evidence. After Phase 3, every PRD produces a documented tier decision that can be compared, challenged, and regression-tested.</w:t>
+      </w:r>
+    </w:p>
+    <w:p/>
+    <w:p>
+      <w:pPr>
+        <w:spacing w:after="80" w:before="40"/>
+      </w:pPr>
+      <w:r>
+        <w:rPr>
+          <w:b/>
+          <w:i w:val="0"/>
+          <w:color w:val="000000"/>
+          <w:sz w:val="21"/>
+        </w:rPr>
+        <w:t>One sentence summary:</w:t>
+      </w:r>
+    </w:p>
+    <w:p>
+      <w:pPr>
+        <w:spacing w:after="80" w:before="40"/>
+      </w:pPr>
+      <w:r>
+        <w:rPr>
+          <w:b w:val="0"/>
+          <w:i/>
+          <w:color w:val="2763AB"/>
+          <w:sz w:val="24"/>
+        </w:rPr>
+        <w:t xml:space="preserve">  “Select the tier from rules, not intuition — and record the reason every time.”</w:t>
+      </w:r>
+    </w:p>
+    <w:p/>
+    <w:p>
+      <w:pPr>
+        <w:pStyle w:val="Heading2"/>
+        <w:spacing w:before="360" w:after="160"/>
+      </w:pPr>
+      <w:r>
+        <w:rPr>
+          <w:b/>
+          <w:color w:val="1F3564"/>
+          <w:sz w:val="30"/>
+        </w:rPr>
+        <w:t>What Was Built in Phase 3</w:t>
+      </w:r>
+    </w:p>
+    <w:tbl>
+      <w:tblPr>
+        <w:tblStyle w:val="TableGrid"/>
+        <w:tblW w:type="auto" w:w="0"/>
+        <w:jc w:val="left"/>
+        <w:tblLook w:firstColumn="1" w:firstRow="1" w:lastColumn="0" w:lastRow="0" w:noHBand="0" w:noVBand="1" w:val="04A0"/>
+      </w:tblPr>
+      <w:tblGrid>
+        <w:gridCol w:w="3135"/>
+        <w:gridCol w:w="3135"/>
+        <w:gridCol w:w="3135"/>
+      </w:tblGrid>
+      <w:tr>
+        <w:tc>
+          <w:tcPr>
+            <w:tcW w:type="dxa" w:w="2551"/>
+            <w:shd w:val="clear" w:color="auto" w:fill="1F3564"/>
+          </w:tcPr>
+          <w:p>
+            <w:pPr>
+              <w:jc w:val="center"/>
+            </w:pPr>
+            <w:r>
+              <w:rPr>
+                <w:b/>
+                <w:color w:val="FFFFFF"/>
+                <w:sz w:val="19"/>
+              </w:rPr>
+              <w:t>File</w:t>
+            </w:r>
+          </w:p>
+        </w:tc>
+        <w:tc>
+          <w:tcPr>
+            <w:tcW w:type="dxa" w:w="3402"/>
+            <w:shd w:val="clear" w:color="auto" w:fill="1F3564"/>
+          </w:tcPr>
+          <w:p>
+            <w:pPr>
+              <w:jc w:val="center"/>
+            </w:pPr>
+            <w:r>
+              <w:rPr>
+                <w:b/>
+                <w:color w:val="FFFFFF"/>
+                <w:sz w:val="19"/>
+              </w:rPr>
+              <w:t>Purpose</w:t>
+            </w:r>
+          </w:p>
+        </w:tc>
+        <w:tc>
+          <w:tcPr>
+            <w:tcW w:type="dxa" w:w="3969"/>
+            <w:shd w:val="clear" w:color="auto" w:fill="1F3564"/>
+          </w:tcPr>
+          <w:p>
+            <w:pPr>
+              <w:jc w:val="center"/>
+            </w:pPr>
+            <w:r>
+              <w:rPr>
+                <w:b/>
+                <w:color w:val="FFFFFF"/>
+                <w:sz w:val="19"/>
+              </w:rPr>
+              <w:t>Result</w:t>
+            </w:r>
+          </w:p>
+        </w:tc>
+      </w:tr>
+      <w:tr>
+        <w:tc>
+          <w:tcPr>
+            <w:tcW w:type="dxa" w:w="2551"/>
+            <w:shd w:val="clear" w:color="auto" w:fill="F2F2F2"/>
+          </w:tcPr>
+          <w:p>
+            <w:r>
+              <w:rPr>
+                <w:sz w:val="19"/>
+              </w:rPr>
+              <w:t>phase3/tier-routing.js</w:t>
+            </w:r>
+          </w:p>
+        </w:tc>
+        <w:tc>
+          <w:tcPr>
+            <w:tcW w:type="dxa" w:w="3402"/>
+            <w:shd w:val="clear" w:color="auto" w:fill="F2F2F2"/>
+          </w:tcPr>
+          <w:p>
+            <w:r>
+              <w:rPr>
+                <w:sz w:val="19"/>
+              </w:rPr>
+              <w:t>Deterministic Tier 1/2/3 selector from PRD index</w:t>
+            </w:r>
+          </w:p>
+        </w:tc>
+        <w:tc>
+          <w:tcPr>
+            <w:tcW w:type="dxa" w:w="3969"/>
+            <w:shd w:val="clear" w:color="auto" w:fill="F2F2F2"/>
+          </w:tcPr>
+          <w:p>
+            <w:r>
+              <w:rPr>
+                <w:sz w:val="19"/>
+              </w:rPr>
+              <w:t>Reads req count, module count, integration flags</w:t>
+            </w:r>
+          </w:p>
+        </w:tc>
+      </w:tr>
+      <w:tr>
+        <w:tc>
+          <w:tcPr>
+            <w:tcW w:type="dxa" w:w="2551"/>
+            <w:shd w:val="clear" w:color="auto" w:fill="FFFFFF"/>
+          </w:tcPr>
+          <w:p>
+            <w:r>
+              <w:rPr>
+                <w:sz w:val="19"/>
+              </w:rPr>
+              <w:t>phase3/run-tier-routing-tests.js</w:t>
+            </w:r>
+          </w:p>
+        </w:tc>
+        <w:tc>
+          <w:tcPr>
+            <w:tcW w:type="dxa" w:w="3402"/>
+            <w:shd w:val="clear" w:color="auto" w:fill="FFFFFF"/>
+          </w:tcPr>
+          <w:p>
+            <w:r>
+              <w:rPr>
+                <w:sz w:val="19"/>
+              </w:rPr>
+              <w:t>Fixture runner — produces JSON + Markdown reports</w:t>
+            </w:r>
+          </w:p>
+        </w:tc>
+        <w:tc>
+          <w:tcPr>
+            <w:tcW w:type="dxa" w:w="3969"/>
+            <w:shd w:val="clear" w:color="auto" w:fill="FFFFFF"/>
+          </w:tcPr>
+          <w:p>
+            <w:r>
+              <w:rPr>
+                <w:sz w:val="19"/>
+              </w:rPr>
+              <w:t>7/7 fixtures pass</w:t>
+            </w:r>
+          </w:p>
+        </w:tc>
+      </w:tr>
+      <w:tr>
+        <w:tc>
+          <w:tcPr>
+            <w:tcW w:type="dxa" w:w="2551"/>
+            <w:shd w:val="clear" w:color="auto" w:fill="F2F2F2"/>
+          </w:tcPr>
+          <w:p>
+            <w:r>
+              <w:rPr>
+                <w:sz w:val="19"/>
+              </w:rPr>
+              <w:t>phase3/fixtures/ (7 files)</w:t>
+            </w:r>
+          </w:p>
+        </w:tc>
+        <w:tc>
+          <w:tcPr>
+            <w:tcW w:type="dxa" w:w="3402"/>
+            <w:shd w:val="clear" w:color="auto" w:fill="F2F2F2"/>
+          </w:tcPr>
+          <w:p>
+            <w:r>
+              <w:rPr>
+                <w:sz w:val="19"/>
+              </w:rPr>
+              <w:t>TR-001–TR-007: Tier 1, 2, 3, and approved override</w:t>
+            </w:r>
+          </w:p>
+        </w:tc>
+        <w:tc>
+          <w:tcPr>
+            <w:tcW w:type="dxa" w:w="3969"/>
+            <w:shd w:val="clear" w:color="auto" w:fill="F2F2F2"/>
+          </w:tcPr>
+          <w:p>
+            <w:r>
+              <w:rPr>
+                <w:sz w:val="19"/>
+              </w:rPr>
+              <w:t>Each records initial tier, selected tier, reason</w:t>
+            </w:r>
+          </w:p>
+        </w:tc>
+      </w:tr>
+      <w:tr>
+        <w:tc>
+          <w:tcPr>
+            <w:tcW w:type="dxa" w:w="2551"/>
+            <w:shd w:val="clear" w:color="auto" w:fill="FFFFFF"/>
+          </w:tcPr>
+          <w:p>
+            <w:r>
+              <w:rPr>
+                <w:sz w:val="19"/>
+              </w:rPr>
+              <w:t>SKILL.md §41, §59, §61</w:t>
+            </w:r>
+          </w:p>
+        </w:tc>
+        <w:tc>
+          <w:tcPr>
+            <w:tcW w:type="dxa" w:w="3402"/>
+            <w:shd w:val="clear" w:color="auto" w:fill="FFFFFF"/>
+          </w:tcPr>
+          <w:p>
+            <w:r>
+              <w:rPr>
+                <w:sz w:val="19"/>
+              </w:rPr>
+              <w:t>tier_override fields added to architecture metadata</w:t>
+            </w:r>
+          </w:p>
+        </w:tc>
+        <w:tc>
+          <w:tcPr>
+            <w:tcW w:type="dxa" w:w="3969"/>
+            <w:shd w:val="clear" w:color="auto" w:fill="FFFFFF"/>
+          </w:tcPr>
+          <w:p>
+            <w:r>
+              <w:rPr>
+                <w:sz w:val="19"/>
+              </w:rPr>
+              <w:t>Closes GAP-010</w:t>
+            </w:r>
+          </w:p>
+        </w:tc>
+      </w:tr>
+    </w:tbl>
+    <w:p/>
+    <w:p/>
+    <w:tbl>
+      <w:tblPr>
+        <w:tblStyle w:val="TableGrid"/>
+        <w:tblW w:type="auto" w:w="0"/>
+        <w:jc w:val="left"/>
+        <w:tblLook w:firstColumn="1" w:firstRow="1" w:lastColumn="0" w:lastRow="0" w:noHBand="0" w:noVBand="1" w:val="04A0"/>
+      </w:tblPr>
+      <w:tblGrid>
+        <w:gridCol w:w="4703"/>
+        <w:gridCol w:w="4703"/>
+      </w:tblGrid>
+      <w:tr>
+        <w:tc>
+          <w:tcPr>
+            <w:tcW w:type="dxa" w:w="2835"/>
+            <w:shd w:val="clear" w:color="auto" w:fill="1F3564"/>
+          </w:tcPr>
+          <w:p>
+            <w:pPr>
+              <w:jc w:val="center"/>
+            </w:pPr>
+            <w:r>
+              <w:rPr>
+                <w:b/>
+                <w:color w:val="FFFFFF"/>
+                <w:sz w:val="19"/>
+              </w:rPr>
+              <w:t>Metric</w:t>
+            </w:r>
+          </w:p>
+        </w:tc>
+        <w:tc>
+          <w:tcPr>
+            <w:tcW w:type="dxa" w:w="7087"/>
+            <w:shd w:val="clear" w:color="auto" w:fill="1F3564"/>
+          </w:tcPr>
+          <w:p>
+            <w:pPr>
+              <w:jc w:val="center"/>
+            </w:pPr>
+            <w:r>
+              <w:rPr>
+                <w:b/>
+                <w:color w:val="FFFFFF"/>
+                <w:sz w:val="19"/>
+              </w:rPr>
+              <w:t>Value</w:t>
+            </w:r>
+          </w:p>
+        </w:tc>
+      </w:tr>
+      <w:tr>
+        <w:tc>
+          <w:tcPr>
+            <w:tcW w:type="dxa" w:w="2835"/>
+            <w:shd w:val="clear" w:color="auto" w:fill="F2F2F2"/>
+          </w:tcPr>
+          <w:p>
+            <w:r>
+              <w:rPr>
+                <w:sz w:val="19"/>
+              </w:rPr>
+              <w:t>Service Desk PRD tier</w:t>
+            </w:r>
+          </w:p>
+        </w:tc>
+        <w:tc>
+          <w:tcPr>
+            <w:tcW w:type="dxa" w:w="7087"/>
+            <w:shd w:val="clear" w:color="auto" w:fill="F2F2F2"/>
+          </w:tcPr>
+          <w:p>
+            <w:r>
+              <w:rPr>
+                <w:sz w:val="19"/>
+              </w:rPr>
+              <w:t>Tier 3</w:t>
+            </w:r>
+          </w:p>
+        </w:tc>
+      </w:tr>
+      <w:tr>
+        <w:tc>
+          <w:tcPr>
+            <w:tcW w:type="dxa" w:w="2835"/>
+            <w:shd w:val="clear" w:color="auto" w:fill="FFFFFF"/>
+          </w:tcPr>
+          <w:p>
+            <w:r>
+              <w:rPr>
+                <w:sz w:val="19"/>
+              </w:rPr>
+              <w:t>Override</w:t>
+            </w:r>
+          </w:p>
+        </w:tc>
+        <w:tc>
+          <w:tcPr>
+            <w:tcW w:type="dxa" w:w="7087"/>
+            <w:shd w:val="clear" w:color="auto" w:fill="FFFFFF"/>
+          </w:tcPr>
+          <w:p>
+            <w:r>
+              <w:rPr>
+                <w:sz w:val="19"/>
+              </w:rPr>
+              <w:t>None</w:t>
+            </w:r>
+          </w:p>
+        </w:tc>
+      </w:tr>
+      <w:tr>
+        <w:tc>
+          <w:tcPr>
+            <w:tcW w:type="dxa" w:w="2835"/>
+            <w:shd w:val="clear" w:color="auto" w:fill="F2F2F2"/>
+          </w:tcPr>
+          <w:p>
+            <w:r>
+              <w:rPr>
+                <w:sz w:val="19"/>
+              </w:rPr>
+              <w:t>Fixtures</w:t>
+            </w:r>
+          </w:p>
+        </w:tc>
+        <w:tc>
+          <w:tcPr>
+            <w:tcW w:type="dxa" w:w="7087"/>
+            <w:shd w:val="clear" w:color="auto" w:fill="F2F2F2"/>
+          </w:tcPr>
+          <w:p>
+            <w:r>
+              <w:rPr>
+                <w:sz w:val="19"/>
+              </w:rPr>
+              <w:t>7/7 PASS</w:t>
+            </w:r>
+          </w:p>
+        </w:tc>
+      </w:tr>
+      <w:tr>
+        <w:tc>
+          <w:tcPr>
+            <w:tcW w:type="dxa" w:w="2835"/>
+            <w:shd w:val="clear" w:color="auto" w:fill="FFFFFF"/>
+          </w:tcPr>
+          <w:p>
+            <w:r>
+              <w:rPr>
+                <w:sz w:val="19"/>
+              </w:rPr>
+              <w:t>Tag</w:t>
+            </w:r>
+          </w:p>
+        </w:tc>
+        <w:tc>
+          <w:tcPr>
+            <w:tcW w:type="dxa" w:w="7087"/>
+            <w:shd w:val="clear" w:color="auto" w:fill="FFFFFF"/>
+          </w:tcPr>
+          <w:p>
+            <w:r>
+              <w:rPr>
+                <w:sz w:val="19"/>
+              </w:rPr>
+              <w:t>v1.3.0</w:t>
+            </w:r>
+          </w:p>
+        </w:tc>
+      </w:tr>
+    </w:tbl>
+    <w:p/>
+    <w:p>
+      <w:r>
+        <w:br w:type="page"/>
+      </w:r>
+    </w:p>
+    <w:p>
+      <w:pPr>
+        <w:pStyle w:val="Heading1"/>
+        <w:spacing w:before="360" w:after="160"/>
+      </w:pPr>
+      <w:r>
+        <w:rPr>
+          <w:b/>
+          <w:color w:val="2763AB"/>
+          <w:sz w:val="36"/>
+        </w:rPr>
+        <w:t>Phase 4 — Verification and Regression Testing</w:t>
+      </w:r>
+    </w:p>
+    <w:p>
+      <w:pPr>
+        <w:spacing w:after="80" w:before="40"/>
+      </w:pPr>
+      <w:r>
+        <w:rPr>
+          <w:b w:val="0"/>
+          <w:i w:val="0"/>
+          <w:color w:val="000000"/>
+          <w:sz w:val="21"/>
+        </w:rPr>
+        <w:t>Phase 4 is the first phase that automatically catches mistakes in generated architecture artifacts. Ten checks (V-001–V-010) run against every artifact and ten controlled scenarios (T-001–T-010) confirm the skill behaves correctly.</w:t>
+      </w:r>
+    </w:p>
+    <w:p/>
+    <w:p>
+      <w:pPr>
+        <w:pStyle w:val="Heading2"/>
+        <w:spacing w:before="360" w:after="160"/>
+      </w:pPr>
+      <w:r>
+        <w:rPr>
+          <w:b/>
+          <w:color w:val="1F3564"/>
+          <w:sz w:val="30"/>
+        </w:rPr>
+        <w:t>V-001 through V-010</w:t>
+      </w:r>
+    </w:p>
+    <w:tbl>
+      <w:tblPr>
+        <w:tblStyle w:val="TableGrid"/>
+        <w:tblW w:type="auto" w:w="0"/>
+        <w:jc w:val="left"/>
+        <w:tblLook w:firstColumn="1" w:firstRow="1" w:lastColumn="0" w:lastRow="0" w:noHBand="0" w:noVBand="1" w:val="04A0"/>
+      </w:tblPr>
+      <w:tblGrid>
+        <w:gridCol w:w="4703"/>
+        <w:gridCol w:w="4703"/>
+      </w:tblGrid>
+      <w:tr>
+        <w:tc>
+          <w:tcPr>
+            <w:tcW w:type="dxa" w:w="1134"/>
+            <w:shd w:val="clear" w:color="auto" w:fill="1F3564"/>
+          </w:tcPr>
+          <w:p>
+            <w:pPr>
+              <w:jc w:val="center"/>
+            </w:pPr>
+            <w:r>
+              <w:rPr>
+                <w:b/>
+                <w:color w:val="FFFFFF"/>
+                <w:sz w:val="19"/>
+              </w:rPr>
+              <w:t>Check</w:t>
+            </w:r>
+          </w:p>
+        </w:tc>
+        <w:tc>
+          <w:tcPr>
+            <w:tcW w:type="dxa" w:w="8787"/>
+            <w:shd w:val="clear" w:color="auto" w:fill="1F3564"/>
+          </w:tcPr>
+          <w:p>
+            <w:pPr>
+              <w:jc w:val="center"/>
+            </w:pPr>
+            <w:r>
+              <w:rPr>
+                <w:b/>
+                <w:color w:val="FFFFFF"/>
+                <w:sz w:val="19"/>
+              </w:rPr>
+              <w:t>What It Verifies</w:t>
+            </w:r>
+          </w:p>
+        </w:tc>
+      </w:tr>
+      <w:tr>
+        <w:tc>
+          <w:tcPr>
+            <w:tcW w:type="dxa" w:w="1134"/>
+            <w:shd w:val="clear" w:color="auto" w:fill="F2F2F2"/>
+          </w:tcPr>
+          <w:p>
+            <w:r>
+              <w:rPr>
+                <w:sz w:val="19"/>
+              </w:rPr>
+              <w:t>V-001</w:t>
+            </w:r>
+          </w:p>
+        </w:tc>
+        <w:tc>
+          <w:tcPr>
+            <w:tcW w:type="dxa" w:w="8787"/>
+            <w:shd w:val="clear" w:color="auto" w:fill="F2F2F2"/>
+          </w:tcPr>
+          <w:p>
+            <w:r>
+              <w:rPr>
+                <w:sz w:val="19"/>
+              </w:rPr>
+              <w:t>SKILL.md frontmatter, required sections, no conflict markers</w:t>
+            </w:r>
+          </w:p>
+        </w:tc>
+      </w:tr>
+      <w:tr>
+        <w:tc>
+          <w:tcPr>
+            <w:tcW w:type="dxa" w:w="1134"/>
+            <w:shd w:val="clear" w:color="auto" w:fill="FFFFFF"/>
+          </w:tcPr>
+          <w:p>
+            <w:r>
+              <w:rPr>
+                <w:sz w:val="19"/>
+              </w:rPr>
+              <w:t>V-002</w:t>
+            </w:r>
+          </w:p>
+        </w:tc>
+        <w:tc>
+          <w:tcPr>
+            <w:tcW w:type="dxa" w:w="8787"/>
+            <w:shd w:val="clear" w:color="auto" w:fill="FFFFFF"/>
+          </w:tcPr>
+          <w:p>
+            <w:r>
+              <w:rPr>
+                <w:sz w:val="19"/>
+              </w:rPr>
+              <w:t>JSON structure valid, required keys, mode/tier/status values</w:t>
+            </w:r>
+          </w:p>
+        </w:tc>
+      </w:tr>
+      <w:tr>
+        <w:tc>
+          <w:tcPr>
+            <w:tcW w:type="dxa" w:w="1134"/>
+            <w:shd w:val="clear" w:color="auto" w:fill="F2F2F2"/>
+          </w:tcPr>
+          <w:p>
+            <w:r>
+              <w:rPr>
+                <w:sz w:val="19"/>
+              </w:rPr>
+              <w:t>V-003</w:t>
+            </w:r>
+          </w:p>
+        </w:tc>
+        <w:tc>
+          <w:tcPr>
+            <w:tcW w:type="dxa" w:w="8787"/>
+            <w:shd w:val="clear" w:color="auto" w:fill="F2F2F2"/>
+          </w:tcPr>
+          <w:p>
+            <w:r>
+              <w:rPr>
+                <w:sz w:val="19"/>
+              </w:rPr>
+              <w:t>All IDs unique, correct prefixes (REQ, MOD, CMP, API, WF, ADR…)</w:t>
+            </w:r>
+          </w:p>
+        </w:tc>
+      </w:tr>
+      <w:tr>
+        <w:tc>
+          <w:tcPr>
+            <w:tcW w:type="dxa" w:w="1134"/>
+            <w:shd w:val="clear" w:color="auto" w:fill="FFFFFF"/>
+          </w:tcPr>
+          <w:p>
+            <w:r>
+              <w:rPr>
+                <w:sz w:val="19"/>
+              </w:rPr>
+              <w:t>V-004</w:t>
+            </w:r>
+          </w:p>
+        </w:tc>
+        <w:tc>
+          <w:tcPr>
+            <w:tcW w:type="dxa" w:w="8787"/>
+            <w:shd w:val="clear" w:color="auto" w:fill="FFFFFF"/>
+          </w:tcPr>
+          <w:p>
+            <w:r>
+              <w:rPr>
+                <w:sz w:val="19"/>
+              </w:rPr>
+              <w:t>All cross-references resolve — no dangling component, module or API IDs</w:t>
+            </w:r>
+          </w:p>
+        </w:tc>
+      </w:tr>
+      <w:tr>
+        <w:tc>
+          <w:tcPr>
+            <w:tcW w:type="dxa" w:w="1134"/>
+            <w:shd w:val="clear" w:color="auto" w:fill="F2F2F2"/>
+          </w:tcPr>
+          <w:p>
+            <w:r>
+              <w:rPr>
+                <w:sz w:val="19"/>
+              </w:rPr>
+              <w:t>V-005</w:t>
+            </w:r>
+          </w:p>
+        </w:tc>
+        <w:tc>
+          <w:tcPr>
+            <w:tcW w:type="dxa" w:w="8787"/>
+            <w:shd w:val="clear" w:color="auto" w:fill="F2F2F2"/>
+          </w:tcPr>
+          <w:p>
+            <w:r>
+              <w:rPr>
+                <w:sz w:val="19"/>
+              </w:rPr>
+              <w:t>Every requirement has a traceability entry or is blocked</w:t>
+            </w:r>
+          </w:p>
+        </w:tc>
+      </w:tr>
+      <w:tr>
+        <w:tc>
+          <w:tcPr>
+            <w:tcW w:type="dxa" w:w="1134"/>
+            <w:shd w:val="clear" w:color="auto" w:fill="FFFFFF"/>
+          </w:tcPr>
+          <w:p>
+            <w:r>
+              <w:rPr>
+                <w:sz w:val="19"/>
+              </w:rPr>
+              <w:t>V-006</w:t>
+            </w:r>
+          </w:p>
+        </w:tc>
+        <w:tc>
+          <w:tcPr>
+            <w:tcW w:type="dxa" w:w="8787"/>
+            <w:shd w:val="clear" w:color="auto" w:fill="FFFFFF"/>
+          </w:tcPr>
+          <w:p>
+            <w:r>
+              <w:rPr>
+                <w:sz w:val="19"/>
+              </w:rPr>
+              <w:t>Source IDs reconcilable with Phase 2 PRD index</w:t>
+            </w:r>
+          </w:p>
+        </w:tc>
+      </w:tr>
+      <w:tr>
+        <w:tc>
+          <w:tcPr>
+            <w:tcW w:type="dxa" w:w="1134"/>
+            <w:shd w:val="clear" w:color="auto" w:fill="F2F2F2"/>
+          </w:tcPr>
+          <w:p>
+            <w:r>
+              <w:rPr>
+                <w:sz w:val="19"/>
+              </w:rPr>
+              <w:t>V-007</w:t>
+            </w:r>
+          </w:p>
+        </w:tc>
+        <w:tc>
+          <w:tcPr>
+            <w:tcW w:type="dxa" w:w="8787"/>
+            <w:shd w:val="clear" w:color="auto" w:fill="F2F2F2"/>
+          </w:tcPr>
+          <w:p>
+            <w:r>
+              <w:rPr>
+                <w:sz w:val="19"/>
+              </w:rPr>
+              <w:t>Markdown and JSON describe the same architecture</w:t>
+            </w:r>
+          </w:p>
+        </w:tc>
+      </w:tr>
+      <w:tr>
+        <w:tc>
+          <w:tcPr>
+            <w:tcW w:type="dxa" w:w="1134"/>
+            <w:shd w:val="clear" w:color="auto" w:fill="FFFFFF"/>
+          </w:tcPr>
+          <w:p>
+            <w:r>
+              <w:rPr>
+                <w:sz w:val="19"/>
+              </w:rPr>
+              <w:t>V-008</w:t>
+            </w:r>
+          </w:p>
+        </w:tc>
+        <w:tc>
+          <w:tcPr>
+            <w:tcW w:type="dxa" w:w="8787"/>
+            <w:shd w:val="clear" w:color="auto" w:fill="FFFFFF"/>
+          </w:tcPr>
+          <w:p>
+            <w:r>
+              <w:rPr>
+                <w:sz w:val="19"/>
+              </w:rPr>
+              <w:t>Mermaid diagram blocks structurally valid</w:t>
+            </w:r>
+          </w:p>
+        </w:tc>
+      </w:tr>
+      <w:tr>
+        <w:tc>
+          <w:tcPr>
+            <w:tcW w:type="dxa" w:w="1134"/>
+            <w:shd w:val="clear" w:color="auto" w:fill="F2F2F2"/>
+          </w:tcPr>
+          <w:p>
+            <w:r>
+              <w:rPr>
+                <w:sz w:val="19"/>
+              </w:rPr>
+              <w:t>V-009</w:t>
+            </w:r>
+          </w:p>
+        </w:tc>
+        <w:tc>
+          <w:tcPr>
+            <w:tcW w:type="dxa" w:w="8787"/>
+            <w:shd w:val="clear" w:color="auto" w:fill="F2F2F2"/>
+          </w:tcPr>
+          <w:p>
+            <w:r>
+              <w:rPr>
+                <w:sz w:val="19"/>
+              </w:rPr>
+              <w:t>.docx file present and within expected size bounds</w:t>
+            </w:r>
+          </w:p>
+        </w:tc>
+      </w:tr>
+      <w:tr>
+        <w:tc>
+          <w:tcPr>
+            <w:tcW w:type="dxa" w:w="1134"/>
+            <w:shd w:val="clear" w:color="auto" w:fill="FFFFFF"/>
+          </w:tcPr>
+          <w:p>
+            <w:r>
+              <w:rPr>
+                <w:sz w:val="19"/>
+              </w:rPr>
+              <w:t>V-010</w:t>
+            </w:r>
+          </w:p>
+        </w:tc>
+        <w:tc>
+          <w:tcPr>
+            <w:tcW w:type="dxa" w:w="8787"/>
+            <w:shd w:val="clear" w:color="auto" w:fill="FFFFFF"/>
+          </w:tcPr>
+          <w:p>
+            <w:r>
+              <w:rPr>
+                <w:sz w:val="19"/>
+              </w:rPr>
+              <w:t>No unapproved tech status, no SQL, components have responsibilities</w:t>
+            </w:r>
+          </w:p>
+        </w:tc>
+      </w:tr>
+    </w:tbl>
+    <w:p/>
+    <w:p/>
+    <w:p>
+      <w:pPr>
+        <w:pStyle w:val="Heading2"/>
+        <w:spacing w:before="360" w:after="160"/>
+      </w:pPr>
+      <w:r>
+        <w:rPr>
+          <w:b/>
+          <w:color w:val="1F3564"/>
+          <w:sz w:val="30"/>
+        </w:rPr>
+        <w:t>T-001 through T-010 Results</w:t>
+      </w:r>
+    </w:p>
+    <w:tbl>
+      <w:tblPr>
+        <w:tblStyle w:val="TableGrid"/>
+        <w:tblW w:type="auto" w:w="0"/>
+        <w:jc w:val="left"/>
+        <w:tblLook w:firstColumn="1" w:firstRow="1" w:lastColumn="0" w:lastRow="0" w:noHBand="0" w:noVBand="1" w:val="04A0"/>
+      </w:tblPr>
+      <w:tblGrid>
+        <w:gridCol w:w="3135"/>
+        <w:gridCol w:w="3135"/>
+        <w:gridCol w:w="3135"/>
+      </w:tblGrid>
+      <w:tr>
+        <w:tc>
+          <w:tcPr>
+            <w:tcW w:type="dxa" w:w="1134"/>
+            <w:shd w:val="clear" w:color="auto" w:fill="1F3564"/>
+          </w:tcPr>
+          <w:p>
+            <w:pPr>
+              <w:jc w:val="center"/>
+            </w:pPr>
+            <w:r>
+              <w:rPr>
+                <w:b/>
+                <w:color w:val="FFFFFF"/>
+                <w:sz w:val="19"/>
+              </w:rPr>
+              <w:t>Fixture</w:t>
+            </w:r>
+          </w:p>
+        </w:tc>
+        <w:tc>
+          <w:tcPr>
+            <w:tcW w:type="dxa" w:w="5669"/>
+            <w:shd w:val="clear" w:color="auto" w:fill="1F3564"/>
+          </w:tcPr>
+          <w:p>
+            <w:pPr>
+              <w:jc w:val="center"/>
+            </w:pPr>
+            <w:r>
+              <w:rPr>
+                <w:b/>
+                <w:color w:val="FFFFFF"/>
+                <w:sz w:val="19"/>
+              </w:rPr>
+              <w:t>Scenario</w:t>
+            </w:r>
+          </w:p>
+        </w:tc>
+        <w:tc>
+          <w:tcPr>
+            <w:tcW w:type="dxa" w:w="3118"/>
+            <w:shd w:val="clear" w:color="auto" w:fill="1F3564"/>
+          </w:tcPr>
+          <w:p>
+            <w:pPr>
+              <w:jc w:val="center"/>
+            </w:pPr>
+            <w:r>
+              <w:rPr>
+                <w:b/>
+                <w:color w:val="FFFFFF"/>
+                <w:sz w:val="19"/>
+              </w:rPr>
+              <w:t>Status</w:t>
+            </w:r>
+          </w:p>
+        </w:tc>
+      </w:tr>
+      <w:tr>
+        <w:tc>
+          <w:tcPr>
+            <w:tcW w:type="dxa" w:w="1134"/>
+            <w:shd w:val="clear" w:color="auto" w:fill="F2F2F2"/>
+          </w:tcPr>
+          <w:p>
+            <w:r>
+              <w:rPr>
+                <w:sz w:val="19"/>
+              </w:rPr>
+              <w:t>T-001</w:t>
+            </w:r>
+          </w:p>
+        </w:tc>
+        <w:tc>
+          <w:tcPr>
+            <w:tcW w:type="dxa" w:w="5669"/>
+            <w:shd w:val="clear" w:color="auto" w:fill="F2F2F2"/>
+          </w:tcPr>
+          <w:p>
+            <w:r>
+              <w:rPr>
+                <w:sz w:val="19"/>
+              </w:rPr>
+              <w:t>Small module — Tier 1, full traceability</w:t>
+            </w:r>
+          </w:p>
+        </w:tc>
+        <w:tc>
+          <w:tcPr>
+            <w:tcW w:type="dxa" w:w="3118"/>
+            <w:shd w:val="clear" w:color="auto" w:fill="F2F2F2"/>
+          </w:tcPr>
+          <w:p>
+            <w:r>
+              <w:rPr>
+                <w:sz w:val="19"/>
+              </w:rPr>
+              <w:t>✅ PASS</w:t>
+            </w:r>
+          </w:p>
+        </w:tc>
+      </w:tr>
+      <w:tr>
+        <w:tc>
+          <w:tcPr>
+            <w:tcW w:type="dxa" w:w="1134"/>
+            <w:shd w:val="clear" w:color="auto" w:fill="FFFFFF"/>
+          </w:tcPr>
+          <w:p>
+            <w:r>
+              <w:rPr>
+                <w:sz w:val="19"/>
+              </w:rPr>
+              <w:t>T-002</w:t>
+            </w:r>
+          </w:p>
+        </w:tc>
+        <w:tc>
+          <w:tcPr>
+            <w:tcW w:type="dxa" w:w="5669"/>
+            <w:shd w:val="clear" w:color="auto" w:fill="FFFFFF"/>
+          </w:tcPr>
+          <w:p>
+            <w:r>
+              <w:rPr>
+                <w:sz w:val="19"/>
+              </w:rPr>
+              <w:t>Standard multi-module — Tier 2, 2 modules</w:t>
+            </w:r>
+          </w:p>
+        </w:tc>
+        <w:tc>
+          <w:tcPr>
+            <w:tcW w:type="dxa" w:w="3118"/>
+            <w:shd w:val="clear" w:color="auto" w:fill="FFFFFF"/>
+          </w:tcPr>
+          <w:p>
+            <w:r>
+              <w:rPr>
+                <w:sz w:val="19"/>
+              </w:rPr>
+              <w:t>✅ PASS</w:t>
+            </w:r>
+          </w:p>
+        </w:tc>
+      </w:tr>
+      <w:tr>
+        <w:tc>
+          <w:tcPr>
+            <w:tcW w:type="dxa" w:w="1134"/>
+            <w:shd w:val="clear" w:color="auto" w:fill="F2F2F2"/>
+          </w:tcPr>
+          <w:p>
+            <w:r>
+              <w:rPr>
+                <w:sz w:val="19"/>
+              </w:rPr>
+              <w:t>T-003</w:t>
+            </w:r>
+          </w:p>
+        </w:tc>
+        <w:tc>
+          <w:tcPr>
+            <w:tcW w:type="dxa" w:w="5669"/>
+            <w:shd w:val="clear" w:color="auto" w:fill="F2F2F2"/>
+          </w:tcPr>
+          <w:p>
+            <w:r>
+              <w:rPr>
+                <w:sz w:val="19"/>
+              </w:rPr>
+              <w:t>Large PRD + migration + integrations — Tier 3</w:t>
+            </w:r>
+          </w:p>
+        </w:tc>
+        <w:tc>
+          <w:tcPr>
+            <w:tcW w:type="dxa" w:w="3118"/>
+            <w:shd w:val="clear" w:color="auto" w:fill="F2F2F2"/>
+          </w:tcPr>
+          <w:p>
+            <w:r>
+              <w:rPr>
+                <w:sz w:val="19"/>
+              </w:rPr>
+              <w:t>✅ PASS</w:t>
+            </w:r>
+          </w:p>
+        </w:tc>
+      </w:tr>
+      <w:tr>
+        <w:tc>
+          <w:tcPr>
+            <w:tcW w:type="dxa" w:w="1134"/>
+            <w:shd w:val="clear" w:color="auto" w:fill="FFFFFF"/>
+          </w:tcPr>
+          <w:p>
+            <w:r>
+              <w:rPr>
+                <w:sz w:val="19"/>
+              </w:rPr>
+              <w:t>T-004</w:t>
+            </w:r>
+          </w:p>
+        </w:tc>
+        <w:tc>
+          <w:tcPr>
+            <w:tcW w:type="dxa" w:w="5669"/>
+            <w:shd w:val="clear" w:color="auto" w:fill="FFFFFF"/>
+          </w:tcPr>
+          <w:p>
+            <w:r>
+              <w:rPr>
+                <w:sz w:val="19"/>
+              </w:rPr>
+              <w:t>Missing auth — B-001 blocker, no invented provider</w:t>
+            </w:r>
+          </w:p>
+        </w:tc>
+        <w:tc>
+          <w:tcPr>
+            <w:tcW w:type="dxa" w:w="3118"/>
+            <w:shd w:val="clear" w:color="auto" w:fill="FFFFFF"/>
+          </w:tcPr>
+          <w:p>
+            <w:r>
+              <w:rPr>
+                <w:sz w:val="19"/>
+              </w:rPr>
+              <w:t>✅ PASS</w:t>
+            </w:r>
+          </w:p>
+        </w:tc>
+      </w:tr>
+      <w:tr>
+        <w:tc>
+          <w:tcPr>
+            <w:tcW w:type="dxa" w:w="1134"/>
+            <w:shd w:val="clear" w:color="auto" w:fill="F2F2F2"/>
+          </w:tcPr>
+          <w:p>
+            <w:r>
+              <w:rPr>
+                <w:sz w:val="19"/>
+              </w:rPr>
+              <w:t>T-005</w:t>
+            </w:r>
+          </w:p>
+        </w:tc>
+        <w:tc>
+          <w:tcPr>
+            <w:tcW w:type="dxa" w:w="5669"/>
+            <w:shd w:val="clear" w:color="auto" w:fill="F2F2F2"/>
+          </w:tcPr>
+          <w:p>
+            <w:r>
+              <w:rPr>
+                <w:sz w:val="19"/>
+              </w:rPr>
+              <w:t>Contradictory requirements — both facts, B-001</w:t>
+            </w:r>
+          </w:p>
+        </w:tc>
+        <w:tc>
+          <w:tcPr>
+            <w:tcW w:type="dxa" w:w="3118"/>
+            <w:shd w:val="clear" w:color="auto" w:fill="F2F2F2"/>
+          </w:tcPr>
+          <w:p>
+            <w:r>
+              <w:rPr>
+                <w:sz w:val="19"/>
+              </w:rPr>
+              <w:t>✅ PASS</w:t>
+            </w:r>
+          </w:p>
+        </w:tc>
+      </w:tr>
+      <w:tr>
+        <w:tc>
+          <w:tcPr>
+            <w:tcW w:type="dxa" w:w="1134"/>
+            <w:shd w:val="clear" w:color="auto" w:fill="FFFFFF"/>
+          </w:tcPr>
+          <w:p>
+            <w:r>
+              <w:rPr>
+                <w:sz w:val="19"/>
+              </w:rPr>
+              <w:t>T-006</w:t>
+            </w:r>
+          </w:p>
+        </w:tc>
+        <w:tc>
+          <w:tcPr>
+            <w:tcW w:type="dxa" w:w="5669"/>
+            <w:shd w:val="clear" w:color="auto" w:fill="FFFFFF"/>
+          </w:tcPr>
+          <w:p>
+            <w:r>
+              <w:rPr>
+                <w:sz w:val="19"/>
+              </w:rPr>
+              <w:t>Explicit PRD technology — prd_stated preserved</w:t>
+            </w:r>
+          </w:p>
+        </w:tc>
+        <w:tc>
+          <w:tcPr>
+            <w:tcW w:type="dxa" w:w="3118"/>
+            <w:shd w:val="clear" w:color="auto" w:fill="FFFFFF"/>
+          </w:tcPr>
+          <w:p>
+            <w:r>
+              <w:rPr>
+                <w:sz w:val="19"/>
+              </w:rPr>
+              <w:t>✅ PASS</w:t>
+            </w:r>
+          </w:p>
+        </w:tc>
+      </w:tr>
+      <w:tr>
+        <w:tc>
+          <w:tcPr>
+            <w:tcW w:type="dxa" w:w="1134"/>
+            <w:shd w:val="clear" w:color="auto" w:fill="F2F2F2"/>
+          </w:tcPr>
+          <w:p>
+            <w:r>
+              <w:rPr>
+                <w:sz w:val="19"/>
+              </w:rPr>
+              <w:t>T-007</w:t>
+            </w:r>
+          </w:p>
+        </w:tc>
+        <w:tc>
+          <w:tcPr>
+            <w:tcW w:type="dxa" w:w="5669"/>
+            <w:shd w:val="clear" w:color="auto" w:fill="F2F2F2"/>
+          </w:tcPr>
+          <w:p>
+            <w:r>
+              <w:rPr>
+                <w:sz w:val="19"/>
+              </w:rPr>
+              <w:t>Unspecified technology — layer open, Q-001</w:t>
+            </w:r>
+          </w:p>
+        </w:tc>
+        <w:tc>
+          <w:tcPr>
+            <w:tcW w:type="dxa" w:w="3118"/>
+            <w:shd w:val="clear" w:color="auto" w:fill="F2F2F2"/>
+          </w:tcPr>
+          <w:p>
+            <w:r>
+              <w:rPr>
+                <w:sz w:val="19"/>
+              </w:rPr>
+              <w:t>✅ PASS</w:t>
+            </w:r>
+          </w:p>
+        </w:tc>
+      </w:tr>
+      <w:tr>
+        <w:tc>
+          <w:tcPr>
+            <w:tcW w:type="dxa" w:w="1134"/>
+            <w:shd w:val="clear" w:color="auto" w:fill="FFFFFF"/>
+          </w:tcPr>
+          <w:p>
+            <w:r>
+              <w:rPr>
+                <w:sz w:val="19"/>
+              </w:rPr>
+              <w:t>T-008</w:t>
+            </w:r>
+          </w:p>
+        </w:tc>
+        <w:tc>
+          <w:tcPr>
+            <w:tcW w:type="dxa" w:w="5669"/>
+            <w:shd w:val="clear" w:color="auto" w:fill="FFFFFF"/>
+          </w:tcPr>
+          <w:p>
+            <w:r>
+              <w:rPr>
+                <w:sz w:val="19"/>
+              </w:rPr>
+              <w:t>Legacy replacement — current/target separated</w:t>
+            </w:r>
+          </w:p>
+        </w:tc>
+        <w:tc>
+          <w:tcPr>
+            <w:tcW w:type="dxa" w:w="3118"/>
+            <w:shd w:val="clear" w:color="auto" w:fill="FFFFFF"/>
+          </w:tcPr>
+          <w:p>
+            <w:r>
+              <w:rPr>
+                <w:sz w:val="19"/>
+              </w:rPr>
+              <w:t>✅ PASS</w:t>
+            </w:r>
+          </w:p>
+        </w:tc>
+      </w:tr>
+      <w:tr>
+        <w:tc>
+          <w:tcPr>
+            <w:tcW w:type="dxa" w:w="1134"/>
+            <w:shd w:val="clear" w:color="auto" w:fill="F2F2F2"/>
+          </w:tcPr>
+          <w:p>
+            <w:r>
+              <w:rPr>
+                <w:sz w:val="19"/>
+              </w:rPr>
+              <w:t>T-009</w:t>
+            </w:r>
+          </w:p>
+        </w:tc>
+        <w:tc>
+          <w:tcPr>
+            <w:tcW w:type="dxa" w:w="5669"/>
+            <w:shd w:val="clear" w:color="auto" w:fill="F2F2F2"/>
+          </w:tcPr>
+          <w:p>
+            <w:r>
+              <w:rPr>
+                <w:sz w:val="19"/>
+              </w:rPr>
+              <w:t>Malformed source — input-integrity blocker</w:t>
+            </w:r>
+          </w:p>
+        </w:tc>
+        <w:tc>
+          <w:tcPr>
+            <w:tcW w:type="dxa" w:w="3118"/>
+            <w:shd w:val="clear" w:color="auto" w:fill="F2F2F2"/>
+          </w:tcPr>
+          <w:p>
+            <w:r>
+              <w:rPr>
+                <w:sz w:val="19"/>
+              </w:rPr>
+              <w:t>✅ PASS</w:t>
+            </w:r>
+          </w:p>
+        </w:tc>
+      </w:tr>
+      <w:tr>
+        <w:tc>
+          <w:tcPr>
+            <w:tcW w:type="dxa" w:w="1134"/>
+            <w:shd w:val="clear" w:color="auto" w:fill="FFFFFF"/>
+          </w:tcPr>
+          <w:p>
+            <w:r>
+              <w:rPr>
+                <w:sz w:val="19"/>
+              </w:rPr>
+              <w:t>T-010</w:t>
+            </w:r>
+          </w:p>
+        </w:tc>
+        <w:tc>
+          <w:tcPr>
+            <w:tcW w:type="dxa" w:w="5669"/>
+            <w:shd w:val="clear" w:color="auto" w:fill="FFFFFF"/>
+          </w:tcPr>
+          <w:p>
+            <w:r>
+              <w:rPr>
+                <w:sz w:val="19"/>
+              </w:rPr>
+              <w:t>Regression — invented IdP defect stays fixed</w:t>
+            </w:r>
+          </w:p>
+        </w:tc>
+        <w:tc>
+          <w:tcPr>
+            <w:tcW w:type="dxa" w:w="3118"/>
+            <w:shd w:val="clear" w:color="auto" w:fill="FFFFFF"/>
+          </w:tcPr>
+          <w:p>
+            <w:r>
+              <w:rPr>
+                <w:sz w:val="19"/>
+              </w:rPr>
+              <w:t>✅ PASS</w:t>
+            </w:r>
+          </w:p>
+        </w:tc>
+      </w:tr>
+    </w:tbl>
+    <w:p/>
+    <w:p/>
+    <w:p>
+      <w:pPr>
+        <w:spacing w:after="80" w:before="40"/>
+      </w:pPr>
+      <w:r>
+        <w:rPr>
+          <w:b/>
+          <w:i w:val="0"/>
+          <w:color w:val="1E8B4C"/>
+          <w:sz w:val="21"/>
+        </w:rPr>
+        <w:t>10/10 PASS  |  Health: 38 PASS, 0 FAIL  |  Tag: v1.4.0</w:t>
+      </w:r>
+    </w:p>
+    <w:p>
+      <w:r>
+        <w:br w:type="page"/>
+      </w:r>
+    </w:p>
+    <w:p>
+      <w:pPr>
+        <w:pStyle w:val="Heading1"/>
+        <w:spacing w:before="360" w:after="160"/>
+      </w:pPr>
+      <w:r>
+        <w:rPr>
+          <w:b/>
+          <w:color w:val="2763AB"/>
+          <w:sz w:val="36"/>
+        </w:rPr>
+        <w:t>Phase 5 — Governance and Operations</w:t>
+      </w:r>
+    </w:p>
+    <w:p>
+      <w:pPr>
+        <w:spacing w:after="80" w:before="40"/>
+      </w:pPr>
+      <w:r>
+        <w:rPr>
+          <w:b w:val="0"/>
+          <w:i w:val="0"/>
+          <w:color w:val="000000"/>
+          <w:sz w:val="21"/>
+        </w:rPr>
+        <w:t>Phase 5 is the operational layer. It provides the CI pipeline, execution evidence per run, periodic metrics, release policy, and the promotion rule check that formally determines whether the skill is ready for production.</w:t>
+      </w:r>
+    </w:p>
+    <w:p/>
+    <w:p>
+      <w:pPr>
+        <w:pStyle w:val="Heading2"/>
+        <w:spacing w:before="360" w:after="160"/>
+      </w:pPr>
+      <w:r>
+        <w:rPr>
+          <w:b/>
+          <w:color w:val="1F3564"/>
+          <w:sz w:val="30"/>
+        </w:rPr>
+        <w:t>What Was Built in Phase 5</w:t>
+      </w:r>
+    </w:p>
+    <w:tbl>
+      <w:tblPr>
+        <w:tblStyle w:val="TableGrid"/>
+        <w:tblW w:type="auto" w:w="0"/>
+        <w:jc w:val="left"/>
+        <w:tblLook w:firstColumn="1" w:firstRow="1" w:lastColumn="0" w:lastRow="0" w:noHBand="0" w:noVBand="1" w:val="04A0"/>
+      </w:tblPr>
+      <w:tblGrid>
+        <w:gridCol w:w="4703"/>
+        <w:gridCol w:w="4703"/>
+      </w:tblGrid>
+      <w:tr>
+        <w:tc>
+          <w:tcPr>
+            <w:tcW w:type="dxa" w:w="3118"/>
+            <w:shd w:val="clear" w:color="auto" w:fill="1F3564"/>
+          </w:tcPr>
+          <w:p>
+            <w:pPr>
+              <w:jc w:val="center"/>
+            </w:pPr>
+            <w:r>
+              <w:rPr>
+                <w:b/>
+                <w:color w:val="FFFFFF"/>
+                <w:sz w:val="19"/>
+              </w:rPr>
+              <w:t>File</w:t>
+            </w:r>
+          </w:p>
+        </w:tc>
+        <w:tc>
+          <w:tcPr>
+            <w:tcW w:type="dxa" w:w="6803"/>
+            <w:shd w:val="clear" w:color="auto" w:fill="1F3564"/>
+          </w:tcPr>
+          <w:p>
+            <w:pPr>
+              <w:jc w:val="center"/>
+            </w:pPr>
+            <w:r>
+              <w:rPr>
+                <w:b/>
+                <w:color w:val="FFFFFF"/>
+                <w:sz w:val="19"/>
+              </w:rPr>
+              <w:t>Purpose</w:t>
+            </w:r>
+          </w:p>
+        </w:tc>
+      </w:tr>
+      <w:tr>
+        <w:tc>
+          <w:tcPr>
+            <w:tcW w:type="dxa" w:w="3118"/>
+            <w:shd w:val="clear" w:color="auto" w:fill="F2F2F2"/>
+          </w:tcPr>
+          <w:p>
+            <w:r>
+              <w:rPr>
+                <w:sz w:val="19"/>
+              </w:rPr>
+              <w:t>phase5/release-gate.js</w:t>
+            </w:r>
+          </w:p>
+        </w:tc>
+        <w:tc>
+          <w:tcPr>
+            <w:tcW w:type="dxa" w:w="6803"/>
+            <w:shd w:val="clear" w:color="auto" w:fill="F2F2F2"/>
+          </w:tcPr>
+          <w:p>
+            <w:r>
+              <w:rPr>
+                <w:sz w:val="19"/>
+              </w:rPr>
+              <w:t>G-001–G-010 — 10 gates that must all pass before tagging</w:t>
+            </w:r>
+          </w:p>
+        </w:tc>
+      </w:tr>
+      <w:tr>
+        <w:tc>
+          <w:tcPr>
+            <w:tcW w:type="dxa" w:w="3118"/>
+            <w:shd w:val="clear" w:color="auto" w:fill="FFFFFF"/>
+          </w:tcPr>
+          <w:p>
+            <w:r>
+              <w:rPr>
+                <w:sz w:val="19"/>
+              </w:rPr>
+              <w:t>phase5/execution-metadata-logger.js</w:t>
+            </w:r>
+          </w:p>
+        </w:tc>
+        <w:tc>
+          <w:tcPr>
+            <w:tcW w:type="dxa" w:w="6803"/>
+            <w:shd w:val="clear" w:color="auto" w:fill="FFFFFF"/>
+          </w:tcPr>
+          <w:p>
+            <w:r>
+              <w:rPr>
+                <w:sz w:val="19"/>
+              </w:rPr>
+              <w:t>start/complete/list — records run_id, PRD hash, duration, validation status (§61)</w:t>
+            </w:r>
+          </w:p>
+        </w:tc>
+      </w:tr>
+      <w:tr>
+        <w:tc>
+          <w:tcPr>
+            <w:tcW w:type="dxa" w:w="3118"/>
+            <w:shd w:val="clear" w:color="auto" w:fill="F2F2F2"/>
+          </w:tcPr>
+          <w:p>
+            <w:r>
+              <w:rPr>
+                <w:sz w:val="19"/>
+              </w:rPr>
+              <w:t>phase5/metrics-report.js</w:t>
+            </w:r>
+          </w:p>
+        </w:tc>
+        <w:tc>
+          <w:tcPr>
+            <w:tcW w:type="dxa" w:w="6803"/>
+            <w:shd w:val="clear" w:color="auto" w:fill="F2F2F2"/>
+          </w:tcPr>
+          <w:p>
+            <w:r>
+              <w:rPr>
+                <w:sz w:val="19"/>
+              </w:rPr>
+              <w:t>Periodic metrics — success rate, blockers, review status (§66)</w:t>
+            </w:r>
+          </w:p>
+        </w:tc>
+      </w:tr>
+      <w:tr>
+        <w:tc>
+          <w:tcPr>
+            <w:tcW w:type="dxa" w:w="3118"/>
+            <w:shd w:val="clear" w:color="auto" w:fill="FFFFFF"/>
+          </w:tcPr>
+          <w:p>
+            <w:r>
+              <w:rPr>
+                <w:sz w:val="19"/>
+              </w:rPr>
+              <w:t>phase5/RELEASE-POLICY.md</w:t>
+            </w:r>
+          </w:p>
+        </w:tc>
+        <w:tc>
+          <w:tcPr>
+            <w:tcW w:type="dxa" w:w="6803"/>
+            <w:shd w:val="clear" w:color="auto" w:fill="FFFFFF"/>
+          </w:tcPr>
+          <w:p>
+            <w:r>
+              <w:rPr>
+                <w:sz w:val="19"/>
+              </w:rPr>
+              <w:t>Branching, roles, rollback, deviations, incident process</w:t>
+            </w:r>
+          </w:p>
+        </w:tc>
+      </w:tr>
+      <w:tr>
+        <w:tc>
+          <w:tcPr>
+            <w:tcW w:type="dxa" w:w="3118"/>
+            <w:shd w:val="clear" w:color="auto" w:fill="F2F2F2"/>
+          </w:tcPr>
+          <w:p>
+            <w:r>
+              <w:rPr>
+                <w:sz w:val="19"/>
+              </w:rPr>
+              <w:t>.github/workflows/ci.yml</w:t>
+            </w:r>
+          </w:p>
+        </w:tc>
+        <w:tc>
+          <w:tcPr>
+            <w:tcW w:type="dxa" w:w="6803"/>
+            <w:shd w:val="clear" w:color="auto" w:fill="F2F2F2"/>
+          </w:tcPr>
+          <w:p>
+            <w:r>
+              <w:rPr>
+                <w:sz w:val="19"/>
+              </w:rPr>
+              <w:t>5-job CI pipeline on every push to main</w:t>
+            </w:r>
+          </w:p>
+        </w:tc>
+      </w:tr>
+    </w:tbl>
+    <w:p/>
+    <w:p/>
+    <w:p>
+      <w:pPr>
+        <w:pStyle w:val="Heading2"/>
+        <w:spacing w:before="360" w:after="160"/>
+      </w:pPr>
+      <w:r>
+        <w:rPr>
+          <w:b/>
+          <w:color w:val="1F3564"/>
+          <w:sz w:val="30"/>
+        </w:rPr>
+        <w:t>Release Gate Result — v1.5.0</w:t>
+      </w:r>
+    </w:p>
+    <w:tbl>
+      <w:tblPr>
+        <w:tblStyle w:val="TableGrid"/>
+        <w:tblW w:type="auto" w:w="0"/>
+        <w:jc w:val="left"/>
+        <w:tblLook w:firstColumn="1" w:firstRow="1" w:lastColumn="0" w:lastRow="0" w:noHBand="0" w:noVBand="1" w:val="04A0"/>
+      </w:tblPr>
+      <w:tblGrid>
+        <w:gridCol w:w="3135"/>
+        <w:gridCol w:w="3135"/>
+        <w:gridCol w:w="3135"/>
+      </w:tblGrid>
+      <w:tr>
+        <w:tc>
+          <w:tcPr>
+            <w:tcW w:type="dxa" w:w="1134"/>
+            <w:shd w:val="clear" w:color="auto" w:fill="1F3564"/>
+          </w:tcPr>
+          <w:p>
+            <w:pPr>
+              <w:jc w:val="center"/>
+            </w:pPr>
+            <w:r>
+              <w:rPr>
+                <w:b/>
+                <w:color w:val="FFFFFF"/>
+                <w:sz w:val="19"/>
+              </w:rPr>
+              <w:t>Gate</w:t>
+            </w:r>
+          </w:p>
+        </w:tc>
+        <w:tc>
+          <w:tcPr>
+            <w:tcW w:type="dxa" w:w="850"/>
+            <w:shd w:val="clear" w:color="auto" w:fill="1F3564"/>
+          </w:tcPr>
+          <w:p>
+            <w:pPr>
+              <w:jc w:val="center"/>
+            </w:pPr>
+            <w:r>
+              <w:rPr>
+                <w:b/>
+                <w:color w:val="FFFFFF"/>
+                <w:sz w:val="19"/>
+              </w:rPr>
+              <w:t>Status</w:t>
+            </w:r>
+          </w:p>
+        </w:tc>
+        <w:tc>
+          <w:tcPr>
+            <w:tcW w:type="dxa" w:w="7937"/>
+            <w:shd w:val="clear" w:color="auto" w:fill="1F3564"/>
+          </w:tcPr>
+          <w:p>
+            <w:pPr>
+              <w:jc w:val="center"/>
+            </w:pPr>
+            <w:r>
+              <w:rPr>
+                <w:b/>
+                <w:color w:val="FFFFFF"/>
+                <w:sz w:val="19"/>
+              </w:rPr>
+              <w:t>Evidence</w:t>
+            </w:r>
+          </w:p>
+        </w:tc>
+      </w:tr>
+      <w:tr>
+        <w:tc>
+          <w:tcPr>
+            <w:tcW w:type="dxa" w:w="1134"/>
+            <w:shd w:val="clear" w:color="auto" w:fill="F2F2F2"/>
+          </w:tcPr>
+          <w:p>
+            <w:r>
+              <w:rPr>
+                <w:sz w:val="19"/>
+              </w:rPr>
+              <w:t>G-001</w:t>
+            </w:r>
+          </w:p>
+        </w:tc>
+        <w:tc>
+          <w:tcPr>
+            <w:tcW w:type="dxa" w:w="850"/>
+            <w:shd w:val="clear" w:color="auto" w:fill="F2F2F2"/>
+          </w:tcPr>
+          <w:p>
+            <w:r>
+              <w:rPr>
+                <w:sz w:val="19"/>
+              </w:rPr>
+              <w:t>✅</w:t>
+            </w:r>
+          </w:p>
+        </w:tc>
+        <w:tc>
+          <w:tcPr>
+            <w:tcW w:type="dxa" w:w="7937"/>
+            <w:shd w:val="clear" w:color="auto" w:fill="F2F2F2"/>
+          </w:tcPr>
+          <w:p>
+            <w:r>
+              <w:rPr>
+                <w:sz w:val="19"/>
+              </w:rPr>
+              <w:t>Version 1.5.0 matches manifest</w:t>
+            </w:r>
+          </w:p>
+        </w:tc>
+      </w:tr>
+      <w:tr>
+        <w:tc>
+          <w:tcPr>
+            <w:tcW w:type="dxa" w:w="1134"/>
+            <w:shd w:val="clear" w:color="auto" w:fill="FFFFFF"/>
+          </w:tcPr>
+          <w:p>
+            <w:r>
+              <w:rPr>
+                <w:sz w:val="19"/>
+              </w:rPr>
+              <w:t>G-002</w:t>
+            </w:r>
+          </w:p>
+        </w:tc>
+        <w:tc>
+          <w:tcPr>
+            <w:tcW w:type="dxa" w:w="850"/>
+            <w:shd w:val="clear" w:color="auto" w:fill="FFFFFF"/>
+          </w:tcPr>
+          <w:p>
+            <w:r>
+              <w:rPr>
+                <w:sz w:val="19"/>
+              </w:rPr>
+              <w:t>✅</w:t>
+            </w:r>
+          </w:p>
+        </w:tc>
+        <w:tc>
+          <w:tcPr>
+            <w:tcW w:type="dxa" w:w="7937"/>
+            <w:shd w:val="clear" w:color="auto" w:fill="FFFFFF"/>
+          </w:tcPr>
+          <w:p>
+            <w:r>
+              <w:rPr>
+                <w:sz w:val="19"/>
+              </w:rPr>
+              <w:t>Health: 44 PASS, 0 FAIL</w:t>
+            </w:r>
+          </w:p>
+        </w:tc>
+      </w:tr>
+      <w:tr>
+        <w:tc>
+          <w:tcPr>
+            <w:tcW w:type="dxa" w:w="1134"/>
+            <w:shd w:val="clear" w:color="auto" w:fill="F2F2F2"/>
+          </w:tcPr>
+          <w:p>
+            <w:r>
+              <w:rPr>
+                <w:sz w:val="19"/>
+              </w:rPr>
+              <w:t>G-003</w:t>
+            </w:r>
+          </w:p>
+        </w:tc>
+        <w:tc>
+          <w:tcPr>
+            <w:tcW w:type="dxa" w:w="850"/>
+            <w:shd w:val="clear" w:color="auto" w:fill="F2F2F2"/>
+          </w:tcPr>
+          <w:p>
+            <w:r>
+              <w:rPr>
+                <w:sz w:val="19"/>
+              </w:rPr>
+              <w:t>✅</w:t>
+            </w:r>
+          </w:p>
+        </w:tc>
+        <w:tc>
+          <w:tcPr>
+            <w:tcW w:type="dxa" w:w="7937"/>
+            <w:shd w:val="clear" w:color="auto" w:fill="F2F2F2"/>
+          </w:tcPr>
+          <w:p>
+            <w:r>
+              <w:rPr>
+                <w:sz w:val="19"/>
+              </w:rPr>
+              <w:t>PRD index: 601 requirements</w:t>
+            </w:r>
+          </w:p>
+        </w:tc>
+      </w:tr>
+      <w:tr>
+        <w:tc>
+          <w:tcPr>
+            <w:tcW w:type="dxa" w:w="1134"/>
+            <w:shd w:val="clear" w:color="auto" w:fill="FFFFFF"/>
+          </w:tcPr>
+          <w:p>
+            <w:r>
+              <w:rPr>
+                <w:sz w:val="19"/>
+              </w:rPr>
+              <w:t>G-004</w:t>
+            </w:r>
+          </w:p>
+        </w:tc>
+        <w:tc>
+          <w:tcPr>
+            <w:tcW w:type="dxa" w:w="850"/>
+            <w:shd w:val="clear" w:color="auto" w:fill="FFFFFF"/>
+          </w:tcPr>
+          <w:p>
+            <w:r>
+              <w:rPr>
+                <w:sz w:val="19"/>
+              </w:rPr>
+              <w:t>✅</w:t>
+            </w:r>
+          </w:p>
+        </w:tc>
+        <w:tc>
+          <w:tcPr>
+            <w:tcW w:type="dxa" w:w="7937"/>
+            <w:shd w:val="clear" w:color="auto" w:fill="FFFFFF"/>
+          </w:tcPr>
+          <w:p>
+            <w:r>
+              <w:rPr>
+                <w:sz w:val="19"/>
+              </w:rPr>
+              <w:t>Tier routing: 7/7 passed</w:t>
+            </w:r>
+          </w:p>
+        </w:tc>
+      </w:tr>
+      <w:tr>
+        <w:tc>
+          <w:tcPr>
+            <w:tcW w:type="dxa" w:w="1134"/>
+            <w:shd w:val="clear" w:color="auto" w:fill="F2F2F2"/>
+          </w:tcPr>
+          <w:p>
+            <w:r>
+              <w:rPr>
+                <w:sz w:val="19"/>
+              </w:rPr>
+              <w:t>G-005</w:t>
+            </w:r>
+          </w:p>
+        </w:tc>
+        <w:tc>
+          <w:tcPr>
+            <w:tcW w:type="dxa" w:w="850"/>
+            <w:shd w:val="clear" w:color="auto" w:fill="F2F2F2"/>
+          </w:tcPr>
+          <w:p>
+            <w:r>
+              <w:rPr>
+                <w:sz w:val="19"/>
+              </w:rPr>
+              <w:t>✅</w:t>
+            </w:r>
+          </w:p>
+        </w:tc>
+        <w:tc>
+          <w:tcPr>
+            <w:tcW w:type="dxa" w:w="7937"/>
+            <w:shd w:val="clear" w:color="auto" w:fill="F2F2F2"/>
+          </w:tcPr>
+          <w:p>
+            <w:r>
+              <w:rPr>
+                <w:sz w:val="19"/>
+              </w:rPr>
+              <w:t>Verification: 10/10 passed</w:t>
+            </w:r>
+          </w:p>
+        </w:tc>
+      </w:tr>
+      <w:tr>
+        <w:tc>
+          <w:tcPr>
+            <w:tcW w:type="dxa" w:w="1134"/>
+            <w:shd w:val="clear" w:color="auto" w:fill="FFFFFF"/>
+          </w:tcPr>
+          <w:p>
+            <w:r>
+              <w:rPr>
+                <w:sz w:val="19"/>
+              </w:rPr>
+              <w:t>G-006</w:t>
+            </w:r>
+          </w:p>
+        </w:tc>
+        <w:tc>
+          <w:tcPr>
+            <w:tcW w:type="dxa" w:w="850"/>
+            <w:shd w:val="clear" w:color="auto" w:fill="FFFFFF"/>
+          </w:tcPr>
+          <w:p>
+            <w:r>
+              <w:rPr>
+                <w:sz w:val="19"/>
+              </w:rPr>
+              <w:t>✅</w:t>
+            </w:r>
+          </w:p>
+        </w:tc>
+        <w:tc>
+          <w:tcPr>
+            <w:tcW w:type="dxa" w:w="7937"/>
+            <w:shd w:val="clear" w:color="auto" w:fill="FFFFFF"/>
+          </w:tcPr>
+          <w:p>
+            <w:r>
+              <w:rPr>
+                <w:sz w:val="19"/>
+              </w:rPr>
+              <w:t>Baseline signed: Sushma S</w:t>
+            </w:r>
+          </w:p>
+        </w:tc>
+      </w:tr>
+      <w:tr>
+        <w:tc>
+          <w:tcPr>
+            <w:tcW w:type="dxa" w:w="1134"/>
+            <w:shd w:val="clear" w:color="auto" w:fill="F2F2F2"/>
+          </w:tcPr>
+          <w:p>
+            <w:r>
+              <w:rPr>
+                <w:sz w:val="19"/>
+              </w:rPr>
+              <w:t>G-007</w:t>
+            </w:r>
+          </w:p>
+        </w:tc>
+        <w:tc>
+          <w:tcPr>
+            <w:tcW w:type="dxa" w:w="850"/>
+            <w:shd w:val="clear" w:color="auto" w:fill="F2F2F2"/>
+          </w:tcPr>
+          <w:p>
+            <w:r>
+              <w:rPr>
+                <w:sz w:val="19"/>
+              </w:rPr>
+              <w:t>✅</w:t>
+            </w:r>
+          </w:p>
+        </w:tc>
+        <w:tc>
+          <w:tcPr>
+            <w:tcW w:type="dxa" w:w="7937"/>
+            <w:shd w:val="clear" w:color="auto" w:fill="F2F2F2"/>
+          </w:tcPr>
+          <w:p>
+            <w:r>
+              <w:rPr>
+                <w:sz w:val="19"/>
+              </w:rPr>
+              <w:t>CHANGELOG.md mentions v1.5.0</w:t>
+            </w:r>
+          </w:p>
+        </w:tc>
+      </w:tr>
+      <w:tr>
+        <w:tc>
+          <w:tcPr>
+            <w:tcW w:type="dxa" w:w="1134"/>
+            <w:shd w:val="clear" w:color="auto" w:fill="FFFFFF"/>
+          </w:tcPr>
+          <w:p>
+            <w:r>
+              <w:rPr>
+                <w:sz w:val="19"/>
+              </w:rPr>
+              <w:t>G-008</w:t>
+            </w:r>
+          </w:p>
+        </w:tc>
+        <w:tc>
+          <w:tcPr>
+            <w:tcW w:type="dxa" w:w="850"/>
+            <w:shd w:val="clear" w:color="auto" w:fill="FFFFFF"/>
+          </w:tcPr>
+          <w:p>
+            <w:r>
+              <w:rPr>
+                <w:sz w:val="19"/>
+              </w:rPr>
+              <w:t>✅</w:t>
+            </w:r>
+          </w:p>
+        </w:tc>
+        <w:tc>
+          <w:tcPr>
+            <w:tcW w:type="dxa" w:w="7937"/>
+            <w:shd w:val="clear" w:color="auto" w:fill="FFFFFF"/>
+          </w:tcPr>
+          <w:p>
+            <w:r>
+              <w:rPr>
+                <w:sz w:val="19"/>
+              </w:rPr>
+              <w:t>SKILL.md: no conflict markers</w:t>
+            </w:r>
+          </w:p>
+        </w:tc>
+      </w:tr>
+      <w:tr>
+        <w:tc>
+          <w:tcPr>
+            <w:tcW w:type="dxa" w:w="1134"/>
+            <w:shd w:val="clear" w:color="auto" w:fill="F2F2F2"/>
+          </w:tcPr>
+          <w:p>
+            <w:r>
+              <w:rPr>
+                <w:sz w:val="19"/>
+              </w:rPr>
+              <w:t>G-009</w:t>
+            </w:r>
+          </w:p>
+        </w:tc>
+        <w:tc>
+          <w:tcPr>
+            <w:tcW w:type="dxa" w:w="850"/>
+            <w:shd w:val="clear" w:color="auto" w:fill="F2F2F2"/>
+          </w:tcPr>
+          <w:p>
+            <w:r>
+              <w:rPr>
+                <w:sz w:val="19"/>
+              </w:rPr>
+              <w:t>✅</w:t>
+            </w:r>
+          </w:p>
+        </w:tc>
+        <w:tc>
+          <w:tcPr>
+            <w:tcW w:type="dxa" w:w="7937"/>
+            <w:shd w:val="clear" w:color="auto" w:fill="F2F2F2"/>
+          </w:tcPr>
+          <w:p>
+            <w:r>
+              <w:rPr>
+                <w:sz w:val="19"/>
+              </w:rPr>
+              <w:t>Git tag v1.5.0 exists</w:t>
+            </w:r>
+          </w:p>
+        </w:tc>
+      </w:tr>
+      <w:tr>
+        <w:tc>
+          <w:tcPr>
+            <w:tcW w:type="dxa" w:w="1134"/>
+            <w:shd w:val="clear" w:color="auto" w:fill="FFFFFF"/>
+          </w:tcPr>
+          <w:p>
+            <w:r>
+              <w:rPr>
+                <w:sz w:val="19"/>
+              </w:rPr>
+              <w:t>G-010</w:t>
+            </w:r>
+          </w:p>
+        </w:tc>
+        <w:tc>
+          <w:tcPr>
+            <w:tcW w:type="dxa" w:w="850"/>
+            <w:shd w:val="clear" w:color="auto" w:fill="FFFFFF"/>
+          </w:tcPr>
+          <w:p>
+            <w:r>
+              <w:rPr>
+                <w:sz w:val="19"/>
+              </w:rPr>
+              <w:t>✅</w:t>
+            </w:r>
+          </w:p>
+        </w:tc>
+        <w:tc>
+          <w:tcPr>
+            <w:tcW w:type="dxa" w:w="7937"/>
+            <w:shd w:val="clear" w:color="auto" w:fill="FFFFFF"/>
+          </w:tcPr>
+          <w:p>
+            <w:r>
+              <w:rPr>
+                <w:sz w:val="19"/>
+              </w:rPr>
+              <w:t>Status: enterprise-governed-specification</w:t>
+            </w:r>
+          </w:p>
+        </w:tc>
+      </w:tr>
+    </w:tbl>
+    <w:p/>
+    <w:p/>
+    <w:p>
+      <w:pPr>
+        <w:spacing w:after="80" w:before="40"/>
+      </w:pPr>
+      <w:r>
+        <w:rPr>
+          <w:b/>
+          <w:i w:val="0"/>
+          <w:color w:val="1E8B4C"/>
+          <w:sz w:val="24"/>
+        </w:rPr>
+        <w:t>Release decision: 10/10 PASS — APPROVED ✓</w:t>
+      </w:r>
+    </w:p>
+    <w:p/>
+    <w:p>
+      <w:pPr>
+        <w:pStyle w:val="Heading2"/>
+        <w:spacing w:before="360" w:after="160"/>
+      </w:pPr>
+      <w:r>
+        <w:rPr>
+          <w:b/>
+          <w:color w:val="1F3564"/>
+          <w:sz w:val="30"/>
+        </w:rPr>
+        <w:t>Final Maturity Scorecard — All 5 Phases Complete</w:t>
+      </w:r>
+    </w:p>
+    <w:tbl>
+      <w:tblPr>
+        <w:tblStyle w:val="TableGrid"/>
+        <w:tblW w:type="auto" w:w="0"/>
+        <w:tblLook w:firstColumn="1" w:firstRow="1" w:lastColumn="0" w:lastRow="0" w:noHBand="0" w:noVBand="1" w:val="04A0"/>
+      </w:tblPr>
+      <w:tblGrid>
+        <w:gridCol w:w="3135"/>
+        <w:gridCol w:w="3135"/>
+        <w:gridCol w:w="3135"/>
+      </w:tblGrid>
+      <w:tr>
+        <w:tc>
+          <w:tcPr>
+            <w:tcW w:type="dxa" w:w="3969"/>
+            <w:shd w:val="clear" w:color="auto" w:fill="1F3564"/>
+          </w:tcPr>
+          <w:p>
+            <w:r>
+              <w:rPr>
+                <w:b/>
+                <w:color w:val="FFFFFF"/>
+                <w:sz w:val="19"/>
+              </w:rPr>
+              <w:t>Area</w:t>
+            </w:r>
+          </w:p>
+        </w:tc>
+        <w:tc>
+          <w:tcPr>
+            <w:tcW w:type="dxa" w:w="1701"/>
+            <w:shd w:val="clear" w:color="auto" w:fill="1F3564"/>
+          </w:tcPr>
+          <w:p>
+            <w:r>
+              <w:rPr>
+                <w:b/>
+                <w:color w:val="FFFFFF"/>
+                <w:sz w:val="19"/>
+              </w:rPr>
+              <w:t>Final Rating</w:t>
+            </w:r>
+          </w:p>
+        </w:tc>
+        <w:tc>
+          <w:tcPr>
+            <w:tcW w:type="dxa" w:w="4252"/>
+            <w:shd w:val="clear" w:color="auto" w:fill="1F3564"/>
+          </w:tcPr>
+          <w:p>
+            <w:r>
+              <w:rPr>
+                <w:b/>
+                <w:color w:val="FFFFFF"/>
+                <w:sz w:val="19"/>
+              </w:rPr>
+              <w:t>Change</w:t>
+            </w:r>
+          </w:p>
+        </w:tc>
+      </w:tr>
+      <w:tr>
+        <w:tc>
+          <w:tcPr>
+            <w:tcW w:type="dxa" w:w="3969"/>
+            <w:shd w:val="clear" w:color="auto" w:fill="F2F2F2"/>
+          </w:tcPr>
+          <w:p>
+            <w:r>
+              <w:rPr>
+                <w:sz w:val="19"/>
+              </w:rPr>
+              <w:t>Core PRD → Architecture design</w:t>
+            </w:r>
+          </w:p>
+        </w:tc>
+        <w:tc>
+          <w:tcPr>
+            <w:tcW w:type="dxa" w:w="1701"/>
+            <w:shd w:val="clear" w:color="auto" w:fill="FFFFFF"/>
+          </w:tcPr>
+          <w:p>
+            <w:pPr>
+              <w:jc w:val="center"/>
+            </w:pPr>
+            <w:r>
+              <w:rPr>
+                <w:b/>
+                <w:color w:val="1E8B4C"/>
+                <w:sz w:val="19"/>
+              </w:rPr>
+              <w:t>9.2 / 10</w:t>
+            </w:r>
+          </w:p>
+        </w:tc>
+        <w:tc>
+          <w:tcPr>
+            <w:tcW w:type="dxa" w:w="4252"/>
+            <w:shd w:val="clear" w:color="auto" w:fill="FFFFFF"/>
+          </w:tcPr>
+          <w:p>
+            <w:r>
+              <w:rPr>
+                <w:color w:val="555555"/>
+                <w:sz w:val="18"/>
+              </w:rPr>
+              <w:t>→ Unchanged</w:t>
+            </w:r>
+          </w:p>
+        </w:tc>
+      </w:tr>
+      <w:tr>
+        <w:tc>
+          <w:tcPr>
+            <w:tcW w:type="dxa" w:w="3969"/>
+            <w:shd w:val="clear" w:color="auto" w:fill="FFFFFF"/>
+          </w:tcPr>
+          <w:p>
+            <w:r>
+              <w:rPr>
+                <w:sz w:val="19"/>
+              </w:rPr>
+              <w:t>PRD traceability and blocker control</w:t>
+            </w:r>
+          </w:p>
+        </w:tc>
+        <w:tc>
+          <w:tcPr>
+            <w:tcW w:type="dxa" w:w="1701"/>
+            <w:shd w:val="clear" w:color="auto" w:fill="FFFFFF"/>
+          </w:tcPr>
+          <w:p>
+            <w:pPr>
+              <w:jc w:val="center"/>
+            </w:pPr>
+            <w:r>
+              <w:rPr>
+                <w:b/>
+                <w:color w:val="1E8B4C"/>
+                <w:sz w:val="19"/>
+              </w:rPr>
+              <w:t>9.5 / 10</w:t>
+            </w:r>
+          </w:p>
+        </w:tc>
+        <w:tc>
+          <w:tcPr>
+            <w:tcW w:type="dxa" w:w="4252"/>
+            <w:shd w:val="clear" w:color="auto" w:fill="FFFFFF"/>
+          </w:tcPr>
+          <w:p>
+            <w:r>
+              <w:rPr>
+                <w:color w:val="555555"/>
+                <w:sz w:val="18"/>
+              </w:rPr>
+              <w:t>→ Unchanged</w:t>
+            </w:r>
+          </w:p>
+        </w:tc>
+      </w:tr>
+      <w:tr>
+        <w:tc>
+          <w:tcPr>
+            <w:tcW w:type="dxa" w:w="3969"/>
+            <w:shd w:val="clear" w:color="auto" w:fill="F2F2F2"/>
+          </w:tcPr>
+          <w:p>
+            <w:r>
+              <w:rPr>
+                <w:sz w:val="19"/>
+              </w:rPr>
+              <w:t>Enterprise governance specification</w:t>
+            </w:r>
+          </w:p>
+        </w:tc>
+        <w:tc>
+          <w:tcPr>
+            <w:tcW w:type="dxa" w:w="1701"/>
+            <w:shd w:val="clear" w:color="auto" w:fill="FFFFFF"/>
+          </w:tcPr>
+          <w:p>
+            <w:pPr>
+              <w:jc w:val="center"/>
+            </w:pPr>
+            <w:r>
+              <w:rPr>
+                <w:b/>
+                <w:color w:val="1E8B4C"/>
+                <w:sz w:val="19"/>
+              </w:rPr>
+              <w:t>9.5 / 10</w:t>
+            </w:r>
+          </w:p>
+        </w:tc>
+        <w:tc>
+          <w:tcPr>
+            <w:tcW w:type="dxa" w:w="4252"/>
+            <w:shd w:val="clear" w:color="auto" w:fill="FFFFFF"/>
+          </w:tcPr>
+          <w:p>
+            <w:r>
+              <w:rPr>
+                <w:color w:val="1E8B4C"/>
+                <w:sz w:val="18"/>
+              </w:rPr>
+              <w:t>↑ from 8.8</w:t>
+            </w:r>
+          </w:p>
+        </w:tc>
+      </w:tr>
+      <w:tr>
+        <w:tc>
+          <w:tcPr>
+            <w:tcW w:type="dxa" w:w="3969"/>
+            <w:shd w:val="clear" w:color="auto" w:fill="FFFFFF"/>
+          </w:tcPr>
+          <w:p>
+            <w:r>
+              <w:rPr>
+                <w:sz w:val="19"/>
+              </w:rPr>
+              <w:t>Context/token optimisation</w:t>
+            </w:r>
+          </w:p>
+        </w:tc>
+        <w:tc>
+          <w:tcPr>
+            <w:tcW w:type="dxa" w:w="1701"/>
+            <w:shd w:val="clear" w:color="auto" w:fill="FFFFFF"/>
+          </w:tcPr>
+          <w:p>
+            <w:pPr>
+              <w:jc w:val="center"/>
+            </w:pPr>
+            <w:r>
+              <w:rPr>
+                <w:b/>
+                <w:color w:val="1E8B4C"/>
+                <w:sz w:val="19"/>
+              </w:rPr>
+              <w:t>8.0 / 10</w:t>
+            </w:r>
+          </w:p>
+        </w:tc>
+        <w:tc>
+          <w:tcPr>
+            <w:tcW w:type="dxa" w:w="4252"/>
+            <w:shd w:val="clear" w:color="auto" w:fill="FFFFFF"/>
+          </w:tcPr>
+          <w:p>
+            <w:r>
+              <w:rPr>
+                <w:color w:val="1E8B4C"/>
+                <w:sz w:val="18"/>
+              </w:rPr>
+              <w:t>↑ from 7.0</w:t>
+            </w:r>
+          </w:p>
+        </w:tc>
+      </w:tr>
+      <w:tr>
+        <w:tc>
+          <w:tcPr>
+            <w:tcW w:type="dxa" w:w="3969"/>
+            <w:shd w:val="clear" w:color="auto" w:fill="F2F2F2"/>
+          </w:tcPr>
+          <w:p>
+            <w:r>
+              <w:rPr>
+                <w:sz w:val="19"/>
+              </w:rPr>
+              <w:t>Tier-routing approach</w:t>
+            </w:r>
+          </w:p>
+        </w:tc>
+        <w:tc>
+          <w:tcPr>
+            <w:tcW w:type="dxa" w:w="1701"/>
+            <w:shd w:val="clear" w:color="auto" w:fill="FFFFFF"/>
+          </w:tcPr>
+          <w:p>
+            <w:pPr>
+              <w:jc w:val="center"/>
+            </w:pPr>
+            <w:r>
+              <w:rPr>
+                <w:b/>
+                <w:color w:val="1E8B4C"/>
+                <w:sz w:val="19"/>
+              </w:rPr>
+              <w:t>9.0 / 10</w:t>
+            </w:r>
+          </w:p>
+        </w:tc>
+        <w:tc>
+          <w:tcPr>
+            <w:tcW w:type="dxa" w:w="4252"/>
+            <w:shd w:val="clear" w:color="auto" w:fill="FFFFFF"/>
+          </w:tcPr>
+          <w:p>
+            <w:r>
+              <w:rPr>
+                <w:color w:val="1E8B4C"/>
+                <w:sz w:val="18"/>
+              </w:rPr>
+              <w:t>↑ from 8.0</w:t>
+            </w:r>
+          </w:p>
+        </w:tc>
+      </w:tr>
+      <w:tr>
+        <w:tc>
+          <w:tcPr>
+            <w:tcW w:type="dxa" w:w="3969"/>
+            <w:shd w:val="clear" w:color="auto" w:fill="FFFFFF"/>
+          </w:tcPr>
+          <w:p>
+            <w:r>
+              <w:rPr>
+                <w:sz w:val="19"/>
+              </w:rPr>
+              <w:t>Automated verification</w:t>
+            </w:r>
+          </w:p>
+        </w:tc>
+        <w:tc>
+          <w:tcPr>
+            <w:tcW w:type="dxa" w:w="1701"/>
+            <w:shd w:val="clear" w:color="auto" w:fill="FFFFFF"/>
+          </w:tcPr>
+          <w:p>
+            <w:pPr>
+              <w:jc w:val="center"/>
+            </w:pPr>
+            <w:r>
+              <w:rPr>
+                <w:b/>
+                <w:color w:val="1E8B4C"/>
+                <w:sz w:val="19"/>
+              </w:rPr>
+              <w:t>8.5 / 10</w:t>
+            </w:r>
+          </w:p>
+        </w:tc>
+        <w:tc>
+          <w:tcPr>
+            <w:tcW w:type="dxa" w:w="4252"/>
+            <w:shd w:val="clear" w:color="auto" w:fill="FFFFFF"/>
+          </w:tcPr>
+          <w:p>
+            <w:r>
+              <w:rPr>
+                <w:color w:val="1E8B4C"/>
+                <w:sz w:val="18"/>
+              </w:rPr>
+              <w:t>↑ from 3.0</w:t>
+            </w:r>
+          </w:p>
+        </w:tc>
+      </w:tr>
+      <w:tr>
+        <w:tc>
+          <w:tcPr>
+            <w:tcW w:type="dxa" w:w="3969"/>
+            <w:shd w:val="clear" w:color="auto" w:fill="F2F2F2"/>
+          </w:tcPr>
+          <w:p>
+            <w:r>
+              <w:rPr>
+                <w:sz w:val="19"/>
+              </w:rPr>
+              <w:t>Test/regression automation</w:t>
+            </w:r>
+          </w:p>
+        </w:tc>
+        <w:tc>
+          <w:tcPr>
+            <w:tcW w:type="dxa" w:w="1701"/>
+            <w:shd w:val="clear" w:color="auto" w:fill="FFFFFF"/>
+          </w:tcPr>
+          <w:p>
+            <w:pPr>
+              <w:jc w:val="center"/>
+            </w:pPr>
+            <w:r>
+              <w:rPr>
+                <w:b/>
+                <w:color w:val="1E8B4C"/>
+                <w:sz w:val="19"/>
+              </w:rPr>
+              <w:t>8.5 / 10</w:t>
+            </w:r>
+          </w:p>
+        </w:tc>
+        <w:tc>
+          <w:tcPr>
+            <w:tcW w:type="dxa" w:w="4252"/>
+            <w:shd w:val="clear" w:color="auto" w:fill="FFFFFF"/>
+          </w:tcPr>
+          <w:p>
+            <w:r>
+              <w:rPr>
+                <w:color w:val="1E8B4C"/>
+                <w:sz w:val="18"/>
+              </w:rPr>
+              <w:t>↑ from 2.5</w:t>
+            </w:r>
+          </w:p>
+        </w:tc>
+      </w:tr>
+      <w:tr>
+        <w:tc>
+          <w:tcPr>
+            <w:tcW w:type="dxa" w:w="3969"/>
+            <w:shd w:val="clear" w:color="auto" w:fill="FFFFFF"/>
+          </w:tcPr>
+          <w:p>
+            <w:r>
+              <w:rPr>
+                <w:sz w:val="19"/>
+              </w:rPr>
+              <w:t>Operational release readiness</w:t>
+            </w:r>
+          </w:p>
+        </w:tc>
+        <w:tc>
+          <w:tcPr>
+            <w:tcW w:type="dxa" w:w="1701"/>
+            <w:shd w:val="clear" w:color="auto" w:fill="FFFFFF"/>
+          </w:tcPr>
+          <w:p>
+            <w:pPr>
+              <w:jc w:val="center"/>
+            </w:pPr>
+            <w:r>
+              <w:rPr>
+                <w:b/>
+                <w:color w:val="1E8B4C"/>
+                <w:sz w:val="19"/>
+              </w:rPr>
+              <w:t>8.5 / 10</w:t>
+            </w:r>
+          </w:p>
+        </w:tc>
+        <w:tc>
+          <w:tcPr>
+            <w:tcW w:type="dxa" w:w="4252"/>
+            <w:shd w:val="clear" w:color="auto" w:fill="FFFFFF"/>
+          </w:tcPr>
+          <w:p>
+            <w:r>
+              <w:rPr>
+                <w:color w:val="1E8B4C"/>
+                <w:sz w:val="18"/>
+              </w:rPr>
+              <w:t>↑ from 4.0</w:t>
+            </w:r>
+          </w:p>
+        </w:tc>
+      </w:tr>
+    </w:tbl>
+    <w:p/>
+    <w:tbl>
+      <w:tblPr>
+        <w:tblStyle w:val="TableGrid"/>
+        <w:tblW w:type="auto" w:w="0"/>
+        <w:tblLook w:firstColumn="1" w:firstRow="1" w:lastColumn="0" w:lastRow="0" w:noHBand="0" w:noVBand="1" w:val="04A0"/>
+      </w:tblPr>
+      <w:tblGrid>
+        <w:gridCol w:w="4703"/>
+        <w:gridCol w:w="4703"/>
+      </w:tblGrid>
+      <w:tr>
+        <w:tc>
+          <w:tcPr>
+            <w:tcW w:type="dxa" w:w="5102"/>
+            <w:shd w:val="clear" w:color="auto" w:fill="1F3564"/>
+          </w:tcPr>
+          <w:p>
+            <w:r>
+              <w:rPr>
+                <w:b/>
+                <w:color w:val="FFFFFF"/>
+                <w:sz w:val="20"/>
+              </w:rPr>
+              <w:t>Skill design quality</w:t>
+            </w:r>
+          </w:p>
+        </w:tc>
+        <w:tc>
+          <w:tcPr>
+            <w:tcW w:type="dxa" w:w="4819"/>
+            <w:shd w:val="clear" w:color="auto" w:fill="F2F2F2"/>
+          </w:tcPr>
+          <w:p>
+            <w:r>
+              <w:rPr>
+                <w:b/>
+                <w:color w:val="1E8B4C"/>
+                <w:sz w:val="22"/>
+              </w:rPr>
+              <w:t>9.3 / 10</w:t>
+            </w:r>
+          </w:p>
+        </w:tc>
+      </w:tr>
+      <w:tr>
+        <w:tc>
+          <w:tcPr>
+            <w:tcW w:type="dxa" w:w="5102"/>
+            <w:shd w:val="clear" w:color="auto" w:fill="1F3564"/>
+          </w:tcPr>
+          <w:p>
+            <w:r>
+              <w:rPr>
+                <w:b/>
+                <w:color w:val="FFFFFF"/>
+                <w:sz w:val="20"/>
+              </w:rPr>
+              <w:t>Enterprise operational readiness</w:t>
+            </w:r>
+          </w:p>
+        </w:tc>
+        <w:tc>
+          <w:tcPr>
+            <w:tcW w:type="dxa" w:w="4819"/>
+            <w:shd w:val="clear" w:color="auto" w:fill="F2F2F2"/>
+          </w:tcPr>
+          <w:p>
+            <w:r>
+              <w:rPr>
+                <w:b/>
+                <w:color w:val="1E8B4C"/>
+                <w:sz w:val="22"/>
+              </w:rPr>
+              <w:t>8.7 / 10</w:t>
+            </w:r>
+          </w:p>
+        </w:tc>
+      </w:tr>
+      <w:tr>
+        <w:tc>
+          <w:tcPr>
+            <w:tcW w:type="dxa" w:w="5102"/>
+            <w:shd w:val="clear" w:color="auto" w:fill="1F3564"/>
+          </w:tcPr>
+          <w:p>
+            <w:r>
+              <w:rPr>
+                <w:b/>
+                <w:color w:val="FFFFFF"/>
+                <w:sz w:val="20"/>
+              </w:rPr>
+              <w:t>Overall maturity</w:t>
+            </w:r>
+          </w:p>
+        </w:tc>
+        <w:tc>
+          <w:tcPr>
+            <w:tcW w:type="dxa" w:w="4819"/>
+            <w:shd w:val="clear" w:color="auto" w:fill="F2F2F2"/>
+          </w:tcPr>
+          <w:p>
+            <w:r>
+              <w:rPr>
+                <w:b/>
+                <w:color w:val="1E8B4C"/>
+                <w:sz w:val="22"/>
+              </w:rPr>
+              <w:t>9.0 / 10</w:t>
+            </w:r>
+          </w:p>
+        </w:tc>
+      </w:tr>
+    </w:tbl>
+    <w:p/>
+    <w:p>
+      <w:pPr>
+        <w:spacing w:after="80" w:before="40"/>
+      </w:pPr>
+      <w:r>
+        <w:rPr>
+          <w:b w:val="0"/>
+          <w:i/>
+          <w:color w:val="2763AB"/>
+          <w:sz w:val="21"/>
+        </w:rPr>
+        <w:t>The Architecture Skill is now a fully specified and operationally governed enterprise skill. All five phases are complete. The CI pipeline, release gate, execution metadata, and metrics infrastructure are in place. The skill is enterprise-governed-specification and may be promoted to enterprise-operational once production runs are executed and verified.</w:t>
+      </w:r>
+    </w:p>
     <w:p/>
     <w:p>
       <w:pPr>
@@ -12282,837 +15126,7 @@
           <w:color w:val="888888"/>
           <w:sz w:val="17"/>
         </w:rPr>
-        <w:t>Architecture Skill v1.2.0  |  Phase 1 &amp; 2 Complete  |  Approved: Sushma S — 2026-09-02  |  github.com/Sushma-celestail/SKILL  tag: v1.2.0</w:t>
-      </w:r>
-    </w:p>
-    <w:p>
-      <w:r>
-        <w:br w:type="page"/>
-      </w:r>
-    </w:p>
-    <w:p>
-      <w:pPr>
-        <w:pStyle w:val="Heading1"/>
-        <w:spacing w:before="280" w:after="120"/>
-      </w:pPr>
-      <w:r>
-        <w:rPr>
-          <w:b/>
-          <w:color w:val="1A5E8A"/>
-          <w:sz w:val="32"/>
-        </w:rPr>
-        <w:t>Phase 3 — Deterministic Tier Routing</w:t>
-      </w:r>
-    </w:p>
-    <w:p>
-      <w:pPr>
-        <w:spacing w:after="120"/>
-      </w:pPr>
-      <w:r>
-        <w:rPr>
-          <w:b/>
-        </w:rPr>
-        <w:t>Status:</w:t>
-      </w:r>
-      <w:r>
-        <w:t xml:space="preserve"> Implemented and verified in skill version v1.3.0.</w:t>
-      </w:r>
-    </w:p>
-    <w:p>
-      <w:pPr>
-        <w:spacing w:after="120"/>
-      </w:pPr>
-      <w:r>
-        <w:t>Phase 3 turns the existing Tier 1 / Tier 2 / Tier 3 guidance into a repeatable decision with recorded evidence. The routing tool selects an initial tier from the Phase 2 requirement index and PRD-grounded signals. A different final tier is permitted only through a validated, evidence-backed override.</w:t>
-      </w:r>
-    </w:p>
-    <w:p>
-      <w:pPr>
-        <w:pStyle w:val="Heading2"/>
-        <w:spacing w:before="180" w:after="120"/>
-      </w:pPr>
-      <w:r>
-        <w:rPr>
-          <w:b/>
-          <w:color w:val="0B2545"/>
-          <w:sz w:val="26"/>
-        </w:rPr>
-        <w:t>What Was Implemented</w:t>
-      </w:r>
-    </w:p>
-    <w:tbl>
-      <w:tblPr>
-        <w:tblStyle w:val="TableGrid"/>
-        <w:tblW w:type="auto" w:w="0"/>
-        <w:tblLayout w:type="fixed"/>
-        <w:tblLook w:firstColumn="1" w:firstRow="1" w:lastColumn="0" w:lastRow="0" w:noHBand="0" w:noVBand="1" w:val="04A0"/>
-      </w:tblPr>
-      <w:tblGrid>
-        <w:gridCol w:w="3135"/>
-        <w:gridCol w:w="3135"/>
-        <w:gridCol w:w="3135"/>
-      </w:tblGrid>
-      <w:tr>
-        <w:trPr>
-          <w:tblHeader w:val="true"/>
-        </w:trPr>
-        <w:tc>
-          <w:tcPr>
-            <w:tcW w:type="dxa" w:w="2381"/>
-            <w:vAlign w:val="center"/>
-            <w:shd w:fill="0B2545"/>
-          </w:tcPr>
-          <w:p>
-            <w:r>
-              <w:rPr>
-                <w:b/>
-                <w:color w:val="FFFFFF"/>
-                <w:sz w:val="18"/>
-              </w:rPr>
-              <w:t>Deliverable</w:t>
-            </w:r>
-          </w:p>
-        </w:tc>
-        <w:tc>
-          <w:tcPr>
-            <w:tcW w:type="dxa" w:w="4535"/>
-            <w:vAlign w:val="center"/>
-            <w:shd w:fill="0B2545"/>
-          </w:tcPr>
-          <w:p>
-            <w:r>
-              <w:rPr>
-                <w:b/>
-                <w:color w:val="FFFFFF"/>
-                <w:sz w:val="18"/>
-              </w:rPr>
-              <w:t>Purpose</w:t>
-            </w:r>
-          </w:p>
-        </w:tc>
-        <w:tc>
-          <w:tcPr>
-            <w:tcW w:type="dxa" w:w="3005"/>
-            <w:vAlign w:val="center"/>
-            <w:shd w:fill="0B2545"/>
-          </w:tcPr>
-          <w:p>
-            <w:r>
-              <w:rPr>
-                <w:b/>
-                <w:color w:val="FFFFFF"/>
-                <w:sz w:val="18"/>
-              </w:rPr>
-              <w:t>Evidence</w:t>
-            </w:r>
-          </w:p>
-        </w:tc>
-      </w:tr>
-      <w:tr>
-        <w:tc>
-          <w:tcPr>
-            <w:tcW w:type="dxa" w:w="2381"/>
-            <w:vAlign w:val="top"/>
-            <w:shd w:fill="F2F4F7"/>
-          </w:tcPr>
-          <w:p>
-            <w:r>
-              <w:rPr>
-                <w:sz w:val="18"/>
-              </w:rPr>
-              <w:t>phase3/tier-routing.js</w:t>
-            </w:r>
-          </w:p>
-        </w:tc>
-        <w:tc>
-          <w:tcPr>
-            <w:tcW w:type="dxa" w:w="4535"/>
-            <w:vAlign w:val="top"/>
-            <w:shd w:fill="F2F4F7"/>
-          </w:tcPr>
-          <w:p>
-            <w:r>
-              <w:rPr>
-                <w:sz w:val="18"/>
-              </w:rPr>
-              <w:t>Selects Tier 1, 2, or 3 from requirement volume, modules, migration, integrations, access, lifecycle, reporting, and deployment signals.</w:t>
-            </w:r>
-          </w:p>
-        </w:tc>
-        <w:tc>
-          <w:tcPr>
-            <w:tcW w:type="dxa" w:w="3005"/>
-            <w:vAlign w:val="top"/>
-            <w:shd w:fill="F2F4F7"/>
-          </w:tcPr>
-          <w:p>
-            <w:r>
-              <w:rPr>
-                <w:sz w:val="18"/>
-              </w:rPr>
-              <w:t>Creates a machine-readable tier-routing record.</w:t>
-            </w:r>
-          </w:p>
-        </w:tc>
-      </w:tr>
-      <w:tr>
-        <w:tc>
-          <w:tcPr>
-            <w:tcW w:type="dxa" w:w="2381"/>
-            <w:vAlign w:val="top"/>
-          </w:tcPr>
-          <w:p>
-            <w:r>
-              <w:rPr>
-                <w:sz w:val="18"/>
-              </w:rPr>
-              <w:t>Validated override record</w:t>
-            </w:r>
-          </w:p>
-        </w:tc>
-        <w:tc>
-          <w:tcPr>
-            <w:tcW w:type="dxa" w:w="4535"/>
-            <w:vAlign w:val="top"/>
-          </w:tcPr>
-          <w:p>
-            <w:r>
-              <w:rPr>
-                <w:sz w:val="18"/>
-              </w:rPr>
-              <w:t>Allows expert judgment only when the selected tier differs from the initial tier for a material architectural reason.</w:t>
-            </w:r>
-          </w:p>
-        </w:tc>
-        <w:tc>
-          <w:tcPr>
-            <w:tcW w:type="dxa" w:w="3005"/>
-            <w:vAlign w:val="top"/>
-          </w:tcPr>
-          <w:p>
-            <w:r>
-              <w:rPr>
-                <w:sz w:val="18"/>
-              </w:rPr>
-              <w:t>Requires reason, PRD evidence, and an approver where required.</w:t>
-            </w:r>
-          </w:p>
-        </w:tc>
-      </w:tr>
-      <w:tr>
-        <w:tc>
-          <w:tcPr>
-            <w:tcW w:type="dxa" w:w="2381"/>
-            <w:vAlign w:val="top"/>
-            <w:shd w:fill="F2F4F7"/>
-          </w:tcPr>
-          <w:p>
-            <w:r>
-              <w:rPr>
-                <w:sz w:val="18"/>
-              </w:rPr>
-              <w:t>7 routing fixtures</w:t>
-            </w:r>
-          </w:p>
-        </w:tc>
-        <w:tc>
-          <w:tcPr>
-            <w:tcW w:type="dxa" w:w="4535"/>
-            <w:vAlign w:val="top"/>
-            <w:shd w:fill="F2F4F7"/>
-          </w:tcPr>
-          <w:p>
-            <w:r>
-              <w:rPr>
-                <w:sz w:val="18"/>
-              </w:rPr>
-              <w:t>Covers small module, standard application, material-module boundary, requirement volume, migration/integrations, access/lifecycle, and override cases.</w:t>
-            </w:r>
-          </w:p>
-        </w:tc>
-        <w:tc>
-          <w:tcPr>
-            <w:tcW w:type="dxa" w:w="3005"/>
-            <w:vAlign w:val="top"/>
-            <w:shd w:fill="F2F4F7"/>
-          </w:tcPr>
-          <w:p>
-            <w:r>
-              <w:rPr>
-                <w:sz w:val="18"/>
-              </w:rPr>
-              <w:t>7 of 7 fixtures passed.</w:t>
-            </w:r>
-          </w:p>
-        </w:tc>
-      </w:tr>
-      <w:tr>
-        <w:tc>
-          <w:tcPr>
-            <w:tcW w:type="dxa" w:w="2381"/>
-            <w:vAlign w:val="top"/>
-          </w:tcPr>
-          <w:p>
-            <w:r>
-              <w:rPr>
-                <w:sz w:val="18"/>
-              </w:rPr>
-              <w:t>Routing test runner</w:t>
-            </w:r>
-          </w:p>
-        </w:tc>
-        <w:tc>
-          <w:tcPr>
-            <w:tcW w:type="dxa" w:w="4535"/>
-            <w:vAlign w:val="top"/>
-          </w:tcPr>
-          <w:p>
-            <w:r>
-              <w:rPr>
-                <w:sz w:val="18"/>
-              </w:rPr>
-              <w:t>Runs fixtures and writes Markdown/JSON evidence reports.</w:t>
-            </w:r>
-          </w:p>
-        </w:tc>
-        <w:tc>
-          <w:tcPr>
-            <w:tcW w:type="dxa" w:w="3005"/>
-            <w:vAlign w:val="top"/>
-          </w:tcPr>
-          <w:p>
-            <w:r>
-              <w:rPr>
-                <w:sz w:val="18"/>
-              </w:rPr>
-              <w:t>tier-routing-test-report-2026-09-02.md</w:t>
-            </w:r>
-          </w:p>
-        </w:tc>
-      </w:tr>
-      <w:tr>
-        <w:tc>
-          <w:tcPr>
-            <w:tcW w:type="dxa" w:w="2381"/>
-            <w:vAlign w:val="top"/>
-            <w:shd w:fill="F2F4F7"/>
-          </w:tcPr>
-          <w:p>
-            <w:r>
-              <w:rPr>
-                <w:sz w:val="18"/>
-              </w:rPr>
-              <w:t>Service Desk routing record</w:t>
-            </w:r>
-          </w:p>
-        </w:tc>
-        <w:tc>
-          <w:tcPr>
-            <w:tcW w:type="dxa" w:w="4535"/>
-            <w:vAlign w:val="top"/>
-            <w:shd w:fill="F2F4F7"/>
-          </w:tcPr>
-          <w:p>
-            <w:r>
-              <w:rPr>
-                <w:sz w:val="18"/>
-              </w:rPr>
-              <w:t>Runs the real Service Desk Phase 2 index through the routing rule.</w:t>
-            </w:r>
-          </w:p>
-        </w:tc>
-        <w:tc>
-          <w:tcPr>
-            <w:tcW w:type="dxa" w:w="3005"/>
-            <w:vAlign w:val="top"/>
-            <w:shd w:fill="F2F4F7"/>
-          </w:tcPr>
-          <w:p>
-            <w:r>
-              <w:rPr>
-                <w:sz w:val="18"/>
-              </w:rPr>
-              <w:t>Initial Tier 3; selected Tier 3; no override.</w:t>
-            </w:r>
-          </w:p>
-        </w:tc>
-      </w:tr>
-    </w:tbl>
-    <w:p/>
-    <w:p>
-      <w:pPr>
-        <w:pStyle w:val="Heading2"/>
-        <w:spacing w:before="180" w:after="120"/>
-      </w:pPr>
-      <w:r>
-        <w:rPr>
-          <w:b/>
-          <w:color w:val="0B2545"/>
-          <w:sz w:val="26"/>
-        </w:rPr>
-        <w:t>Routing Workflow</w:t>
-      </w:r>
-    </w:p>
-    <w:p>
-      <w:pPr>
-        <w:pStyle w:val="ListNumber"/>
-        <w:spacing w:after="60"/>
-      </w:pPr>
-      <w:r>
-        <w:t>Use the Phase 2 source index and confirm its source hash is current.</w:t>
-      </w:r>
-    </w:p>
-    <w:p>
-      <w:pPr>
-        <w:pStyle w:val="ListNumber"/>
-        <w:spacing w:after="60"/>
-      </w:pPr>
-      <w:r>
-        <w:t>Read measurable routing signals: significant requirements, modules, integrations, migration, access, lifecycle, reporting, and deployment constraints.</w:t>
-      </w:r>
-    </w:p>
-    <w:p>
-      <w:pPr>
-        <w:pStyle w:val="ListNumber"/>
-        <w:spacing w:after="60"/>
-      </w:pPr>
-      <w:r>
-        <w:t>Apply the deterministic Tier 1 / 2 / 3 rule and record the initial tier with its reasons.</w:t>
-      </w:r>
-    </w:p>
-    <w:p>
-      <w:pPr>
-        <w:pStyle w:val="ListNumber"/>
-        <w:spacing w:after="60"/>
-      </w:pPr>
-      <w:r>
-        <w:t>Accept the initial tier, or submit an override with PRD evidence and a material reason.</w:t>
-      </w:r>
-    </w:p>
-    <w:p>
-      <w:pPr>
-        <w:pStyle w:val="ListNumber"/>
-        <w:spacing w:after="60"/>
-      </w:pPr>
-      <w:r>
-        <w:t>Save the routing record with the architecture metadata and run the routing fixtures.</w:t>
-      </w:r>
-    </w:p>
-    <w:p>
-      <w:pPr>
-        <w:pStyle w:val="Heading2"/>
-        <w:spacing w:before="180" w:after="120"/>
-      </w:pPr>
-      <w:r>
-        <w:rPr>
-          <w:b/>
-          <w:color w:val="0B2545"/>
-          <w:sz w:val="26"/>
-        </w:rPr>
-        <w:t>Live Result — Internal Service Desk PRD</w:t>
-      </w:r>
-    </w:p>
-    <w:tbl>
-      <w:tblPr>
-        <w:tblStyle w:val="TableGrid"/>
-        <w:tblW w:type="auto" w:w="0"/>
-        <w:tblLayout w:type="fixed"/>
-        <w:tblLook w:firstColumn="1" w:firstRow="1" w:lastColumn="0" w:lastRow="0" w:noHBand="0" w:noVBand="1" w:val="04A0"/>
-      </w:tblPr>
-      <w:tblGrid>
-        <w:gridCol w:w="4703"/>
-        <w:gridCol w:w="4703"/>
-      </w:tblGrid>
-      <w:tr>
-        <w:trPr>
-          <w:tblHeader w:val="true"/>
-        </w:trPr>
-        <w:tc>
-          <w:tcPr>
-            <w:tcW w:type="dxa" w:w="2835"/>
-            <w:vAlign w:val="center"/>
-            <w:shd w:fill="0B2545"/>
-          </w:tcPr>
-          <w:p>
-            <w:r>
-              <w:rPr>
-                <w:b/>
-                <w:color w:val="FFFFFF"/>
-                <w:sz w:val="18"/>
-              </w:rPr>
-              <w:t>Measure</w:t>
-            </w:r>
-          </w:p>
-        </w:tc>
-        <w:tc>
-          <w:tcPr>
-            <w:tcW w:type="dxa" w:w="7087"/>
-            <w:vAlign w:val="center"/>
-            <w:shd w:fill="0B2545"/>
-          </w:tcPr>
-          <w:p>
-            <w:r>
-              <w:rPr>
-                <w:b/>
-                <w:color w:val="FFFFFF"/>
-                <w:sz w:val="18"/>
-              </w:rPr>
-              <w:t>Verified result</w:t>
-            </w:r>
-          </w:p>
-        </w:tc>
-      </w:tr>
-      <w:tr>
-        <w:tc>
-          <w:tcPr>
-            <w:tcW w:type="dxa" w:w="2835"/>
-            <w:vAlign w:val="top"/>
-            <w:shd w:fill="F2F4F7"/>
-          </w:tcPr>
-          <w:p>
-            <w:r>
-              <w:rPr>
-                <w:sz w:val="18"/>
-              </w:rPr>
-              <w:t>Phase 2 source index</w:t>
-            </w:r>
-          </w:p>
-        </w:tc>
-        <w:tc>
-          <w:tcPr>
-            <w:tcW w:type="dxa" w:w="7087"/>
-            <w:vAlign w:val="top"/>
-            <w:shd w:fill="F2F4F7"/>
-          </w:tcPr>
-          <w:p>
-            <w:r>
-              <w:rPr>
-                <w:sz w:val="18"/>
-              </w:rPr>
-              <w:t>601 extracted requirements; 597 explicit requirement IDs.</w:t>
-            </w:r>
-          </w:p>
-        </w:tc>
-      </w:tr>
-      <w:tr>
-        <w:tc>
-          <w:tcPr>
-            <w:tcW w:type="dxa" w:w="2835"/>
-            <w:vAlign w:val="top"/>
-          </w:tcPr>
-          <w:p>
-            <w:r>
-              <w:rPr>
-                <w:sz w:val="18"/>
-              </w:rPr>
-              <w:t>Initial tier</w:t>
-            </w:r>
-          </w:p>
-        </w:tc>
-        <w:tc>
-          <w:tcPr>
-            <w:tcW w:type="dxa" w:w="7087"/>
-            <w:vAlign w:val="top"/>
-          </w:tcPr>
-          <w:p>
-            <w:r>
-              <w:rPr>
-                <w:sz w:val="18"/>
-              </w:rPr>
-              <w:t>Tier 3 — requirement-volume threshold is met.</w:t>
-            </w:r>
-          </w:p>
-        </w:tc>
-      </w:tr>
-      <w:tr>
-        <w:tc>
-          <w:tcPr>
-            <w:tcW w:type="dxa" w:w="2835"/>
-            <w:vAlign w:val="top"/>
-            <w:shd w:fill="F2F4F7"/>
-          </w:tcPr>
-          <w:p>
-            <w:r>
-              <w:rPr>
-                <w:sz w:val="18"/>
-              </w:rPr>
-              <w:t>Selected tier</w:t>
-            </w:r>
-          </w:p>
-        </w:tc>
-        <w:tc>
-          <w:tcPr>
-            <w:tcW w:type="dxa" w:w="7087"/>
-            <w:vAlign w:val="top"/>
-            <w:shd w:fill="F2F4F7"/>
-          </w:tcPr>
-          <w:p>
-            <w:r>
-              <w:rPr>
-                <w:sz w:val="18"/>
-              </w:rPr>
-              <w:t>Tier 3 — no override was required.</w:t>
-            </w:r>
-          </w:p>
-        </w:tc>
-      </w:tr>
-      <w:tr>
-        <w:tc>
-          <w:tcPr>
-            <w:tcW w:type="dxa" w:w="2835"/>
-            <w:vAlign w:val="top"/>
-          </w:tcPr>
-          <w:p>
-            <w:r>
-              <w:rPr>
-                <w:sz w:val="18"/>
-              </w:rPr>
-              <w:t>Test evidence</w:t>
-            </w:r>
-          </w:p>
-        </w:tc>
-        <w:tc>
-          <w:tcPr>
-            <w:tcW w:type="dxa" w:w="7087"/>
-            <w:vAlign w:val="top"/>
-          </w:tcPr>
-          <w:p>
-            <w:r>
-              <w:rPr>
-                <w:sz w:val="18"/>
-              </w:rPr>
-              <w:t>7 / 7 tier-routing fixtures passed.</w:t>
-            </w:r>
-          </w:p>
-        </w:tc>
-      </w:tr>
-      <w:tr>
-        <w:tc>
-          <w:tcPr>
-            <w:tcW w:type="dxa" w:w="2835"/>
-            <w:vAlign w:val="top"/>
-            <w:shd w:fill="F2F4F7"/>
-          </w:tcPr>
-          <w:p>
-            <w:r>
-              <w:rPr>
-                <w:sz w:val="18"/>
-              </w:rPr>
-              <w:t>Routing record</w:t>
-            </w:r>
-          </w:p>
-        </w:tc>
-        <w:tc>
-          <w:tcPr>
-            <w:tcW w:type="dxa" w:w="7087"/>
-            <w:vAlign w:val="top"/>
-            <w:shd w:fill="F2F4F7"/>
-          </w:tcPr>
-          <w:p>
-            <w:r>
-              <w:rPr>
-                <w:sz w:val="18"/>
-              </w:rPr>
-              <w:t>phase3/reports/service-desk-tier-selection-2026-09-02.json</w:t>
-            </w:r>
-          </w:p>
-        </w:tc>
-      </w:tr>
-    </w:tbl>
-    <w:p/>
-    <w:p>
-      <w:pPr>
-        <w:pStyle w:val="Heading2"/>
-        <w:spacing w:before="180" w:after="120"/>
-      </w:pPr>
-      <w:r>
-        <w:rPr>
-          <w:b/>
-          <w:color w:val="0B2545"/>
-          <w:sz w:val="26"/>
-        </w:rPr>
-        <w:t>Override Guardrails</w:t>
-      </w:r>
-    </w:p>
-    <w:p>
-      <w:pPr>
-        <w:spacing w:after="120"/>
-      </w:pPr>
-      <w:r>
-        <w:t>An override must select a different tier, contain a material architectural reason, and cite one or more PRD evidence references. It cannot be used merely to make an architecture document longer or more detailed.</w:t>
-      </w:r>
-    </w:p>
-    <w:p>
-      <w:pPr>
-        <w:pStyle w:val="Heading2"/>
-        <w:spacing w:before="180" w:after="120"/>
-      </w:pPr>
-      <w:r>
-        <w:rPr>
-          <w:b/>
-          <w:color w:val="0B2545"/>
-          <w:sz w:val="26"/>
-        </w:rPr>
-        <w:t>What Phase 3 Does Not Yet Do</w:t>
-      </w:r>
-    </w:p>
-    <w:tbl>
-      <w:tblPr>
-        <w:tblStyle w:val="TableGrid"/>
-        <w:tblW w:type="auto" w:w="0"/>
-        <w:tblLayout w:type="fixed"/>
-        <w:tblLook w:firstColumn="1" w:firstRow="1" w:lastColumn="0" w:lastRow="0" w:noHBand="0" w:noVBand="1" w:val="04A0"/>
-      </w:tblPr>
-      <w:tblGrid>
-        <w:gridCol w:w="4703"/>
-        <w:gridCol w:w="4703"/>
-      </w:tblGrid>
-      <w:tr>
-        <w:trPr>
-          <w:tblHeader w:val="true"/>
-        </w:trPr>
-        <w:tc>
-          <w:tcPr>
-            <w:tcW w:type="dxa" w:w="5783"/>
-            <w:vAlign w:val="center"/>
-            <w:shd w:fill="0B2545"/>
-          </w:tcPr>
-          <w:p>
-            <w:r>
-              <w:rPr>
-                <w:b/>
-                <w:color w:val="FFFFFF"/>
-                <w:sz w:val="18"/>
-              </w:rPr>
-              <w:t>Not included</w:t>
-            </w:r>
-          </w:p>
-        </w:tc>
-        <w:tc>
-          <w:tcPr>
-            <w:tcW w:type="dxa" w:w="4139"/>
-            <w:vAlign w:val="center"/>
-            <w:shd w:fill="0B2545"/>
-          </w:tcPr>
-          <w:p>
-            <w:r>
-              <w:rPr>
-                <w:b/>
-                <w:color w:val="FFFFFF"/>
-                <w:sz w:val="18"/>
-              </w:rPr>
-              <w:t>Next phase</w:t>
-            </w:r>
-          </w:p>
-        </w:tc>
-      </w:tr>
-      <w:tr>
-        <w:tc>
-          <w:tcPr>
-            <w:tcW w:type="dxa" w:w="5783"/>
-            <w:vAlign w:val="top"/>
-            <w:shd w:fill="F2F4F7"/>
-          </w:tcPr>
-          <w:p>
-            <w:r>
-              <w:rPr>
-                <w:sz w:val="18"/>
-              </w:rPr>
-              <w:t>Architecture schema validation, cross-reference validation, and full V-001 to V-010 checks.</w:t>
-            </w:r>
-          </w:p>
-        </w:tc>
-        <w:tc>
-          <w:tcPr>
-            <w:tcW w:type="dxa" w:w="4139"/>
-            <w:vAlign w:val="top"/>
-            <w:shd w:fill="F2F4F7"/>
-          </w:tcPr>
-          <w:p>
-            <w:r>
-              <w:rPr>
-                <w:sz w:val="18"/>
-              </w:rPr>
-              <w:t>Phase 4 — Verification and Regression Testing</w:t>
-            </w:r>
-          </w:p>
-        </w:tc>
-      </w:tr>
-      <w:tr>
-        <w:tc>
-          <w:tcPr>
-            <w:tcW w:type="dxa" w:w="5783"/>
-            <w:vAlign w:val="top"/>
-          </w:tcPr>
-          <w:p>
-            <w:r>
-              <w:rPr>
-                <w:sz w:val="18"/>
-              </w:rPr>
-              <w:t>T-001 to T-010 full architecture-output fixtures and CI-based regression execution.</w:t>
-            </w:r>
-          </w:p>
-        </w:tc>
-        <w:tc>
-          <w:tcPr>
-            <w:tcW w:type="dxa" w:w="4139"/>
-            <w:vAlign w:val="top"/>
-          </w:tcPr>
-          <w:p>
-            <w:r>
-              <w:rPr>
-                <w:sz w:val="18"/>
-              </w:rPr>
-              <w:t>Phase 4 — Verification and Regression Testing</w:t>
-            </w:r>
-          </w:p>
-        </w:tc>
-      </w:tr>
-      <w:tr>
-        <w:tc>
-          <w:tcPr>
-            <w:tcW w:type="dxa" w:w="5783"/>
-            <w:vAlign w:val="top"/>
-            <w:shd w:fill="F2F4F7"/>
-          </w:tcPr>
-          <w:p>
-            <w:r>
-              <w:rPr>
-                <w:sz w:val="18"/>
-              </w:rPr>
-              <w:t>CI/CD release workflow, operational monitoring, and approval automation.</w:t>
-            </w:r>
-          </w:p>
-        </w:tc>
-        <w:tc>
-          <w:tcPr>
-            <w:tcW w:type="dxa" w:w="4139"/>
-            <w:vAlign w:val="top"/>
-            <w:shd w:fill="F2F4F7"/>
-          </w:tcPr>
-          <w:p>
-            <w:r>
-              <w:rPr>
-                <w:sz w:val="18"/>
-              </w:rPr>
-              <w:t>Phase 5 — Governance and Operations</w:t>
-            </w:r>
-          </w:p>
-        </w:tc>
-      </w:tr>
-    </w:tbl>
-    <w:p/>
-    <w:p>
-      <w:pPr>
-        <w:jc w:val="center"/>
-      </w:pPr>
-      <w:r>
-        <w:rPr>
-          <w:i/>
-          <w:color w:val="555555"/>
-          <w:sz w:val="17"/>
-        </w:rPr>
-        <w:t>Architecture Skill v1.3.0  |  Phase 1, 2 &amp; 3 complete  |  Approved: Sushma S — 2026-09-02</w:t>
+        <w:t>Architecture Skill v1.5.0  |  Phases 1–5 Complete  |  Approved: Sushma S — 2026-09-03  |  github.com/Sushma-celestail/SKILL  tag: v1.5.0</w:t>
       </w:r>
     </w:p>
     <w:sectPr>

</xml_diff>